<commit_message>
docs: manuscript v3 — round-2 reviewer fixes applied
Conclusion body restored under its heading; Methods block moved before
Code availability; Data availability heading added; Figure 1 cited in
the Introduction (figures now cited in order 1-6) with its caption
relocated there; reference 15 (ChEMBL) and PDFs citation restored;
reference 2 completed (Tshitoyan et al.); DECIMER accuracy reattributed
to its classification stage; endpoint scope restricted to language
models; n=293 denominator and 282/296 machine-verification scope
disclosed; correlation claim softened; provenance wording matched
evidence; Figure 6 pooling clarified and over-interpretation removed
(heading + caption); PatCID positioning added; 'empowers'/'unlocks'/
'proprietary' purged; ESI pointers for metric definitions.
</commit_message>
<xml_diff>
--- a/paper/Manuscript5_revised.docx
+++ b/paper/Manuscript5_revised.docx
@@ -695,7 +695,7 @@
           <w:szCs w:val="24"/>
         </w:rPr>
       </w:pPr>
-      <w:del w:id="5001" w:author="王哲" w:date="2026-08-26T00:00:00Z">
+      <w:del w:id="9048" w:author="王哲" w:date="2026-08-26T00:00:00Z">
         <w:r>
           <w:rPr>
             <w:rFonts w:eastAsia="宋体" w:cs="Times New Roman"/>
@@ -714,7 +714,7 @@
         </w:r>
       </w:del>
       <w:ins w:id="1" w:author="王哲" w:date="2026-08-11T13:59:16Z" w16du:dateUtc="2026-08-11T13:59:16Z">
-        <w:del w:id="5002" w:author="王哲" w:date="2026-08-26T00:00:00Z">
+        <w:del w:id="9049" w:author="王哲" w:date="2026-08-26T00:00:00Z">
           <w:r>
             <w:rPr>
               <w:rFonts w:eastAsia="宋体" w:cs="Times New Roman"/>
@@ -724,7 +724,7 @@
           </w:r>
         </w:del>
       </w:ins>
-      <w:del w:id="5003" w:author="王哲" w:date="2026-08-26T00:00:00Z">
+      <w:del w:id="9050" w:author="王哲" w:date="2026-08-26T00:00:00Z">
         <w:r>
           <w:rPr>
             <w:rFonts w:eastAsia="宋体" w:cs="Times New Roman"/>
@@ -733,7 +733,7 @@
           <w:delText xml:space="preserve">, and PaddleOCR combined with GLM-4.6 for bioactivity extraction and unit normalization. We evaluated BioChemInsight on 181 patents covering 15 therapeutic targets. The system achieved an average extraction accuracy of </w:delText>
         </w:r>
       </w:del>
-      <w:del w:id="5004" w:author="王哲" w:date="2026-08-26T00:00:00Z">
+      <w:del w:id="9051" w:author="王哲" w:date="2026-08-26T00:00:00Z">
         <w:r>
           <w:rPr>
             <w:rFonts w:hint="eastAsia" w:eastAsia="宋体" w:cs="Times New Roman"/>
@@ -743,7 +743,7 @@
           <w:delText xml:space="preserve">above </w:delText>
         </w:r>
       </w:del>
-      <w:del w:id="5005" w:author="王哲" w:date="2026-08-26T00:00:00Z">
+      <w:del w:id="9052" w:author="王哲" w:date="2026-08-26T00:00:00Z">
         <w:r>
           <w:rPr>
             <w:rFonts w:eastAsia="宋体" w:cs="Times New Roman"/>
@@ -754,7 +754,7 @@
       </w:del>
       <w:bookmarkStart w:id="8" w:name="OLE_LINK27"/>
       <w:bookmarkStart w:id="9" w:name="OLE_LINK26"/>
-      <w:del w:id="5006" w:author="王哲" w:date="2026-08-26T00:00:00Z">
+      <w:del w:id="9053" w:author="王哲" w:date="2026-08-26T00:00:00Z">
         <w:r>
           <w:rPr>
             <w:rFonts w:eastAsia="宋体" w:cs="Times New Roman"/>
@@ -765,7 +765,7 @@
       </w:del>
       <w:bookmarkEnd w:id="8"/>
       <w:bookmarkEnd w:id="9"/>
-      <w:del w:id="5007" w:author="王哲" w:date="2026-08-26T00:00:00Z">
+      <w:del w:id="9054" w:author="王哲" w:date="2026-08-26T00:00:00Z">
         <w:r>
           <w:rPr>
             <w:rFonts w:eastAsia="宋体" w:cs="Times New Roman"/>
@@ -774,13 +774,13 @@
           <w:delText>. Consequently, by enabling systematic patent mining, BioChemInsight provides access to chemical information underrepresented in ChEMBL. This capability expands the landscape of explorable compound-target interactions, enriches the data foundation for quantitative structure-activity relationship modeling and targeted screening, and reduces data preprocessing time from weeks to hours. BioChemInsight is available at https://github.com/dahuilangda/BioChemInsight.</w:delText>
         </w:r>
       </w:del>
-      <w:ins w:id="5008" w:author="王哲" w:date="2026-08-26T00:00:00Z">
-        <w:r>
-          <w:rPr>
-            <w:rFonts w:eastAsia="宋体" w:cs="Times New Roman"/>
-            <w:szCs w:val="24"/>
-          </w:rPr>
-          <w:t xml:space="preserve">The automated extraction of chemical structures and their corresponding bioactivity data is essential for accelerating drug discovery and enabling data-driven research. Current optical chemical structure recognition (OCSR) tools lack the capability to autonomously link molecular structures with their bioactivity profiles, posing a significant bottleneck in structure–activity relationship (SAR) analysis. To address this, we present BioChemInsight, an open-source pipeline that couples DECIMER Segmentation with a mixture-of-experts extension of MolNexTR for structure decoding, a vision–language model for compound-identifier association, and PaddleOCR combined with a large language model for bioactivity extraction and unit normalization, all served through model-agnostic, OpenAI-compatible endpoints. We evaluated BioChemInsight on 296 patents spanning 15 therapeutic targets, yielding 23,218 structure records and 7,110 bioactivity values. Of 507 compound-level extractions presented for expert human adjudication against the original patent segments, 505 were adjudicated and 98.8% of these sampled decodings were confirmed correct (6 errors, 1.2%), with errors concentrated in the lowest-quality tier (0% in the highest-quality tier); 87.3% of all 23,218 extracted structure records yielded valid SMILES. Our analysis further indicates that the chemical space covered by patents is largely complementary to that of the established public database ChEMBL. By enabling systematic patent mining, BioChemInsight expands the landscape of explorable compound–target interactions and enriches the data foundation for quantitative SAR modelling and targeted screening. BioChemInsight is available at https://github.com/dahuilangda/BioChemInsight.</w:t>
+      <w:ins w:id="9055" w:author="王哲" w:date="2026-08-26T00:00:00Z">
+        <w:r>
+          <w:rPr>
+            <w:rFonts w:eastAsia="宋体" w:cs="Times New Roman"/>
+            <w:szCs w:val="24"/>
+          </w:rPr>
+          <w:t xml:space="preserve">The automated extraction of chemical structures and their corresponding bioactivity data is essential for accelerating drug discovery and enabling data-driven research. Current optical chemical structure recognition (OCSR) tools lack the capability to autonomously link molecular structures with their bioactivity profiles, posing a significant bottleneck in structure–activity relationship (SAR) analysis. To address this, we present BioChemInsight, an open-source pipeline that couples DECIMER Segmentation with a mixture-of-experts extension of MolNexTR for structure decoding, a vision–language model for compound-identifier association, and PaddleOCR combined with a large language model for bioactivity extraction and unit normalization, with the language-model stages served through model-agnostic, OpenAI-compatible endpoints. We evaluated BioChemInsight on 296 patents spanning 15 therapeutic targets, yielding 23,218 structure records and 7,110 bioactivity values. Of 507 compound-level extractions presented for expert human adjudication against the original patent segments, 505 were adjudicated and 98.8% of these sampled decodings were confirmed correct (6 errors, 1.2%), with errors concentrated in the lowest-quality tier (0% in the highest-quality tier); 87.3% of all 23,218 extracted structure records yielded valid SMILES. Our analysis further indicates that the chemical space covered by patents is largely complementary to that of the established public database ChEMBL. By enabling systematic patent mining, BioChemInsight expands the landscape of explorable compound–target interactions and enriches the data foundation for quantitative SAR modelling and targeted screening. BioChemInsight is available at https://github.com/dahuilangda/BioChemInsight.</w:t>
         </w:r>
       </w:ins>
     </w:p>
@@ -1164,350 +1164,451 @@
           <w:szCs w:val="24"/>
         </w:rPr>
       </w:pPr>
-      <w:r>
-        <w:rPr>
-          <w:rFonts w:eastAsia="宋体" w:cs="Times New Roman"/>
-          <w:szCs w:val="24"/>
-        </w:rPr>
-        <w:t>Deep learning has addressed these limitations through specialized solutions: DECIMER.ai overcomes publication variability with its proprietary segmentation-classification pipeline</w:t>
-      </w:r>
-      <w:r>
-        <w:rPr>
-          <w:rFonts w:eastAsia="宋体" w:cs="Times New Roman"/>
-          <w:szCs w:val="24"/>
-        </w:rPr>
-        <w:fldChar w:fldCharType="begin"/>
-      </w:r>
-      <w:r>
-        <w:rPr>
-          <w:rFonts w:eastAsia="宋体" w:cs="Times New Roman"/>
-          <w:szCs w:val="24"/>
-        </w:rPr>
-        <w:instrText xml:space="preserve"> ADDIN ZOTERO_ITEM CSL_CITATION {"citationID":"a2hgglsi13t","properties":{"formattedCitation":"\\super 3\\nosupersub{}","plainCitation":"3","noteIndex":0},"citationItems":[{"id":38738,"uris":["http://zotero.org/users/10054398/items/ULBARJ3C"],"itemData":{"id":38738,"type":"article-journal","abstract":"The number of publications describing chemical structures has increased steadily over the last decades. However, the majority of published chemical information is currently not available in machine-readable form in public databases. It remains a challenge to automate the process of information extraction in a way that requires less manual intervention - especially the mining of chemical structure depictions. As an open-source platform that leverages recent advancements in deep learning, computer vision, and natural language processing, DECIMER.ai (Deep lEarning for Chemical IMagE Recognition) strives to automatically segment, classify, and translate chemical structure depictions from the printed literature. The segmentation and classification tools are the only openly available packages of their kind, and the optical chemical structure recognition (OCSR) core application yields outstanding performance on all benchmark datasets. The source code, the trained models and the datasets developed in this work have been published under permissive licences. An instance of the DECIMER web application is available at https://decimer.ai.","container-title":"Nature Communications","DOI":"10.1038/s41467-023-40782-0","ISSN":"2041-1723","issue":"1","journalAbbreviation":"Nat Commun","language":"en","license":"2023 The Author(s)","page":"5045","publisher":"Nature Publishing Group","source":"www.nature.com","title":"DECIMER.ai: an open platform for automated optical chemical structure identification, segmentation and recognition in scientific publications","title-short":"DECIMER.ai","volume":"14","author":[{"family":"Rajan","given":"Kohulan"},{"family":"Brinkhaus","given":"Henning Otto"},{"family":"Agea","given":"M. Isabel"},{"family":"Zielesny","given":"Achim"},{"family":"Steinbeck","given":"Christoph"}],"issued":{"date-parts":[["2023",8,19]]}}}],"schema":"https://github.com/citation-style-language/schema/raw/master/csl-citation.json"} </w:instrText>
-      </w:r>
-      <w:r>
-        <w:rPr>
-          <w:rFonts w:eastAsia="宋体" w:cs="Times New Roman"/>
-          <w:szCs w:val="24"/>
-        </w:rPr>
-        <w:fldChar w:fldCharType="separate"/>
-      </w:r>
-      <w:r>
-        <w:rPr>
-          <w:rFonts w:cs="Times New Roman"/>
-          <w:kern w:val="0"/>
-          <w:szCs w:val="24"/>
-          <w:vertAlign w:val="superscript"/>
-        </w:rPr>
-        <w:t>3</w:t>
-      </w:r>
-      <w:r>
-        <w:rPr>
-          <w:rFonts w:eastAsia="宋体" w:cs="Times New Roman"/>
-          <w:szCs w:val="24"/>
-        </w:rPr>
-        <w:fldChar w:fldCharType="end"/>
-      </w:r>
-      <w:r>
-        <w:rPr>
-          <w:rFonts w:eastAsia="宋体" w:cs="Times New Roman"/>
-          <w:szCs w:val="24"/>
-        </w:rPr>
-        <w:t>, while ChemReco solves hand-drawn diagram recognition with 96.9% accuracy via EfficientNet-Transformer hybridization</w:t>
-      </w:r>
-      <w:r>
-        <w:rPr>
-          <w:rFonts w:eastAsia="宋体" w:cs="Times New Roman"/>
-          <w:szCs w:val="24"/>
-        </w:rPr>
-        <w:fldChar w:fldCharType="begin"/>
-      </w:r>
-      <w:r>
-        <w:rPr>
-          <w:rFonts w:eastAsia="宋体" w:cs="Times New Roman"/>
-          <w:szCs w:val="24"/>
-        </w:rPr>
-        <w:instrText xml:space="preserve"> ADDIN ZOTERO_ITEM CSL_CITATION {"citationID":"a14k9vfuhrg","properties":{"formattedCitation":"\\super 8\\nosupersub{}","plainCitation":"8","noteIndex":0},"citationItems":[{"id":38853,"uris":["http://zotero.org/users/10054398/items/69A6R8R9"],"itemData":{"id":38853,"type":"article-journal","abstract":"Chemical molecular structures are a direct and convenient means of expressing chemical knowledge, playing a vital role in academic communication. In chemistry, hand drawing is a common task for students and researchers. If we can convert hand-drawn chemical molecular structures into machine-readable formats, like SMILES encoding, computers can efficiently process and analyze these structures, significantly enhancing the efficiency of chemical research. Furthermore, with the progress of educational technology, automated grading is gaining popularity. When machines automatically recognize chemical molecular structures and assess the correctness of the drawings, it offers great convenience to teachers. We created ChemReco, a tool designed to identify chemical molecular structures involving three atoms: C, H, and O, providing convenience for chemical researchers. Currently, there are limited studies on hand-drawn chemical molecular structures. Therefore, the primary focus of this paper is constructing datasets. We propose a synthetic image method to rapidly generate images resembling hand-drawn chemical molecular structures, enhancing dataset acquisition efficiency. Regarding model selection, the hand-drawn chemical molecule structural recognition model developed in this article achieves a final recognition accuracy of 96.90%. This model employs the encoder-decoder architecture of EfficientNet + Transformer, demonstrating superior performance compared to other encoder-decoder combinations.","container-title":"Scientific Reports","DOI":"10.1038/s41598-024-67496-7","ISSN":"2045-2322","issue":"1","journalAbbreviation":"Sci Rep","language":"eng","page":"17126","PMID":"39054356","PMCID":"PMC11272916","source":"PubMed","title":"ChemReco: automated recognition of hand-drawn carbon-hydrogen-oxygen structures using deep learning","title-short":"ChemReco","volume":"14","author":[{"family":"Ouyang","given":"Hengjie"},{"family":"Liu","given":"Wei"},{"family":"Tao","given":"Jiajun"},{"family":"Luo","given":"Yanghong"},{"family":"Zhang","given":"Wanjia"},{"family":"Zhou","given":"Jiayu"},{"family":"Geng","given":"Shuqi"},{"family":"Zhang","given":"Chengpeng"}],"issued":{"date-parts":[["2024",7,25]]}}}],"schema":"https://github.com/citation-style-language/schema/raw/master/csl-citation.json"} </w:instrText>
-      </w:r>
-      <w:r>
-        <w:rPr>
-          <w:rFonts w:eastAsia="宋体" w:cs="Times New Roman"/>
-          <w:szCs w:val="24"/>
-        </w:rPr>
-        <w:fldChar w:fldCharType="separate"/>
-      </w:r>
-      <w:r>
-        <w:rPr>
-          <w:rFonts w:eastAsia="宋体" w:cs="Times New Roman"/>
-          <w:kern w:val="0"/>
-          <w:szCs w:val="24"/>
-          <w:vertAlign w:val="superscript"/>
-        </w:rPr>
-        <w:t>8</w:t>
-      </w:r>
-      <w:r>
-        <w:rPr>
-          <w:rFonts w:eastAsia="宋体" w:cs="Times New Roman"/>
-          <w:szCs w:val="24"/>
-        </w:rPr>
-        <w:fldChar w:fldCharType="end"/>
-      </w:r>
-      <w:r>
-        <w:rPr>
-          <w:rFonts w:eastAsia="宋体" w:cs="Times New Roman"/>
-          <w:szCs w:val="24"/>
-        </w:rPr>
-        <w:t>. MolScribe tackles stereochemical complexity through geometric analysis</w:t>
-      </w:r>
-      <w:r>
-        <w:rPr>
-          <w:rFonts w:eastAsia="宋体" w:cs="Times New Roman"/>
-          <w:szCs w:val="24"/>
-        </w:rPr>
-        <w:fldChar w:fldCharType="begin"/>
-      </w:r>
-      <w:r>
-        <w:rPr>
-          <w:rFonts w:eastAsia="宋体" w:cs="Times New Roman"/>
-          <w:szCs w:val="24"/>
-        </w:rPr>
-        <w:instrText xml:space="preserve"> ADDIN ZOTERO_ITEM CSL_CITATION {"citationID":"a1kopbhtt7r","properties":{"formattedCitation":"\\super 9\\nosupersub{}","plainCitation":"9","noteIndex":0},"citationItems":[{"id":33630,"uris":["http://zotero.org/users/10054398/items/WJLK49WB"],"itemData":{"id":33630,"type":"article-journal","abstract":"Molecular structure recognition is the task of translating a molecular image into its graph structure. Significant variation in drawing styles and conventions exhibited in chemical literature poses a significant challenge for automating this task. In this paper, we propose MolScribe, a novel image-to-graph generation model that explicitly predicts atoms and bonds, along with their geometric layouts, to construct the molecular structure. Our model flexibly incorporates symbolic chemistry constraints to recognize chirality and expand abbreviated structures. We further develop data augmentation strategies to enhance the model robustness against domain shifts. In experiments on both synthetic and realistic molecular images, MolScribe significantly outperforms previous models, achieving 76–93% accuracy on public benchmarks. Chemists can also easily verify MolScribe’s prediction, informed by its confidence estimation and atom-level alignment with the input image. MolScribe is publicly available through Python and web interfaces: https://github.com/thomas0809/MolScribe.","container-title":"Journal of Chemical Information and Modeling","DOI":"10.1021/acs.jcim.2c01480","ISSN":"1549-9596","issue":"7","journalAbbreviation":"J. Chem. Inf. Model.","page":"1925-1934","publisher":"American Chemical Society","source":"ACS Publications","title":"MolScribe: Robust Molecular Structure Recognition with Image-to-Graph Generation","title-short":"MolScribe","volume":"63","author":[{"family":"Qian","given":"Yujie"},{"family":"Guo","given":"Jiang"},{"family":"Tu","given":"Zhengkai"},{"family":"Li","given":"Zhening"},{"family":"Coley","given":"Connor W."},{"family":"Barzilay","given":"Regina"}],"issued":{"date-parts":[["2023",4,10]]}}}],"schema":"https://github.com/citation-style-language/schema/raw/master/csl-citation.json"} </w:instrText>
-      </w:r>
-      <w:r>
-        <w:rPr>
-          <w:rFonts w:eastAsia="宋体" w:cs="Times New Roman"/>
-          <w:szCs w:val="24"/>
-        </w:rPr>
-        <w:fldChar w:fldCharType="separate"/>
-      </w:r>
-      <w:r>
-        <w:rPr>
-          <w:rFonts w:eastAsia="宋体" w:cs="Times New Roman"/>
-          <w:kern w:val="0"/>
-          <w:szCs w:val="24"/>
-          <w:vertAlign w:val="superscript"/>
-        </w:rPr>
-        <w:t>9</w:t>
-      </w:r>
-      <w:r>
-        <w:rPr>
-          <w:rFonts w:eastAsia="宋体" w:cs="Times New Roman"/>
-          <w:szCs w:val="24"/>
-        </w:rPr>
-        <w:fldChar w:fldCharType="end"/>
-      </w:r>
-      <w:r>
-        <w:rPr>
-          <w:rFonts w:eastAsia="宋体" w:cs="Times New Roman"/>
-          <w:szCs w:val="24"/>
-        </w:rPr>
-        <w:t>, and MolMiner's integrated framework (MobileNetv2/YOLOv5/EasyOCR) delivers benchmark-leading performance with batch PDF processing - directly addressing literature backlogs</w:t>
-      </w:r>
-      <w:r>
-        <w:rPr>
-          <w:rFonts w:eastAsia="宋体" w:cs="Times New Roman"/>
-          <w:szCs w:val="24"/>
-        </w:rPr>
-        <w:fldChar w:fldCharType="begin"/>
-      </w:r>
-      <w:r>
-        <w:rPr>
-          <w:rFonts w:eastAsia="宋体" w:cs="Times New Roman"/>
-          <w:szCs w:val="24"/>
-        </w:rPr>
-        <w:instrText xml:space="preserve"> ADDIN ZOTERO_ITEM CSL_CITATION {"citationID":"a181e7v1ca6","properties":{"formattedCitation":"\\super 10\\nosupersub{}","plainCitation":"10","noteIndex":0},"citationItems":[{"id":38728,"uris":["http://zotero.org/users/10054398/items/NBQIKKBD"],"itemData":{"id":38728,"type":"article-journal","abstract":"Molecular structures are commonly depicted in 2D printed forms in scientific documents such as journal papers and patents. However, these 2D depictions are not machine readable. Due to a backlog of decades and an increasing amount of printed literatures, there is a high demand for translating printed depictions into machine-readable formats, which is known as Optical Chemical Structure Recognition (OCSR). Most OCSR systems developed over the last three decades use a rule-based approach, which vectorizes the depiction based on the interpretation of vectors and nodes as bonds and atoms. Here, we present a practical software called MolMiner, which is primarily built using deep neural networks originally developed for semantic segmentation and object detection to recognize atom and bond elements from documents. These recognized elements can be easily connected as a molecular graph with a distance-based construction algorithm. MolMiner gave state-of-the-art performance on four benchmark data sets and a self-collected external data set from scientific papers. As MolMiner performed similarly well in real-world OCSR tasks with a user-friendly interface, it is a useful and valuable tool for daily applications. The free download links of Mac and Windows versions are available at https://github.com/iipharma/pharmamind-molminer.","container-title":"Journal of Chemical Information and Modeling","DOI":"10.1021/acs.jcim.2c00733","ISSN":"1549-960X","issue":"22","journalAbbreviation":"J Chem Inf Model","language":"eng","page":"5321-5328","PMID":"36108142","PMCID":"PMC9710516","source":"PubMed","title":"MolMiner: You Only Look Once for Chemical Structure Recognition","title-short":"MolMiner","volume":"62","author":[{"family":"Xu","given":"Youjun"},{"family":"Xiao","given":"Jinchuan"},{"family":"Chou","given":"Chia-Han"},{"family":"Zhang","given":"Jianhang"},{"family":"Zhu","given":"Jintao"},{"family":"Hu","given":"Qiwan"},{"family":"Li","given":"Hemin"},{"family":"Han","given":"Ningsheng"},{"family":"Liu","given":"Bingyu"},{"family":"Zhang","given":"Shuaipeng"},{"family":"Han","given":"Jinyu"},{"family":"Zhang","given":"Zhen"},{"family":"Zhang","given":"Shuhao"},{"family":"Zhang","given":"Weilin"},{"family":"Lai","given":"Luhua"},{"family":"Pei","given":"Jianfeng"}],"issued":{"date-parts":[["2022",11,28]]}}}],"schema":"https://github.com/citation-style-language/schema/raw/master/csl-citation.json"} </w:instrText>
-      </w:r>
-      <w:r>
-        <w:rPr>
-          <w:rFonts w:eastAsia="宋体" w:cs="Times New Roman"/>
-          <w:szCs w:val="24"/>
-        </w:rPr>
-        <w:fldChar w:fldCharType="separate"/>
-      </w:r>
-      <w:r>
-        <w:rPr>
-          <w:rFonts w:cs="Times New Roman"/>
-          <w:kern w:val="0"/>
-          <w:szCs w:val="24"/>
-          <w:vertAlign w:val="superscript"/>
-        </w:rPr>
-        <w:t>10</w:t>
-      </w:r>
-      <w:r>
-        <w:rPr>
-          <w:rFonts w:eastAsia="宋体" w:cs="Times New Roman"/>
-          <w:szCs w:val="24"/>
-        </w:rPr>
-        <w:fldChar w:fldCharType="end"/>
-      </w:r>
-      <w:r>
-        <w:rPr>
-          <w:rFonts w:eastAsia="宋体" w:cs="Times New Roman"/>
-          <w:szCs w:val="24"/>
-        </w:rPr>
-        <w:t>.</w:t>
-      </w:r>
-      <w:r>
-        <w:t xml:space="preserve"> </w:t>
-      </w:r>
+      <w:del w:id="9001" w:author="王哲" w:date="2026-08-26T00:00:00Z">
+        <w:r>
+          <w:rPr>
+            <w:rFonts w:eastAsia="宋体" w:cs="Times New Roman"/>
+            <w:szCs w:val="24"/>
+          </w:rPr>
+          <w:delText>Deep learning has addressed these limitations through specialized solutions: DECIMER.ai overcomes publication variability with its proprietary segmentation-classification pipeline</w:delText>
+        </w:r>
+      </w:del>
+      <w:del w:id="9002" w:author="王哲" w:date="2026-08-26T00:00:00Z">
+        <w:r>
+          <w:rPr>
+            <w:rFonts w:eastAsia="宋体" w:cs="Times New Roman"/>
+            <w:szCs w:val="24"/>
+          </w:rPr>
+          <w:fldChar w:fldCharType="begin"/>
+        </w:r>
+      </w:del>
+      <w:del w:id="9003" w:author="王哲" w:date="2026-08-26T00:00:00Z">
+        <w:r>
+          <w:rPr>
+            <w:rFonts w:eastAsia="宋体" w:cs="Times New Roman"/>
+            <w:szCs w:val="24"/>
+          </w:rPr>
+          <w:instrText xml:space="preserve"> ADDIN ZOTERO_ITEM CSL_CITATION {"citationID":"a2hgglsi13t","properties":{"formattedCitation":"\\super 3\\nosupersub{}","plainCitation":"3","noteIndex":0},"citationItems":[{"id":38738,"uris":["http://zotero.org/users/10054398/items/ULBARJ3C"],"itemData":{"id":38738,"type":"article-journal","abstract":"The number of publications describing chemical structures has increased steadily over the last decades. However, the majority of published chemical information is currently not available in machine-readable form in public databases. It remains a challenge to automate the process of information extraction in a way that requires less manual intervention - especially the mining of chemical structure depictions. As an open-source platform that leverages recent advancements in deep learning, computer vision, and natural language processing, DECIMER.ai (Deep lEarning for Chemical IMagE Recognition) strives to automatically segment, classify, and translate chemical structure depictions from the printed literature. The segmentation and classification tools are the only openly available packages of their kind, and the optical chemical structure recognition (OCSR) core application yields outstanding performance on all benchmark datasets. The source code, the trained models and the datasets developed in this work have been published under permissive licences. An instance of the DECIMER web application is available at https://decimer.ai.","container-title":"Nature Communications","DOI":"10.1038/s41467-023-40782-0","ISSN":"2041-1723","issue":"1","journalAbbreviation":"Nat Commun","language":"en","license":"2023 The Author(s)","page":"5045","publisher":"Nature Publishing Group","source":"www.nature.com","title":"DECIMER.ai: an open platform for automated optical chemical structure identification, segmentation and recognition in scientific publications","title-short":"DECIMER.ai","volume":"14","author":[{"family":"Rajan","given":"Kohulan"},{"family":"Brinkhaus","given":"Henning Otto"},{"family":"Agea","given":"M. Isabel"},{"family":"Zielesny","given":"Achim"},{"family":"Steinbeck","given":"Christoph"}],"issued":{"date-parts":[["2023",8,19]]}}}],"schema":"https://github.com/citation-style-language/schema/raw/master/csl-citation.json"} </w:instrText>
+        </w:r>
+      </w:del>
+      <w:del w:id="9004" w:author="王哲" w:date="2026-08-26T00:00:00Z">
+        <w:r>
+          <w:rPr>
+            <w:rFonts w:eastAsia="宋体" w:cs="Times New Roman"/>
+            <w:szCs w:val="24"/>
+          </w:rPr>
+          <w:fldChar w:fldCharType="separate"/>
+        </w:r>
+      </w:del>
+      <w:del w:id="9005" w:author="王哲" w:date="2026-08-26T00:00:00Z">
+        <w:r>
+          <w:rPr>
+            <w:rFonts w:cs="Times New Roman"/>
+            <w:kern w:val="0"/>
+            <w:szCs w:val="24"/>
+            <w:vertAlign w:val="superscript"/>
+          </w:rPr>
+          <w:delText>3</w:delText>
+        </w:r>
+      </w:del>
+      <w:del w:id="9006" w:author="王哲" w:date="2026-08-26T00:00:00Z">
+        <w:r>
+          <w:rPr>
+            <w:rFonts w:eastAsia="宋体" w:cs="Times New Roman"/>
+            <w:szCs w:val="24"/>
+          </w:rPr>
+          <w:fldChar w:fldCharType="end"/>
+        </w:r>
+      </w:del>
+      <w:del w:id="9007" w:author="王哲" w:date="2026-08-26T00:00:00Z">
+        <w:r>
+          <w:rPr>
+            <w:rFonts w:eastAsia="宋体" w:cs="Times New Roman"/>
+            <w:szCs w:val="24"/>
+          </w:rPr>
+          <w:delText>, while ChemReco solves hand-drawn diagram recognition with 96.9% accuracy via EfficientNet-Transformer hybridization</w:delText>
+        </w:r>
+      </w:del>
+      <w:del w:id="9008" w:author="王哲" w:date="2026-08-26T00:00:00Z">
+        <w:r>
+          <w:rPr>
+            <w:rFonts w:eastAsia="宋体" w:cs="Times New Roman"/>
+            <w:szCs w:val="24"/>
+          </w:rPr>
+          <w:fldChar w:fldCharType="begin"/>
+        </w:r>
+      </w:del>
+      <w:del w:id="9009" w:author="王哲" w:date="2026-08-26T00:00:00Z">
+        <w:r>
+          <w:rPr>
+            <w:rFonts w:eastAsia="宋体" w:cs="Times New Roman"/>
+            <w:szCs w:val="24"/>
+          </w:rPr>
+          <w:instrText xml:space="preserve"> ADDIN ZOTERO_ITEM CSL_CITATION {"citationID":"a14k9vfuhrg","properties":{"formattedCitation":"\\super 8\\nosupersub{}","plainCitation":"8","noteIndex":0},"citationItems":[{"id":38853,"uris":["http://zotero.org/users/10054398/items/69A6R8R9"],"itemData":{"id":38853,"type":"article-journal","abstract":"Chemical molecular structures are a direct and convenient means of expressing chemical knowledge, playing a vital role in academic communication. In chemistry, hand drawing is a common task for students and researchers. If we can convert hand-drawn chemical molecular structures into machine-readable formats, like SMILES encoding, computers can efficiently process and analyze these structures, significantly enhancing the efficiency of chemical research. Furthermore, with the progress of educational technology, automated grading is gaining popularity. When machines automatically recognize chemical molecular structures and assess the correctness of the drawings, it offers great convenience to teachers. We created ChemReco, a tool designed to identify chemical molecular structures involving three atoms: C, H, and O, providing convenience for chemical researchers. Currently, there are limited studies on hand-drawn chemical molecular structures. Therefore, the primary focus of this paper is constructing datasets. We propose a synthetic image method to rapidly generate images resembling hand-drawn chemical molecular structures, enhancing dataset acquisition efficiency. Regarding model selection, the hand-drawn chemical molecule structural recognition model developed in this article achieves a final recognition accuracy of 96.90%. This model employs the encoder-decoder architecture of EfficientNet + Transformer, demonstrating superior performance compared to other encoder-decoder combinations.","container-title":"Scientific Reports","DOI":"10.1038/s41598-024-67496-7","ISSN":"2045-2322","issue":"1","journalAbbreviation":"Sci Rep","language":"eng","page":"17126","PMID":"39054356","PMCID":"PMC11272916","source":"PubMed","title":"ChemReco: automated recognition of hand-drawn carbon-hydrogen-oxygen structures using deep learning","title-short":"ChemReco","volume":"14","author":[{"family":"Ouyang","given":"Hengjie"},{"family":"Liu","given":"Wei"},{"family":"Tao","given":"Jiajun"},{"family":"Luo","given":"Yanghong"},{"family":"Zhang","given":"Wanjia"},{"family":"Zhou","given":"Jiayu"},{"family":"Geng","given":"Shuqi"},{"family":"Zhang","given":"Chengpeng"}],"issued":{"date-parts":[["2024",7,25]]}}}],"schema":"https://github.com/citation-style-language/schema/raw/master/csl-citation.json"} </w:instrText>
+        </w:r>
+      </w:del>
+      <w:del w:id="9010" w:author="王哲" w:date="2026-08-26T00:00:00Z">
+        <w:r>
+          <w:rPr>
+            <w:rFonts w:eastAsia="宋体" w:cs="Times New Roman"/>
+            <w:szCs w:val="24"/>
+          </w:rPr>
+          <w:fldChar w:fldCharType="separate"/>
+        </w:r>
+      </w:del>
+      <w:del w:id="9011" w:author="王哲" w:date="2026-08-26T00:00:00Z">
+        <w:r>
+          <w:rPr>
+            <w:rFonts w:eastAsia="宋体" w:cs="Times New Roman"/>
+            <w:kern w:val="0"/>
+            <w:szCs w:val="24"/>
+            <w:vertAlign w:val="superscript"/>
+          </w:rPr>
+          <w:delText>8</w:delText>
+        </w:r>
+      </w:del>
+      <w:del w:id="9012" w:author="王哲" w:date="2026-08-26T00:00:00Z">
+        <w:r>
+          <w:rPr>
+            <w:rFonts w:eastAsia="宋体" w:cs="Times New Roman"/>
+            <w:szCs w:val="24"/>
+          </w:rPr>
+          <w:fldChar w:fldCharType="end"/>
+        </w:r>
+      </w:del>
+      <w:del w:id="9013" w:author="王哲" w:date="2026-08-26T00:00:00Z">
+        <w:r>
+          <w:rPr>
+            <w:rFonts w:eastAsia="宋体" w:cs="Times New Roman"/>
+            <w:szCs w:val="24"/>
+          </w:rPr>
+          <w:delText>. MolScribe tackles stereochemical complexity through geometric analysis</w:delText>
+        </w:r>
+      </w:del>
+      <w:del w:id="9014" w:author="王哲" w:date="2026-08-26T00:00:00Z">
+        <w:r>
+          <w:rPr>
+            <w:rFonts w:eastAsia="宋体" w:cs="Times New Roman"/>
+            <w:szCs w:val="24"/>
+          </w:rPr>
+          <w:fldChar w:fldCharType="begin"/>
+        </w:r>
+      </w:del>
+      <w:del w:id="9015" w:author="王哲" w:date="2026-08-26T00:00:00Z">
+        <w:r>
+          <w:rPr>
+            <w:rFonts w:eastAsia="宋体" w:cs="Times New Roman"/>
+            <w:szCs w:val="24"/>
+          </w:rPr>
+          <w:instrText xml:space="preserve"> ADDIN ZOTERO_ITEM CSL_CITATION {"citationID":"a1kopbhtt7r","properties":{"formattedCitation":"\\super 9\\nosupersub{}","plainCitation":"9","noteIndex":0},"citationItems":[{"id":33630,"uris":["http://zotero.org/users/10054398/items/WJLK49WB"],"itemData":{"id":33630,"type":"article-journal","abstract":"Molecular structure recognition is the task of translating a molecular image into its graph structure. Significant variation in drawing styles and conventions exhibited in chemical literature poses a significant challenge for automating this task. In this paper, we propose MolScribe, a novel image-to-graph generation model that explicitly predicts atoms and bonds, along with their geometric layouts, to construct the molecular structure. Our model flexibly incorporates symbolic chemistry constraints to recognize chirality and expand abbreviated structures. We further develop data augmentation strategies to enhance the model robustness against domain shifts. In experiments on both synthetic and realistic molecular images, MolScribe significantly outperforms previous models, achieving 76–93% accuracy on public benchmarks. Chemists can also easily verify MolScribe’s prediction, informed by its confidence estimation and atom-level alignment with the input image. MolScribe is publicly available through Python and web interfaces: https://github.com/thomas0809/MolScribe.","container-title":"Journal of Chemical Information and Modeling","DOI":"10.1021/acs.jcim.2c01480","ISSN":"1549-9596","issue":"7","journalAbbreviation":"J. Chem. Inf. Model.","page":"1925-1934","publisher":"American Chemical Society","source":"ACS Publications","title":"MolScribe: Robust Molecular Structure Recognition with Image-to-Graph Generation","title-short":"MolScribe","volume":"63","author":[{"family":"Qian","given":"Yujie"},{"family":"Guo","given":"Jiang"},{"family":"Tu","given":"Zhengkai"},{"family":"Li","given":"Zhening"},{"family":"Coley","given":"Connor W."},{"family":"Barzilay","given":"Regina"}],"issued":{"date-parts":[["2023",4,10]]}}}],"schema":"https://github.com/citation-style-language/schema/raw/master/csl-citation.json"} </w:instrText>
+        </w:r>
+      </w:del>
+      <w:del w:id="9016" w:author="王哲" w:date="2026-08-26T00:00:00Z">
+        <w:r>
+          <w:rPr>
+            <w:rFonts w:eastAsia="宋体" w:cs="Times New Roman"/>
+            <w:szCs w:val="24"/>
+          </w:rPr>
+          <w:fldChar w:fldCharType="separate"/>
+        </w:r>
+      </w:del>
+      <w:del w:id="9017" w:author="王哲" w:date="2026-08-26T00:00:00Z">
+        <w:r>
+          <w:rPr>
+            <w:rFonts w:eastAsia="宋体" w:cs="Times New Roman"/>
+            <w:kern w:val="0"/>
+            <w:szCs w:val="24"/>
+            <w:vertAlign w:val="superscript"/>
+          </w:rPr>
+          <w:delText>9</w:delText>
+        </w:r>
+      </w:del>
+      <w:del w:id="9018" w:author="王哲" w:date="2026-08-26T00:00:00Z">
+        <w:r>
+          <w:rPr>
+            <w:rFonts w:eastAsia="宋体" w:cs="Times New Roman"/>
+            <w:szCs w:val="24"/>
+          </w:rPr>
+          <w:fldChar w:fldCharType="end"/>
+        </w:r>
+      </w:del>
+      <w:del w:id="9019" w:author="王哲" w:date="2026-08-26T00:00:00Z">
+        <w:r>
+          <w:rPr>
+            <w:rFonts w:eastAsia="宋体" w:cs="Times New Roman"/>
+            <w:szCs w:val="24"/>
+          </w:rPr>
+          <w:delText>, and MolMiner's integrated framework (MobileNetv2/YOLOv5/EasyOCR) delivers benchmark-leading performance with batch PDF processing - directly addressing literature backlogs</w:delText>
+        </w:r>
+      </w:del>
+      <w:del w:id="9020" w:author="王哲" w:date="2026-08-26T00:00:00Z">
+        <w:r>
+          <w:rPr>
+            <w:rFonts w:eastAsia="宋体" w:cs="Times New Roman"/>
+            <w:szCs w:val="24"/>
+          </w:rPr>
+          <w:fldChar w:fldCharType="begin"/>
+        </w:r>
+      </w:del>
+      <w:del w:id="9021" w:author="王哲" w:date="2026-08-26T00:00:00Z">
+        <w:r>
+          <w:rPr>
+            <w:rFonts w:eastAsia="宋体" w:cs="Times New Roman"/>
+            <w:szCs w:val="24"/>
+          </w:rPr>
+          <w:instrText xml:space="preserve"> ADDIN ZOTERO_ITEM CSL_CITATION {"citationID":"a181e7v1ca6","properties":{"formattedCitation":"\\super 10\\nosupersub{}","plainCitation":"10","noteIndex":0},"citationItems":[{"id":38728,"uris":["http://zotero.org/users/10054398/items/NBQIKKBD"],"itemData":{"id":38728,"type":"article-journal","abstract":"Molecular structures are commonly depicted in 2D printed forms in scientific documents such as journal papers and patents. However, these 2D depictions are not machine readable. Due to a backlog of decades and an increasing amount of printed literatures, there is a high demand for translating printed depictions into machine-readable formats, which is known as Optical Chemical Structure Recognition (OCSR). Most OCSR systems developed over the last three decades use a rule-based approach, which vectorizes the depiction based on the interpretation of vectors and nodes as bonds and atoms. Here, we present a practical software called MolMiner, which is primarily built using deep neural networks originally developed for semantic segmentation and object detection to recognize atom and bond elements from documents. These recognized elements can be easily connected as a molecular graph with a distance-based construction algorithm. MolMiner gave state-of-the-art performance on four benchmark data sets and a self-collected external data set from scientific papers. As MolMiner performed similarly well in real-world OCSR tasks with a user-friendly interface, it is a useful and valuable tool for daily applications. The free download links of Mac and Windows versions are available at https://github.com/iipharma/pharmamind-molminer.","container-title":"Journal of Chemical Information and Modeling","DOI":"10.1021/acs.jcim.2c00733","ISSN":"1549-960X","issue":"22","journalAbbreviation":"J Chem Inf Model","language":"eng","page":"5321-5328","PMID":"36108142","PMCID":"PMC9710516","source":"PubMed","title":"MolMiner: You Only Look Once for Chemical Structure Recognition","title-short":"MolMiner","volume":"62","author":[{"family":"Xu","given":"Youjun"},{"family":"Xiao","given":"Jinchuan"},{"family":"Chou","given":"Chia-Han"},{"family":"Zhang","given":"Jianhang"},{"family":"Zhu","given":"Jintao"},{"family":"Hu","given":"Qiwan"},{"family":"Li","given":"Hemin"},{"family":"Han","given":"Ningsheng"},{"family":"Liu","given":"Bingyu"},{"family":"Zhang","given":"Shuaipeng"},{"family":"Han","given":"Jinyu"},{"family":"Zhang","given":"Zhen"},{"family":"Zhang","given":"Shuhao"},{"family":"Zhang","given":"Weilin"},{"family":"Lai","given":"Luhua"},{"family":"Pei","given":"Jianfeng"}],"issued":{"date-parts":[["2022",11,28]]}}}],"schema":"https://github.com/citation-style-language/schema/raw/master/csl-citation.json"} </w:instrText>
+        </w:r>
+      </w:del>
+      <w:del w:id="9022" w:author="王哲" w:date="2026-08-26T00:00:00Z">
+        <w:r>
+          <w:rPr>
+            <w:rFonts w:eastAsia="宋体" w:cs="Times New Roman"/>
+            <w:szCs w:val="24"/>
+          </w:rPr>
+          <w:fldChar w:fldCharType="separate"/>
+        </w:r>
+      </w:del>
+      <w:del w:id="9023" w:author="王哲" w:date="2026-08-26T00:00:00Z">
+        <w:r>
+          <w:rPr>
+            <w:rFonts w:cs="Times New Roman"/>
+            <w:kern w:val="0"/>
+            <w:szCs w:val="24"/>
+            <w:vertAlign w:val="superscript"/>
+          </w:rPr>
+          <w:delText>10</w:delText>
+        </w:r>
+      </w:del>
+      <w:del w:id="9024" w:author="王哲" w:date="2026-08-26T00:00:00Z">
+        <w:r>
+          <w:rPr>
+            <w:rFonts w:eastAsia="宋体" w:cs="Times New Roman"/>
+            <w:szCs w:val="24"/>
+          </w:rPr>
+          <w:fldChar w:fldCharType="end"/>
+        </w:r>
+      </w:del>
+      <w:del w:id="9025" w:author="王哲" w:date="2026-08-26T00:00:00Z">
+        <w:r>
+          <w:rPr>
+            <w:rFonts w:eastAsia="宋体" w:cs="Times New Roman"/>
+            <w:szCs w:val="24"/>
+          </w:rPr>
+          <w:delText>.</w:delText>
+        </w:r>
+      </w:del>
+      <w:del w:id="9026" w:author="王哲" w:date="2026-08-26T00:00:00Z">
+        <w:r>
+          <w:delText xml:space="preserve"> </w:delText>
+        </w:r>
+      </w:del>
       <w:bookmarkStart w:id="12" w:name="OLE_LINK1"/>
       <w:bookmarkStart w:id="13" w:name="OLE_LINK2"/>
       <w:bookmarkStart w:id="14" w:name="OLE_LINK7"/>
       <w:bookmarkStart w:id="15" w:name="OLE_LINK6"/>
       <w:bookmarkStart w:id="16" w:name="OLE_LINK5"/>
-      <w:r>
-        <w:rPr>
-          <w:rFonts w:eastAsia="宋体" w:cs="Times New Roman"/>
-          <w:szCs w:val="24"/>
-        </w:rPr>
-        <w:t>Supplementary advances include ChemGrapher's bond-order precision</w:t>
-      </w:r>
+      <w:del w:id="9027" w:author="王哲" w:date="2026-08-26T00:00:00Z">
+        <w:r>
+          <w:rPr>
+            <w:rFonts w:eastAsia="宋体" w:cs="Times New Roman"/>
+            <w:szCs w:val="24"/>
+          </w:rPr>
+          <w:delText>Supplementary advances include ChemGrapher's bond-order precision</w:delText>
+        </w:r>
+      </w:del>
       <w:bookmarkEnd w:id="12"/>
       <w:bookmarkEnd w:id="13"/>
-      <w:r>
-        <w:rPr>
-          <w:rFonts w:eastAsia="宋体" w:cs="Times New Roman"/>
-          <w:szCs w:val="24"/>
-        </w:rPr>
-        <w:fldChar w:fldCharType="begin"/>
-      </w:r>
-      <w:r>
-        <w:rPr>
-          <w:rFonts w:eastAsia="宋体" w:cs="Times New Roman"/>
-          <w:szCs w:val="24"/>
-        </w:rPr>
-        <w:instrText xml:space="preserve"> ADDIN ZOTERO_ITEM CSL_CITATION {"citationID":"a25smd9dt49","properties":{"formattedCitation":"\\super 11\\nosupersub{}","plainCitation":"11","noteIndex":0},"citationItems":[{"id":38835,"uris":["http://zotero.org/users/10054398/items/FJH5T5FX"],"itemData":{"id":38835,"type":"article-journal","abstract":"In drug discovery, knowledge of the graph structure of chemical compounds is essential. Many thousands of scientific articles and patents in chemistry and pharmaceutical sciences have investigated chemical compounds, but in many cases, the details of the structure of these chemical compounds are published only as an image. A tool to analyze these images automatically and convert them into a chemical graph structure would be useful for many applications, such as drug discovery. A few such tools are available and they are mostly derived from optical character recognition. However, our evaluation of the performance of these tools reveals that they often make mistakes in recognizing the correct bond multiplicity and stereochemical information. In addition, errors sometimes even lead to missing atoms in the resulting graph. In our work, we address these issues by developing a compound recognition method based on machine learning. More specifically, we develop a deep neural network model for optical compound recognition. The deep learning solution presented here consists of a segmentation model, followed by three classification models that predict atom locations, bonds, and charges. Furthermore, this model not only predicts the graph structure of the molecule but also provides all information necessary to relate each component of the resulting graph to the source image. This solution is scalable and can rapidly process thousands of images. Finally, we empirically compare the proposed method with the well-established tool OSRA1 and observe significant error reduction.","container-title":"Journal of Chemical Information and Modeling","DOI":"10.1021/acs.jcim.0c00459","ISSN":"1549-960X","issue":"10","journalAbbreviation":"J Chem Inf Model","language":"eng","page":"4506-4517","PMID":"32924466","source":"PubMed","title":"ChemGrapher: Optical Graph Recognition of Chemical Compounds by Deep Learning","title-short":"ChemGrapher","volume":"60","author":[{"family":"Oldenhof","given":"Martijn"},{"family":"Arany","given":"Adam"},{"family":"Moreau","given":"Yves"},{"family":"Simm","given":"Jaak"}],"issued":{"date-parts":[["2020",10,26]]}}}],"schema":"https://github.com/citation-style-language/schema/raw/master/csl-citation.json"} </w:instrText>
-      </w:r>
-      <w:r>
-        <w:rPr>
-          <w:rFonts w:eastAsia="宋体" w:cs="Times New Roman"/>
-          <w:szCs w:val="24"/>
-        </w:rPr>
-        <w:fldChar w:fldCharType="separate"/>
-      </w:r>
-      <w:r>
-        <w:rPr>
-          <w:rFonts w:cs="Times New Roman"/>
-          <w:kern w:val="0"/>
-          <w:szCs w:val="24"/>
-          <w:vertAlign w:val="superscript"/>
-        </w:rPr>
-        <w:t>11</w:t>
-      </w:r>
-      <w:r>
-        <w:rPr>
-          <w:rFonts w:eastAsia="宋体" w:cs="Times New Roman"/>
-          <w:szCs w:val="24"/>
-        </w:rPr>
-        <w:fldChar w:fldCharType="end"/>
-      </w:r>
-      <w:r>
-        <w:rPr>
-          <w:rFonts w:eastAsia="宋体" w:cs="Times New Roman"/>
-          <w:szCs w:val="24"/>
-        </w:rPr>
-        <w:t>, SwinOCSR's 98.58% recognition rate</w:t>
-      </w:r>
-      <w:r>
-        <w:rPr>
-          <w:rFonts w:eastAsia="宋体" w:cs="Times New Roman"/>
-          <w:szCs w:val="24"/>
-        </w:rPr>
-        <w:fldChar w:fldCharType="begin"/>
-      </w:r>
-      <w:r>
-        <w:rPr>
-          <w:rFonts w:eastAsia="宋体" w:cs="Times New Roman"/>
-          <w:szCs w:val="24"/>
-        </w:rPr>
-        <w:instrText xml:space="preserve"> ADDIN ZOTERO_ITEM CSL_CITATION {"citationID":"a1vag5p05vc","properties":{"formattedCitation":"\\super 12\\nosupersub{}","plainCitation":"12","noteIndex":0},"citationItems":[{"id":25137,"uris":["http://zotero.org/users/10054398/items/QK8Y7G4P"],"itemData":{"id":25137,"type":"article-journal","abstract":"Optical chemical structure recognition from scientific publications is essential  for rediscovering a chemical structure. It is an extremely challenging problem, and current rule-based and deep-learning methods cannot achieve satisfactory recognition rates. Herein, we propose SwinOCSR, an end-to-end model based on a Swin Transformer. This model uses the Swin Transformer as the backbone to extract image features and introduces Transformer models to convert chemical information from publications into DeepSMILES. A novel chemical structure dataset was constructed to train and verify our method. Our proposed Swin Transformer-based model was extensively tested against the backbone of existing publicly available deep learning methods. The experimental results show that our model significantly outperforms the compared methods, demonstrating the model's effectiveness. Moreover, we used a focal loss to address the token imbalance problem in the text representation of the chemical structure diagram, and our model achieved an accuracy of 98.58%.","citation-key":"Xu2022a","container-title":"Journal of cheminformatics","DOI":"10.1186/s13321-022-00624-5","ISSN":"1758-2946 (Print)","issue":"1","language":"eng","note":"publisher-place: England","page":"41","PMID":"35778754","title":"SwinOCSR: end-to-end optical chemical structure recognition using a Swin  Transformer.","volume":"14","author":[{"family":"Xu","given":"Zhanpeng"},{"family":"Li","given":"Jianhua"},{"family":"Yang","given":"Zhaopeng"},{"family":"Li","given":"Shiliang"},{"family":"Li","given":"Honglin"}],"issued":{"date-parts":[["2022",7]]}}}],"schema":"https://github.com/citation-style-language/schema/raw/master/csl-citation.json"} </w:instrText>
-      </w:r>
-      <w:r>
-        <w:rPr>
-          <w:rFonts w:eastAsia="宋体" w:cs="Times New Roman"/>
-          <w:szCs w:val="24"/>
-        </w:rPr>
-        <w:fldChar w:fldCharType="separate"/>
-      </w:r>
-      <w:r>
-        <w:rPr>
-          <w:rFonts w:cs="Times New Roman"/>
-          <w:kern w:val="0"/>
-          <w:szCs w:val="24"/>
-          <w:vertAlign w:val="superscript"/>
-        </w:rPr>
-        <w:t>12</w:t>
-      </w:r>
-      <w:r>
-        <w:rPr>
-          <w:rFonts w:eastAsia="宋体" w:cs="Times New Roman"/>
-          <w:szCs w:val="24"/>
-        </w:rPr>
-        <w:fldChar w:fldCharType="end"/>
-      </w:r>
-      <w:r>
-        <w:rPr>
-          <w:rFonts w:eastAsia="宋体" w:cs="Times New Roman"/>
-          <w:szCs w:val="24"/>
-        </w:rPr>
-        <w:t>, and ABC-Net's efficient molecular reconstruction via atomic center-point detection</w:t>
-      </w:r>
-      <w:r>
-        <w:rPr>
-          <w:rFonts w:eastAsia="宋体" w:cs="Times New Roman"/>
-          <w:szCs w:val="24"/>
-        </w:rPr>
-        <w:fldChar w:fldCharType="begin"/>
-      </w:r>
-      <w:r>
-        <w:rPr>
-          <w:rFonts w:eastAsia="宋体" w:cs="Times New Roman"/>
-          <w:szCs w:val="24"/>
-        </w:rPr>
-        <w:instrText xml:space="preserve"> ADDIN ZOTERO_ITEM CSL_CITATION {"citationID":"a92mch0a7t","properties":{"formattedCitation":"\\super 13\\nosupersub{}","plainCitation":"13","noteIndex":0},"citationItems":[{"id":38861,"uris":["http://zotero.org/users/10054398/items/4FQQMUQB"],"itemData":{"id":38861,"type":"article-journal","abstract":"Structural information for chemical compounds is often described by pictorial images in most scientific documents, which cannot be easily understood and manipulated by computers. This dilemma makes optical chemical structure recognition (OCSR) an essential tool for automatically mining knowledge from an enormous amount of literature. However, existing OCSR methods fall far short of our expectations for realistic requirements due to their poor recovery accuracy. In this paper, we developed a deep neural network model named ABC-Net (Atom and Bond Center Network) to predict graph structures directly. Based on the divide-and-conquer principle, we propose to model an atom or a bond as a single point in the center. In this way, we can leverage a fully convolutional neural network (CNN) to generate a series of heat-maps to identify these points and predict relevant properties, such as atom types, atom charges, bond types and other properties. Thus, the molecular structure can be recovered by assembling the detected atoms and bonds. Our approach integrates all the detection and property prediction tasks into a single fully CNN, which is scalable and capable of processing molecular images quite efficiently. Experimental results demonstrate that our method could achieve a significant improvement in recognition performance compared with publicly available tools. The proposed method could be considered as a promising solution to OCSR problems and a starting point for the acquisition of molecular information in the literature.","container-title":"Briefings in Bioinformatics","DOI":"10.1093/bib/bbac033","ISSN":"1477-4054","issue":"2","journalAbbreviation":"Brief Bioinform","language":"eng","page":"bbac033","PMID":"35212357","source":"PubMed","title":"ABC-Net: a divide-and-conquer based deep learning architecture for SMILES recognition from molecular images","title-short":"ABC-Net","volume":"23","author":[{"family":"Zhang","given":"Xiao-Chen"},{"family":"Yi","given":"Jia-Cai"},{"family":"Yang","given":"Guo-Ping"},{"family":"Wu","given":"Cheng-Kun"},{"family":"Hou","given":"Ting-Jun"},{"family":"Cao","given":"Dong-Sheng"}],"issued":{"date-parts":[["2022",3,10]]}}}],"schema":"https://github.com/citation-style-language/schema/raw/master/csl-citation.json"} </w:instrText>
-      </w:r>
-      <w:r>
-        <w:rPr>
-          <w:rFonts w:eastAsia="宋体" w:cs="Times New Roman"/>
-          <w:szCs w:val="24"/>
-        </w:rPr>
-        <w:fldChar w:fldCharType="separate"/>
-      </w:r>
-      <w:r>
-        <w:rPr>
-          <w:rFonts w:cs="Times New Roman"/>
-          <w:kern w:val="0"/>
-          <w:szCs w:val="24"/>
-          <w:vertAlign w:val="superscript"/>
-        </w:rPr>
-        <w:t>13</w:t>
-      </w:r>
-      <w:r>
-        <w:rPr>
-          <w:rFonts w:eastAsia="宋体" w:cs="Times New Roman"/>
-          <w:szCs w:val="24"/>
-        </w:rPr>
-        <w:fldChar w:fldCharType="end"/>
-      </w:r>
-      <w:r>
-        <w:rPr>
-          <w:rFonts w:eastAsia="宋体" w:cs="Times New Roman"/>
-          <w:szCs w:val="24"/>
-        </w:rPr>
-        <w:t xml:space="preserve">. </w:t>
-      </w:r>
+      <w:del w:id="9028" w:author="王哲" w:date="2026-08-26T00:00:00Z">
+        <w:r>
+          <w:rPr>
+            <w:rFonts w:eastAsia="宋体" w:cs="Times New Roman"/>
+            <w:szCs w:val="24"/>
+          </w:rPr>
+          <w:fldChar w:fldCharType="begin"/>
+        </w:r>
+      </w:del>
+      <w:del w:id="9029" w:author="王哲" w:date="2026-08-26T00:00:00Z">
+        <w:r>
+          <w:rPr>
+            <w:rFonts w:eastAsia="宋体" w:cs="Times New Roman"/>
+            <w:szCs w:val="24"/>
+          </w:rPr>
+          <w:instrText xml:space="preserve"> ADDIN ZOTERO_ITEM CSL_CITATION {"citationID":"a25smd9dt49","properties":{"formattedCitation":"\\super 11\\nosupersub{}","plainCitation":"11","noteIndex":0},"citationItems":[{"id":38835,"uris":["http://zotero.org/users/10054398/items/FJH5T5FX"],"itemData":{"id":38835,"type":"article-journal","abstract":"In drug discovery, knowledge of the graph structure of chemical compounds is essential. Many thousands of scientific articles and patents in chemistry and pharmaceutical sciences have investigated chemical compounds, but in many cases, the details of the structure of these chemical compounds are published only as an image. A tool to analyze these images automatically and convert them into a chemical graph structure would be useful for many applications, such as drug discovery. A few such tools are available and they are mostly derived from optical character recognition. However, our evaluation of the performance of these tools reveals that they often make mistakes in recognizing the correct bond multiplicity and stereochemical information. In addition, errors sometimes even lead to missing atoms in the resulting graph. In our work, we address these issues by developing a compound recognition method based on machine learning. More specifically, we develop a deep neural network model for optical compound recognition. The deep learning solution presented here consists of a segmentation model, followed by three classification models that predict atom locations, bonds, and charges. Furthermore, this model not only predicts the graph structure of the molecule but also provides all information necessary to relate each component of the resulting graph to the source image. This solution is scalable and can rapidly process thousands of images. Finally, we empirically compare the proposed method with the well-established tool OSRA1 and observe significant error reduction.","container-title":"Journal of Chemical Information and Modeling","DOI":"10.1021/acs.jcim.0c00459","ISSN":"1549-960X","issue":"10","journalAbbreviation":"J Chem Inf Model","language":"eng","page":"4506-4517","PMID":"32924466","source":"PubMed","title":"ChemGrapher: Optical Graph Recognition of Chemical Compounds by Deep Learning","title-short":"ChemGrapher","volume":"60","author":[{"family":"Oldenhof","given":"Martijn"},{"family":"Arany","given":"Adam"},{"family":"Moreau","given":"Yves"},{"family":"Simm","given":"Jaak"}],"issued":{"date-parts":[["2020",10,26]]}}}],"schema":"https://github.com/citation-style-language/schema/raw/master/csl-citation.json"} </w:instrText>
+        </w:r>
+      </w:del>
+      <w:del w:id="9030" w:author="王哲" w:date="2026-08-26T00:00:00Z">
+        <w:r>
+          <w:rPr>
+            <w:rFonts w:eastAsia="宋体" w:cs="Times New Roman"/>
+            <w:szCs w:val="24"/>
+          </w:rPr>
+          <w:fldChar w:fldCharType="separate"/>
+        </w:r>
+      </w:del>
+      <w:del w:id="9031" w:author="王哲" w:date="2026-08-26T00:00:00Z">
+        <w:r>
+          <w:rPr>
+            <w:rFonts w:cs="Times New Roman"/>
+            <w:kern w:val="0"/>
+            <w:szCs w:val="24"/>
+            <w:vertAlign w:val="superscript"/>
+          </w:rPr>
+          <w:delText>11</w:delText>
+        </w:r>
+      </w:del>
+      <w:del w:id="9032" w:author="王哲" w:date="2026-08-26T00:00:00Z">
+        <w:r>
+          <w:rPr>
+            <w:rFonts w:eastAsia="宋体" w:cs="Times New Roman"/>
+            <w:szCs w:val="24"/>
+          </w:rPr>
+          <w:fldChar w:fldCharType="end"/>
+        </w:r>
+      </w:del>
+      <w:del w:id="9033" w:author="王哲" w:date="2026-08-26T00:00:00Z">
+        <w:r>
+          <w:rPr>
+            <w:rFonts w:eastAsia="宋体" w:cs="Times New Roman"/>
+            <w:szCs w:val="24"/>
+          </w:rPr>
+          <w:delText>, SwinOCSR's 98.58% recognition rate</w:delText>
+        </w:r>
+      </w:del>
+      <w:del w:id="9034" w:author="王哲" w:date="2026-08-26T00:00:00Z">
+        <w:r>
+          <w:rPr>
+            <w:rFonts w:eastAsia="宋体" w:cs="Times New Roman"/>
+            <w:szCs w:val="24"/>
+          </w:rPr>
+          <w:fldChar w:fldCharType="begin"/>
+        </w:r>
+      </w:del>
+      <w:del w:id="9035" w:author="王哲" w:date="2026-08-26T00:00:00Z">
+        <w:r>
+          <w:rPr>
+            <w:rFonts w:eastAsia="宋体" w:cs="Times New Roman"/>
+            <w:szCs w:val="24"/>
+          </w:rPr>
+          <w:instrText xml:space="preserve"> ADDIN ZOTERO_ITEM CSL_CITATION {"citationID":"a1vag5p05vc","properties":{"formattedCitation":"\\super 12\\nosupersub{}","plainCitation":"12","noteIndex":0},"citationItems":[{"id":25137,"uris":["http://zotero.org/users/10054398/items/QK8Y7G4P"],"itemData":{"id":25137,"type":"article-journal","abstract":"Optical chemical structure recognition from scientific publications is essential  for rediscovering a chemical structure. It is an extremely challenging problem, and current rule-based and deep-learning methods cannot achieve satisfactory recognition rates. Herein, we propose SwinOCSR, an end-to-end model based on a Swin Transformer. This model uses the Swin Transformer as the backbone to extract image features and introduces Transformer models to convert chemical information from publications into DeepSMILES. A novel chemical structure dataset was constructed to train and verify our method. Our proposed Swin Transformer-based model was extensively tested against the backbone of existing publicly available deep learning methods. The experimental results show that our model significantly outperforms the compared methods, demonstrating the model's effectiveness. Moreover, we used a focal loss to address the token imbalance problem in the text representation of the chemical structure diagram, and our model achieved an accuracy of 98.58%.","citation-key":"Xu2022a","container-title":"Journal of cheminformatics","DOI":"10.1186/s13321-022-00624-5","ISSN":"1758-2946 (Print)","issue":"1","language":"eng","note":"publisher-place: England","page":"41","PMID":"35778754","title":"SwinOCSR: end-to-end optical chemical structure recognition using a Swin  Transformer.","volume":"14","author":[{"family":"Xu","given":"Zhanpeng"},{"family":"Li","given":"Jianhua"},{"family":"Yang","given":"Zhaopeng"},{"family":"Li","given":"Shiliang"},{"family":"Li","given":"Honglin"}],"issued":{"date-parts":[["2022",7]]}}}],"schema":"https://github.com/citation-style-language/schema/raw/master/csl-citation.json"} </w:instrText>
+        </w:r>
+      </w:del>
+      <w:del w:id="9036" w:author="王哲" w:date="2026-08-26T00:00:00Z">
+        <w:r>
+          <w:rPr>
+            <w:rFonts w:eastAsia="宋体" w:cs="Times New Roman"/>
+            <w:szCs w:val="24"/>
+          </w:rPr>
+          <w:fldChar w:fldCharType="separate"/>
+        </w:r>
+      </w:del>
+      <w:del w:id="9037" w:author="王哲" w:date="2026-08-26T00:00:00Z">
+        <w:r>
+          <w:rPr>
+            <w:rFonts w:cs="Times New Roman"/>
+            <w:kern w:val="0"/>
+            <w:szCs w:val="24"/>
+            <w:vertAlign w:val="superscript"/>
+          </w:rPr>
+          <w:delText>12</w:delText>
+        </w:r>
+      </w:del>
+      <w:del w:id="9038" w:author="王哲" w:date="2026-08-26T00:00:00Z">
+        <w:r>
+          <w:rPr>
+            <w:rFonts w:eastAsia="宋体" w:cs="Times New Roman"/>
+            <w:szCs w:val="24"/>
+          </w:rPr>
+          <w:fldChar w:fldCharType="end"/>
+        </w:r>
+      </w:del>
+      <w:del w:id="9039" w:author="王哲" w:date="2026-08-26T00:00:00Z">
+        <w:r>
+          <w:rPr>
+            <w:rFonts w:eastAsia="宋体" w:cs="Times New Roman"/>
+            <w:szCs w:val="24"/>
+          </w:rPr>
+          <w:delText>, and ABC-Net's efficient molecular reconstruction via atomic center-point detection</w:delText>
+        </w:r>
+      </w:del>
+      <w:del w:id="9040" w:author="王哲" w:date="2026-08-26T00:00:00Z">
+        <w:r>
+          <w:rPr>
+            <w:rFonts w:eastAsia="宋体" w:cs="Times New Roman"/>
+            <w:szCs w:val="24"/>
+          </w:rPr>
+          <w:fldChar w:fldCharType="begin"/>
+        </w:r>
+      </w:del>
+      <w:del w:id="9041" w:author="王哲" w:date="2026-08-26T00:00:00Z">
+        <w:r>
+          <w:rPr>
+            <w:rFonts w:eastAsia="宋体" w:cs="Times New Roman"/>
+            <w:szCs w:val="24"/>
+          </w:rPr>
+          <w:instrText xml:space="preserve"> ADDIN ZOTERO_ITEM CSL_CITATION {"citationID":"a92mch0a7t","properties":{"formattedCitation":"\\super 13\\nosupersub{}","plainCitation":"13","noteIndex":0},"citationItems":[{"id":38861,"uris":["http://zotero.org/users/10054398/items/4FQQMUQB"],"itemData":{"id":38861,"type":"article-journal","abstract":"Structural information for chemical compounds is often described by pictorial images in most scientific documents, which cannot be easily understood and manipulated by computers. This dilemma makes optical chemical structure recognition (OCSR) an essential tool for automatically mining knowledge from an enormous amount of literature. However, existing OCSR methods fall far short of our expectations for realistic requirements due to their poor recovery accuracy. In this paper, we developed a deep neural network model named ABC-Net (Atom and Bond Center Network) to predict graph structures directly. Based on the divide-and-conquer principle, we propose to model an atom or a bond as a single point in the center. In this way, we can leverage a fully convolutional neural network (CNN) to generate a series of heat-maps to identify these points and predict relevant properties, such as atom types, atom charges, bond types and other properties. Thus, the molecular structure can be recovered by assembling the detected atoms and bonds. Our approach integrates all the detection and property prediction tasks into a single fully CNN, which is scalable and capable of processing molecular images quite efficiently. Experimental results demonstrate that our method could achieve a significant improvement in recognition performance compared with publicly available tools. The proposed method could be considered as a promising solution to OCSR problems and a starting point for the acquisition of molecular information in the literature.","container-title":"Briefings in Bioinformatics","DOI":"10.1093/bib/bbac033","ISSN":"1477-4054","issue":"2","journalAbbreviation":"Brief Bioinform","language":"eng","page":"bbac033","PMID":"35212357","source":"PubMed","title":"ABC-Net: a divide-and-conquer based deep learning architecture for SMILES recognition from molecular images","title-short":"ABC-Net","volume":"23","author":[{"family":"Zhang","given":"Xiao-Chen"},{"family":"Yi","given":"Jia-Cai"},{"family":"Yang","given":"Guo-Ping"},{"family":"Wu","given":"Cheng-Kun"},{"family":"Hou","given":"Ting-Jun"},{"family":"Cao","given":"Dong-Sheng"}],"issued":{"date-parts":[["2022",3,10]]}}}],"schema":"https://github.com/citation-style-language/schema/raw/master/csl-citation.json"} </w:instrText>
+        </w:r>
+      </w:del>
+      <w:del w:id="9042" w:author="王哲" w:date="2026-08-26T00:00:00Z">
+        <w:r>
+          <w:rPr>
+            <w:rFonts w:eastAsia="宋体" w:cs="Times New Roman"/>
+            <w:szCs w:val="24"/>
+          </w:rPr>
+          <w:fldChar w:fldCharType="separate"/>
+        </w:r>
+      </w:del>
+      <w:del w:id="9043" w:author="王哲" w:date="2026-08-26T00:00:00Z">
+        <w:r>
+          <w:rPr>
+            <w:rFonts w:cs="Times New Roman"/>
+            <w:kern w:val="0"/>
+            <w:szCs w:val="24"/>
+            <w:vertAlign w:val="superscript"/>
+          </w:rPr>
+          <w:delText>13</w:delText>
+        </w:r>
+      </w:del>
+      <w:del w:id="9044" w:author="王哲" w:date="2026-08-26T00:00:00Z">
+        <w:r>
+          <w:rPr>
+            <w:rFonts w:eastAsia="宋体" w:cs="Times New Roman"/>
+            <w:szCs w:val="24"/>
+          </w:rPr>
+          <w:fldChar w:fldCharType="end"/>
+        </w:r>
+      </w:del>
+      <w:del w:id="9045" w:author="王哲" w:date="2026-08-26T00:00:00Z">
+        <w:r>
+          <w:rPr>
+            <w:rFonts w:eastAsia="宋体" w:cs="Times New Roman"/>
+            <w:szCs w:val="24"/>
+          </w:rPr>
+          <w:delText xml:space="preserve">. </w:delText>
+        </w:r>
+      </w:del>
       <w:bookmarkEnd w:id="14"/>
       <w:bookmarkEnd w:id="15"/>
       <w:bookmarkEnd w:id="16"/>
-      <w:r>
-        <w:rPr>
-          <w:rFonts w:eastAsia="宋体" w:cs="Times New Roman"/>
-          <w:szCs w:val="24"/>
-        </w:rPr>
-        <w:t>This generation of tools collectively enables: (i) accurate digitization of legacy publications, (ii) efficient processing of contemporary literature, and (iii) seamless integration with research pipelines through real-time editing interfaces.</w:t>
-      </w:r>
+      <w:del w:id="9046" w:author="王哲" w:date="2026-08-26T00:00:00Z">
+        <w:r>
+          <w:rPr>
+            <w:rFonts w:eastAsia="宋体" w:cs="Times New Roman"/>
+            <w:szCs w:val="24"/>
+          </w:rPr>
+          <w:delText>This generation of tools collectively enables: (i) accurate digitization of legacy publications, (ii) efficient processing of contemporary literature, and (iii) seamless integration with research pipelines through real-time editing interfaces.</w:delText>
+        </w:r>
+      </w:del>
       <w:bookmarkEnd w:id="10"/>
       <w:bookmarkEnd w:id="11"/>
+      <w:ins w:id="9047" w:author="王哲" w:date="2026-08-26T00:00:00Z">
+        <w:r>
+          <w:rPr>
+            <w:rFonts w:eastAsia="宋体" w:cs="Times New Roman"/>
+            <w:szCs w:val="24"/>
+          </w:rPr>
+          <w:t xml:space="preserve">Deep learning has addressed these limitations through specialized solutions: DECIMER.ai overcomes publication variability with its dedicated segmentation–classification pipeline3, while ChemReco solves hand-drawn diagram recognition with 96.9% accuracy via EfficientNet-Transformer hybridization8. MolScribe tackles stereochemical complexity through geometric analysis9, and MolMiner's integrated framework (MobileNetv2/YOLOv5/EasyOCR) delivers benchmark-leading performance with batch PDF processing—directly addressing literature backlogs10. Supplementary advances include ChemGrapher's bond-order precision11, SwinOCSR's 98.58% recognition rate12, and ABC-Net's efficient molecular reconstruction via atomic center-point detection13. This generation of tools collectively enables: (i) accurate digitization of legacy publications, (ii) efficient processing of contemporary literature, and (iii) seamless integration with research pipelines through real-time editing interfaces.</w:t>
+        </w:r>
+      </w:ins>
     </w:p>
     <w:p>
       <w:pPr>
@@ -1517,13 +1618,24 @@
           <w:szCs w:val="24"/>
         </w:rPr>
       </w:pPr>
-      <w:r>
-        <w:rPr>
-          <w:rFonts w:eastAsia="宋体" w:cs="Times New Roman"/>
-          <w:szCs w:val="24"/>
-        </w:rPr>
-        <w:t>Despite these remarkable technological achievements, current OCSR systems exhibit a critical functional limitation: the inability to autonomously associate recognized molecular structures with their corresponding bioactivity profiles. This capability gap fundamentally constrains applications in drug discovery, where the integration of structural and pharmacological data is essential for target identification, rational compound design, high-throughput drug screening, and mechanism elucidation. The development of next-generation OCSR platforms capable of bridging this structure-activity divide represents both a significant challenge and opportunity for the field.</w:t>
-      </w:r>
+      <w:del w:id="9056" w:author="王哲" w:date="2026-08-26T00:00:00Z">
+        <w:r>
+          <w:rPr>
+            <w:rFonts w:eastAsia="宋体" w:cs="Times New Roman"/>
+            <w:szCs w:val="24"/>
+          </w:rPr>
+          <w:delText>Despite these remarkable technological achievements, current OCSR systems exhibit a critical functional limitation: the inability to autonomously associate recognized molecular structures with their corresponding bioactivity profiles. This capability gap fundamentally constrains applications in drug discovery, where the integration of structural and pharmacological data is essential for target identification, rational compound design, high-throughput drug screening, and mechanism elucidation. The development of next-generation OCSR platforms capable of bridging this structure-activity divide represents both a significant challenge and opportunity for the field.</w:delText>
+        </w:r>
+      </w:del>
+      <w:ins w:id="9057" w:author="王哲" w:date="2026-08-26T00:00:00Z">
+        <w:r>
+          <w:rPr>
+            <w:rFonts w:eastAsia="宋体" w:cs="Times New Roman"/>
+            <w:szCs w:val="24"/>
+          </w:rPr>
+          <w:t xml:space="preserve">Despite these remarkable technological achievements, current OCSR systems exhibit a critical functional limitation: the inability to autonomously associate recognized molecular structures with their corresponding bioactivity profiles. Structure-only patent resources such as PatCID4 aggregate patent chemical structures at scale, yet automated association of those structures with their measured activities remains outstanding. This capability gap constrains applications in drug discovery, where the integration of structural and pharmacological data is essential for target identification, rational compound design, high-throughput drug screening, and mechanism elucidation. The development of next-generation OCSR platforms capable of bridging this structure–activity divide represents both a significant challenge and opportunity for the field.</w:t>
+        </w:r>
+      </w:ins>
     </w:p>
     <w:p>
       <w:pPr>
@@ -1533,7 +1645,7 @@
           <w:szCs w:val="24"/>
         </w:rPr>
       </w:pPr>
-      <w:del w:id="5009" w:author="王哲" w:date="2026-08-26T00:00:00Z">
+      <w:del w:id="9058" w:author="王哲" w:date="2026-08-26T00:00:00Z">
         <w:r>
           <w:rPr>
             <w:rFonts w:eastAsia="宋体" w:cs="Times New Roman"/>
@@ -1542,7 +1654,7 @@
           <w:delText>To operationalize this capability, we present BioChemInsight—an integrated pipeline</w:delText>
         </w:r>
       </w:del>
-      <w:del w:id="5010" w:author="王哲" w:date="2026-08-26T00:00:00Z">
+      <w:del w:id="9059" w:author="王哲" w:date="2026-08-26T00:00:00Z">
         <w:r>
           <w:rPr>
             <w:rFonts w:hint="eastAsia" w:eastAsia="宋体" w:cs="Times New Roman"/>
@@ -1551,7 +1663,7 @@
           <w:delText xml:space="preserve"> </w:delText>
         </w:r>
       </w:del>
-      <w:del w:id="5011" w:author="王哲" w:date="2026-08-26T00:00:00Z">
+      <w:del w:id="9060" w:author="王哲" w:date="2026-08-26T00:00:00Z">
         <w:r>
           <w:rPr>
             <w:rFonts w:eastAsia="宋体" w:cs="Times New Roman"/>
@@ -1560,7 +1672,7 @@
           <w:delText>that combines chemical structure recognition with bioactivity data extraction to automatically extract and associate structural information with bioactivity data from publications, enabling the subsequent derivation of structure-activity relationships. Our system employs a multi-component pipeline: (1) DECIMER Segmentation for accurate chemical structure detection from PDFs</w:delText>
         </w:r>
       </w:del>
-      <w:del w:id="5012" w:author="王哲" w:date="2026-08-26T00:00:00Z">
+      <w:del w:id="9061" w:author="王哲" w:date="2026-08-26T00:00:00Z">
         <w:r>
           <w:rPr>
             <w:rFonts w:eastAsia="宋体" w:cs="Times New Roman"/>
@@ -1569,7 +1681,7 @@
           <w:fldChar w:fldCharType="begin"/>
         </w:r>
       </w:del>
-      <w:del w:id="5013" w:author="王哲" w:date="2026-08-26T00:00:00Z">
+      <w:del w:id="9062" w:author="王哲" w:date="2026-08-26T00:00:00Z">
         <w:r>
           <w:rPr>
             <w:rFonts w:eastAsia="宋体" w:cs="Times New Roman"/>
@@ -1578,7 +1690,7 @@
           <w:instrText xml:space="preserve"> ADDIN ZOTERO_ITEM CSL_CITATION {"citationID":"6o7Tm5T3","properties":{"formattedCitation":"\\super 3\\nosupersub{}","plainCitation":"3","noteIndex":0},"citationItems":[{"id":38738,"uris":["http://zotero.org/users/10054398/items/ULBARJ3C"],"itemData":{"id":38738,"type":"article-journal","abstract":"The number of publications describing chemical structures has increased steadily over the last decades. However, the majority of published chemical information is currently not available in machine-readable form in public databases. It remains a challenge to automate the process of information extraction in a way that requires less manual intervention - especially the mining of chemical structure depictions. As an open-source platform that leverages recent advancements in deep learning, computer vision, and natural language processing, DECIMER.ai (Deep lEarning for Chemical IMagE Recognition) strives to automatically segment, classify, and translate chemical structure depictions from the printed literature. The segmentation and classification tools are the only openly available packages of their kind, and the optical chemical structure recognition (OCSR) core application yields outstanding performance on all benchmark datasets. The source code, the trained models and the datasets developed in this work have been published under permissive licences. An instance of the DECIMER web application is available at https://decimer.ai.","container-title":"Nature Communications","DOI":"10.1038/s41467-023-40782-0","ISSN":"2041-1723","issue":"1","journalAbbreviation":"Nat Commun","language":"en","license":"2023 The Author(s)","page":"5045","publisher":"Nature Publishing Group","source":"www.nature.com","title":"DECIMER.ai: an open platform for automated optical chemical structure identification, segmentation and recognition in scientific publications","title-short":"DECIMER.ai","volume":"14","author":[{"family":"Rajan","given":"Kohulan"},{"family":"Brinkhaus","given":"Henning Otto"},{"family":"Agea","given":"M. Isabel"},{"family":"Zielesny","given":"Achim"},{"family":"Steinbeck","given":"Christoph"}],"issued":{"date-parts":[["2023",8,19]]}}}],"schema":"https://github.com/citation-style-language/schema/raw/master/csl-citation.json"} </w:instrText>
         </w:r>
       </w:del>
-      <w:del w:id="5014" w:author="王哲" w:date="2026-08-26T00:00:00Z">
+      <w:del w:id="9063" w:author="王哲" w:date="2026-08-26T00:00:00Z">
         <w:r>
           <w:rPr>
             <w:rFonts w:eastAsia="宋体" w:cs="Times New Roman"/>
@@ -1587,7 +1699,7 @@
           <w:fldChar w:fldCharType="separate"/>
         </w:r>
       </w:del>
-      <w:del w:id="5015" w:author="王哲" w:date="2026-08-26T00:00:00Z">
+      <w:del w:id="9064" w:author="王哲" w:date="2026-08-26T00:00:00Z">
         <w:r>
           <w:rPr>
             <w:rFonts w:cs="Times New Roman"/>
@@ -1598,7 +1710,7 @@
           <w:delText>3</w:delText>
         </w:r>
       </w:del>
-      <w:del w:id="5016" w:author="王哲" w:date="2026-08-26T00:00:00Z">
+      <w:del w:id="9065" w:author="王哲" w:date="2026-08-26T00:00:00Z">
         <w:r>
           <w:rPr>
             <w:rFonts w:eastAsia="宋体" w:cs="Times New Roman"/>
@@ -1607,7 +1719,7 @@
           <w:fldChar w:fldCharType="end"/>
         </w:r>
       </w:del>
-      <w:del w:id="5017" w:author="王哲" w:date="2026-08-26T00:00:00Z">
+      <w:del w:id="9066" w:author="王哲" w:date="2026-08-26T00:00:00Z">
         <w:r>
           <w:rPr>
             <w:rFonts w:eastAsia="宋体" w:cs="Times New Roman"/>
@@ -1618,7 +1730,7 @@
       </w:del>
       <w:bookmarkStart w:id="17" w:name="OLE_LINK16"/>
       <w:bookmarkStart w:id="18" w:name="OLE_LINK17"/>
-      <w:del w:id="5018" w:author="王哲" w:date="2026-08-26T00:00:00Z">
+      <w:del w:id="9067" w:author="王哲" w:date="2026-08-26T00:00:00Z">
         <w:r>
           <w:rPr>
             <w:rFonts w:eastAsia="宋体" w:cs="Times New Roman"/>
@@ -1628,7 +1740,7 @@
         </w:r>
       </w:del>
       <w:ins w:id="2" w:author="王哲" w:date="2026-08-11T13:59:16Z" w16du:dateUtc="2026-08-11T13:59:16Z">
-        <w:del w:id="5019" w:author="王哲" w:date="2026-08-26T00:00:00Z">
+        <w:del w:id="9068" w:author="王哲" w:date="2026-08-26T00:00:00Z">
           <w:r>
             <w:rPr>
               <w:rFonts w:eastAsia="宋体" w:cs="Times New Roman"/>
@@ -1641,7 +1753,7 @@
       </w:ins>
       <w:bookmarkEnd w:id="17"/>
       <w:bookmarkEnd w:id="18"/>
-      <w:del w:id="5020" w:author="王哲" w:date="2026-08-26T00:00:00Z">
+      <w:del w:id="9069" w:author="王哲" w:date="2026-08-26T00:00:00Z">
         <w:r>
           <w:rPr>
             <w:rFonts w:eastAsia="宋体" w:cs="Times New Roman"/>
@@ -1652,7 +1764,7 @@
       </w:del>
       <w:bookmarkStart w:id="19" w:name="OLE_LINK10"/>
       <w:bookmarkStart w:id="20" w:name="OLE_LINK11"/>
-      <w:del w:id="5021" w:author="王哲" w:date="2026-08-26T00:00:00Z">
+      <w:del w:id="9070" w:author="王哲" w:date="2026-08-26T00:00:00Z">
         <w:r>
           <w:rPr>
             <w:rFonts w:eastAsia="宋体" w:cs="Times New Roman"/>
@@ -1663,7 +1775,7 @@
       </w:del>
       <w:bookmarkStart w:id="21" w:name="OLE_LINK18"/>
       <w:bookmarkStart w:id="22" w:name="OLE_LINK13"/>
-      <w:del w:id="5022" w:author="王哲" w:date="2026-08-26T00:00:00Z">
+      <w:del w:id="9071" w:author="王哲" w:date="2026-08-26T00:00:00Z">
         <w:r>
           <w:rPr>
             <w:rFonts w:eastAsia="宋体" w:cs="Times New Roman"/>
@@ -1672,7 +1784,7 @@
           <w:delText>A Vision-Language Model (GLM-4.5V) process</w:delText>
         </w:r>
       </w:del>
-      <w:del w:id="5023" w:author="王哲" w:date="2026-08-26T00:00:00Z">
+      <w:del w:id="9072" w:author="王哲" w:date="2026-08-26T00:00:00Z">
         <w:r>
           <w:rPr>
             <w:rFonts w:hint="eastAsia" w:eastAsia="宋体" w:cs="Times New Roman"/>
@@ -1681,7 +1793,7 @@
           <w:delText>es</w:delText>
         </w:r>
       </w:del>
-      <w:del w:id="5024" w:author="王哲" w:date="2026-08-26T00:00:00Z">
+      <w:del w:id="9073" w:author="王哲" w:date="2026-08-26T00:00:00Z">
         <w:r>
           <w:rPr>
             <w:rFonts w:eastAsia="宋体" w:cs="Times New Roman"/>
@@ -1690,12 +1802,12 @@
           <w:delText xml:space="preserve"> red-boxed regions annotated by DECIMER Segmentation,</w:delText>
         </w:r>
       </w:del>
-      <w:del w:id="5025" w:author="王哲" w:date="2026-08-26T00:00:00Z">
+      <w:del w:id="9074" w:author="王哲" w:date="2026-08-26T00:00:00Z">
         <w:r>
           <w:delText xml:space="preserve"> </w:delText>
         </w:r>
       </w:del>
-      <w:del w:id="5026" w:author="王哲" w:date="2026-08-26T00:00:00Z">
+      <w:del w:id="9075" w:author="王哲" w:date="2026-08-26T00:00:00Z">
         <w:r>
           <w:rPr>
             <w:rFonts w:eastAsia="宋体" w:cs="Times New Roman"/>
@@ -1705,7 +1817,7 @@
         </w:r>
       </w:del>
       <w:ins w:id="3" w:author="王哲" w:date="2026-08-11T13:59:16Z" w16du:dateUtc="2026-08-11T13:59:16Z">
-        <w:del w:id="5027" w:author="王哲" w:date="2026-08-26T00:00:00Z">
+        <w:del w:id="9076" w:author="王哲" w:date="2026-08-26T00:00:00Z">
           <w:r>
             <w:rPr>
               <w:rFonts w:eastAsia="宋体" w:cs="Times New Roman"/>
@@ -1720,7 +1832,7 @@
       <w:bookmarkEnd w:id="20"/>
       <w:bookmarkEnd w:id="21"/>
       <w:bookmarkEnd w:id="22"/>
-      <w:del w:id="5028" w:author="王哲" w:date="2026-08-26T00:00:00Z">
+      <w:del w:id="9077" w:author="王哲" w:date="2026-08-26T00:00:00Z">
         <w:r>
           <w:rPr>
             <w:rFonts w:eastAsia="宋体" w:cs="Times New Roman"/>
@@ -1729,7 +1841,7 @@
           <w:delText>, and (3) PaddleOCR v2.6 converts PDFs to Markdown, after which GLM-4.6 parses this Markdown to extract specified bioactivity data (e.g., IC₅₀, EC₅₀, Ki) with normalized units (nM/μM).</w:delText>
         </w:r>
       </w:del>
-      <w:del w:id="5029" w:author="王哲" w:date="2026-08-26T00:00:00Z">
+      <w:del w:id="9078" w:author="王哲" w:date="2026-08-26T00:00:00Z">
         <w:r>
           <w:rPr>
             <w:rFonts w:hint="eastAsia" w:eastAsia="宋体" w:cs="Times New Roman"/>
@@ -1738,7 +1850,7 @@
           <w:delText xml:space="preserve"> </w:delText>
         </w:r>
       </w:del>
-      <w:del w:id="5030" w:author="王哲" w:date="2026-08-26T00:00:00Z">
+      <w:del w:id="9079" w:author="王哲" w:date="2026-08-26T00:00:00Z">
         <w:r>
           <w:rPr>
             <w:rFonts w:eastAsia="宋体" w:cs="Times New Roman"/>
@@ -1747,13 +1859,13 @@
           <w:delText>BioChemInsight generates structured data files that systematically associate compound IDs with their corresponding SMILES structures and bioactivity metrics, providing ready-to-use datasets for drug optimization, drug screening, and machine learning applications—all without requiring human intervention.</w:delText>
         </w:r>
       </w:del>
-      <w:ins w:id="5031" w:author="王哲" w:date="2026-08-26T00:00:00Z">
-        <w:r>
-          <w:rPr>
-            <w:rFonts w:eastAsia="宋体" w:cs="Times New Roman"/>
-            <w:szCs w:val="24"/>
-          </w:rPr>
-          <w:t xml:space="preserve">To operationalize this capability, we present BioChemInsight—an integrated pipeline that combines chemical structure recognition with bioactivity data extraction to automatically extract and associate structural information with bioactivity data from publications, enabling the subsequent derivation of structure–activity relationships. Our system employs a multi-component pipeline: (1) DECIMER Segmentation for accurate chemical structure detection from PDFs, followed by conversion to SMILES format using a mixture-of-experts (MoE) extension of MolNexTR in which the frozen base network handles complete molecules while dedicated sidecar experts handle Markush scaffolds, fragments and attachment atoms, guided by a calibrated confidence head with visual re-verification of low-confidence decodings; (2) a vision–language model, accessed through an OpenAI-compatible endpoint (GLM-4.5V recommended; a Gemma-class model in the production deployment), processes red-boxed regions annotated by DECIMER Segmentation—containing structures and their labels—to associate each structure with its identifier through spatial and page-scheme analysis; and (3) PaddleOCR converts PDFs to structured Markdown, after which an OpenAI-compatible large language model parses this Markdown to extract experimentally measured bioactivity data (e.g., IC₅₀, EC₅₀, Ki) with normalized units (nM/µM), while explicitly rejecting computationally predicted values such as docking scores. BioChemInsight generates structured data files that systematically associate compound IDs with their corresponding SMILES structures and bioactivity metrics, providing curated datasets for drug optimization, drug screening, and machine learning applications.</w:t>
+      <w:ins w:id="9080" w:author="王哲" w:date="2026-08-26T00:00:00Z">
+        <w:r>
+          <w:rPr>
+            <w:rFonts w:eastAsia="宋体" w:cs="Times New Roman"/>
+            <w:szCs w:val="24"/>
+          </w:rPr>
+          <w:t xml:space="preserve">To operationalize this capability, we present BioChemInsight—an integrated pipeline that combines chemical structure recognition with bioactivity data extraction to automatically extract and associate structural information with bioactivity data from publications, enabling the subsequent derivation of structure–activity relationships (Figure 1). Our system employs a multi-component pipeline: (1) DECIMER Segmentation for accurate chemical structure detection from PDFs3, followed by conversion to SMILES format using a mixture-of-experts (MoE) extension of MolNexTR in which the frozen base network handles complete molecules while dedicated sidecar experts handle Markush scaffolds, fragments and attachment atoms, guided by a calibrated confidence head with visual re-verification of low-confidence decodings; (2) a vision–language model, accessed through an OpenAI-compatible endpoint (GLM-4.5V recommended; a Gemma-class model in the production deployment), processes red-boxed regions annotated by DECIMER Segmentation—containing structures and their labels—to associate each structure with its identifier through spatial and page-scheme analysis; and (3) PaddleOCR converts page renders into structured Markdown, after which an OpenAI-compatible large language model parses this Markdown to extract experimentally measured bioactivity data (e.g., IC₅₀, EC₅₀, Ki) with normalized units (nM/µM), while explicitly rejecting computationally predicted values such as docking scores. BioChemInsight generates structured data files that systematically associate compound IDs with their corresponding SMILES structures and bioactivity metrics, providing curated datasets for drug optimization, drug screening, and machine learning applications.</w:t>
         </w:r>
       </w:ins>
     </w:p>
@@ -1765,7 +1877,7 @@
           <w:szCs w:val="24"/>
         </w:rPr>
       </w:pPr>
-      <w:del w:id="5032" w:author="王哲" w:date="2026-08-26T00:00:00Z">
+      <w:del w:id="9081" w:author="王哲" w:date="2026-08-26T00:00:00Z">
         <w:r>
           <w:rPr>
             <w:rFonts w:eastAsia="宋体" w:cs="Times New Roman"/>
@@ -1776,7 +1888,7 @@
       </w:del>
       <w:bookmarkStart w:id="23" w:name="OLE_LINK22"/>
       <w:bookmarkStart w:id="24" w:name="OLE_LINK23"/>
-      <w:del w:id="5033" w:author="王哲" w:date="2026-08-26T00:00:00Z">
+      <w:del w:id="9082" w:author="王哲" w:date="2026-08-26T00:00:00Z">
         <w:r>
           <w:rPr>
             <w:rFonts w:eastAsia="宋体" w:cs="Times New Roman"/>
@@ -1787,13 +1899,13 @@
       </w:del>
       <w:bookmarkEnd w:id="23"/>
       <w:bookmarkEnd w:id="24"/>
-      <w:ins w:id="5034" w:author="王哲" w:date="2026-08-26T00:00:00Z">
-        <w:r>
-          <w:rPr>
-            <w:rFonts w:eastAsia="宋体" w:cs="Times New Roman"/>
-            <w:szCs w:val="24"/>
-          </w:rPr>
-          <w:t xml:space="preserve">The complete BioChemInsight suite is publicly hosted on GitHub (https://github.com/dahuilangda/BioChemInsight), enabling easy deployment and modular customization. By automating the association between chemical structures and bioactivity profiles, the platform markedly reduces manual data-preprocessing effort while generating datasets whose per-record reliability has been quantified against expert human review. These curated datasets provide high-quality training data for machine learning and deep learning models and enable robust structure–activity relationship analysis. BioChemInsight represents a significant step toward data-centric pharmaceutical research by enabling end-to-end automation of structure–activity data extraction with guided human checkpoints.</w:t>
+      <w:ins w:id="9083" w:author="王哲" w:date="2026-08-26T00:00:00Z">
+        <w:r>
+          <w:rPr>
+            <w:rFonts w:eastAsia="宋体" w:cs="Times New Roman"/>
+            <w:szCs w:val="24"/>
+          </w:rPr>
+          <w:t xml:space="preserve">The complete BioChemInsight suite is publicly hosted on GitHub (https://github.com/dahuilangda/BioChemInsight), enabling easy deployment and modular customization. By automating the association between chemical structures and bioactivity profiles, the platform markedly reduces manual data-preprocessing effort while generating datasets whose record-level reliability was quantified by stratified expert adjudication of a 507-item sample (98.8% correct). These curated datasets provide high-quality training data for machine learning and deep learning models and enable robust structure–activity relationship analysis. BioChemInsight represents a significant step toward data-centric pharmaceutical research by enabling automation of structure–activity data extraction with guided human checkpoints.</w:t>
         </w:r>
       </w:ins>
     </w:p>
@@ -1892,66 +2004,100 @@
       <w:pPr>
         <w:ind w:firstLine="480"/>
       </w:pPr>
-      <w:r>
-        <w:rPr>
-          <w:rFonts w:hint="eastAsia"/>
-        </w:rPr>
-        <w:t>The BioChemInsight Workbench</w:t>
-      </w:r>
-      <w:r>
-        <w:t>’</w:t>
-      </w:r>
-      <w:r>
-        <w:rPr>
-          <w:rFonts w:hint="eastAsia"/>
-        </w:rPr>
-        <w:t>s front-end interface empowers researchers to curate SAR data from patents through a modular, interactive workflow that emphasizes manual, page-level control. As shown in Figure 2A, a four-step navigation (Upload PDF→Structures→Bioactivity→Review) guides users with progress tracking (e.g., upload percentage) and clear step labels, while automatic thumbnail generation for the uploaded PDF reduces technical overhead in preprocessing. Figure 2B and 2C highlight the platform</w:t>
-      </w:r>
-      <w:r>
-        <w:t>’</w:t>
-      </w:r>
-      <w:r>
-        <w:rPr>
-          <w:rFonts w:hint="eastAsia"/>
-        </w:rPr>
-        <w:t xml:space="preserve">s focus on user-driven page curation. In the </w:t>
-      </w:r>
-      <w:r>
-        <w:t>“</w:t>
-      </w:r>
-      <w:r>
-        <w:rPr>
-          <w:rFonts w:hint="eastAsia"/>
-        </w:rPr>
-        <w:t>Structure Explorer</w:t>
-      </w:r>
-      <w:r>
-        <w:t>”</w:t>
-      </w:r>
-      <w:r>
-        <w:rPr>
-          <w:rFonts w:hint="eastAsia"/>
-        </w:rPr>
-        <w:t xml:space="preserve"> (Figure 2B), users manually select pages that contain chemical structures, which are presented as grid-based thumbnails with clear page numbering. In the </w:t>
-      </w:r>
-      <w:r>
-        <w:t>“</w:t>
-      </w:r>
-      <w:r>
-        <w:rPr>
-          <w:rFonts w:hint="eastAsia"/>
-        </w:rPr>
-        <w:t>Bioactivity Page Selection</w:t>
-      </w:r>
-      <w:r>
-        <w:t>”</w:t>
-      </w:r>
-      <w:r>
-        <w:rPr>
-          <w:rFonts w:hint="eastAsia"/>
-        </w:rPr>
-        <w:t xml:space="preserve"> module (Figure 2C), users identify pages holding bioactivity data (e.g., assay tables) and manually enter corresponding assay names. This design acknowledges the heterogeneous layout of patent documents, where chemical structures, text, and tables are often scattered; manual page-level selection ensures that relevant content is accurately targeted—a critical prerequisite for high-quality SAR extraction.</w:t>
-      </w:r>
+      <w:del w:id="9133" w:author="王哲" w:date="2026-08-26T00:00:00Z">
+        <w:r>
+          <w:rPr>
+            <w:rFonts w:hint="eastAsia"/>
+          </w:rPr>
+          <w:delText>The BioChemInsight Workbench</w:delText>
+        </w:r>
+      </w:del>
+      <w:del w:id="9134" w:author="王哲" w:date="2026-08-26T00:00:00Z">
+        <w:r>
+          <w:delText>’</w:delText>
+        </w:r>
+      </w:del>
+      <w:del w:id="9135" w:author="王哲" w:date="2026-08-26T00:00:00Z">
+        <w:r>
+          <w:rPr>
+            <w:rFonts w:hint="eastAsia"/>
+          </w:rPr>
+          <w:delText>s front-end interface empowers researchers to curate SAR data from patents through a modular, interactive workflow that emphasizes manual, page-level control. As shown in Figure 2A, a four-step navigation (Upload PDF→Structures→Bioactivity→Review) guides users with progress tracking (e.g., upload percentage) and clear step labels, while automatic thumbnail generation for the uploaded PDF reduces technical overhead in preprocessing. Figure 2B and 2C highlight the platform</w:delText>
+        </w:r>
+      </w:del>
+      <w:del w:id="9136" w:author="王哲" w:date="2026-08-26T00:00:00Z">
+        <w:r>
+          <w:delText>’</w:delText>
+        </w:r>
+      </w:del>
+      <w:del w:id="9137" w:author="王哲" w:date="2026-08-26T00:00:00Z">
+        <w:r>
+          <w:rPr>
+            <w:rFonts w:hint="eastAsia"/>
+          </w:rPr>
+          <w:delText xml:space="preserve">s focus on user-driven page curation. In the </w:delText>
+        </w:r>
+      </w:del>
+      <w:del w:id="9138" w:author="王哲" w:date="2026-08-26T00:00:00Z">
+        <w:r>
+          <w:delText>“</w:delText>
+        </w:r>
+      </w:del>
+      <w:del w:id="9139" w:author="王哲" w:date="2026-08-26T00:00:00Z">
+        <w:r>
+          <w:rPr>
+            <w:rFonts w:hint="eastAsia"/>
+          </w:rPr>
+          <w:delText>Structure Explorer</w:delText>
+        </w:r>
+      </w:del>
+      <w:del w:id="9140" w:author="王哲" w:date="2026-08-26T00:00:00Z">
+        <w:r>
+          <w:delText>”</w:delText>
+        </w:r>
+      </w:del>
+      <w:del w:id="9141" w:author="王哲" w:date="2026-08-26T00:00:00Z">
+        <w:r>
+          <w:rPr>
+            <w:rFonts w:hint="eastAsia"/>
+          </w:rPr>
+          <w:delText xml:space="preserve"> (Figure 2B), users manually select pages that contain chemical structures, which are presented as grid-based thumbnails with clear page numbering. In the </w:delText>
+        </w:r>
+      </w:del>
+      <w:del w:id="9142" w:author="王哲" w:date="2026-08-26T00:00:00Z">
+        <w:r>
+          <w:delText>“</w:delText>
+        </w:r>
+      </w:del>
+      <w:del w:id="9143" w:author="王哲" w:date="2026-08-26T00:00:00Z">
+        <w:r>
+          <w:rPr>
+            <w:rFonts w:hint="eastAsia"/>
+          </w:rPr>
+          <w:delText>Bioactivity Page Selection</w:delText>
+        </w:r>
+      </w:del>
+      <w:del w:id="9144" w:author="王哲" w:date="2026-08-26T00:00:00Z">
+        <w:r>
+          <w:delText>”</w:delText>
+        </w:r>
+      </w:del>
+      <w:del w:id="9145" w:author="王哲" w:date="2026-08-26T00:00:00Z">
+        <w:r>
+          <w:rPr>
+            <w:rFonts w:hint="eastAsia"/>
+          </w:rPr>
+          <w:delText xml:space="preserve"> module (Figure 2C), users identify pages holding bioactivity data (e.g., assay tables) and manually enter corresponding assay names. This design acknowledges the heterogeneous layout of patent documents, where chemical structures, text, and tables are often scattered; manual page-level selection ensures that relevant content is accurately targeted—a critical prerequisite for high-quality SAR extraction.</w:delText>
+        </w:r>
+      </w:del>
+      <w:ins w:id="9146" w:author="王哲" w:date="2026-08-26T00:00:00Z">
+        <w:r>
+          <w:rPr>
+            <w:rFonts w:hint="eastAsia"/>
+          </w:rPr>
+          <w:t xml:space="preserve">The BioChemInsight Workbench's front-end interface enables researchers to curate SAR data from patents through a modular, interactive workflow that emphasizes manual, page-level control. As shown in Figure 2A, a four-step navigation (Upload PDF → Structures → Bioactivity → Review) guides users with progress tracking (e.g., upload percentage) and clear step labels, while automatic thumbnail generation for the uploaded PDF reduces technical overhead in preprocessing. Figure 2B and 2C highlight the platform's focus on user-driven page curation. In the “Structure Explorer” (Figure 2B), users manually select pages that contain chemical structures, which are presented as grid-based thumbnails with clear page numbering. In the “Bioactivity Page Selection” module (Figure 2C), users identify pages holding bioactivity data (e.g., assay tables) and manually enter corresponding assay names. This design acknowledges the heterogeneous layout of patent documents, where chemical structures, text, and tables are often scattered; manual page-level selection ensures that relevant content is accurately targeted—a critical prerequisite for high-quality SAR extraction.</w:t>
+        </w:r>
+      </w:ins>
     </w:p>
     <w:p>
       <w:pPr>
@@ -2108,41 +2254,60 @@
           <w:sz w:val="24"/>
         </w:rPr>
       </w:pPr>
-      <w:r>
-        <w:rPr>
-          <w:rFonts w:hint="eastAsia" w:cs="Times New Roman (正文 CS 字体)"/>
-          <w:sz w:val="24"/>
-        </w:rPr>
-        <w:t>The Review interface (Figure 3) provides the final, human-supervised checkpoint in the BioChemInsight workflow, designed to ensure the accuracy of extracted SAR data before export. As shown in figure 3A, it offers retrospective control (</w:t>
-      </w:r>
-      <w:r>
-        <w:rPr>
-          <w:rFonts w:cs="Times New Roman (正文 CS 字体)"/>
-          <w:sz w:val="24"/>
-        </w:rPr>
-        <w:t>“</w:t>
-      </w:r>
-      <w:r>
-        <w:rPr>
-          <w:rFonts w:hint="eastAsia" w:cs="Times New Roman (正文 CS 字体)"/>
-          <w:sz w:val="24"/>
-        </w:rPr>
-        <w:t>Adjust extractions</w:t>
-      </w:r>
-      <w:r>
-        <w:rPr>
-          <w:rFonts w:cs="Times New Roman (正文 CS 字体)"/>
-          <w:sz w:val="24"/>
-        </w:rPr>
-        <w:t>”</w:t>
-      </w:r>
-      <w:r>
-        <w:rPr>
-          <w:rFonts w:hint="eastAsia" w:cs="Times New Roman (正文 CS 字体)"/>
-          <w:sz w:val="24"/>
-        </w:rPr>
-        <w:t>) and one-click export functionality. Its core component is an interactive data table that displays Compound IDs, source and extracted structures (preserved in their original patent orientation for reliable visual cross-checking), and editable bioactivity values. This design enables efficient validation; for instance, a user can swiftly confirm that an extracted structure matches its hand-drawn counterpart in the patent PDF. As illustrated in Figure 3B, users can also manually edit any incorrect structure directly within the table to ensure data fidelity.</w:t>
-      </w:r>
+      <w:del w:id="9147" w:author="王哲" w:date="2026-08-26T00:00:00Z">
+        <w:r>
+          <w:rPr>
+            <w:rFonts w:hint="eastAsia" w:cs="Times New Roman (正文 CS 字体)"/>
+            <w:sz w:val="24"/>
+          </w:rPr>
+          <w:delText>The Review interface (Figure 3) provides the final, human-supervised checkpoint in the BioChemInsight workflow, designed to ensure the accuracy of extracted SAR data before export. As shown in figure 3A, it offers retrospective control (</w:delText>
+        </w:r>
+      </w:del>
+      <w:del w:id="9148" w:author="王哲" w:date="2026-08-26T00:00:00Z">
+        <w:r>
+          <w:rPr>
+            <w:rFonts w:cs="Times New Roman (正文 CS 字体)"/>
+            <w:sz w:val="24"/>
+          </w:rPr>
+          <w:delText>“</w:delText>
+        </w:r>
+      </w:del>
+      <w:del w:id="9149" w:author="王哲" w:date="2026-08-26T00:00:00Z">
+        <w:r>
+          <w:rPr>
+            <w:rFonts w:hint="eastAsia" w:cs="Times New Roman (正文 CS 字体)"/>
+            <w:sz w:val="24"/>
+          </w:rPr>
+          <w:delText>Adjust extractions</w:delText>
+        </w:r>
+      </w:del>
+      <w:del w:id="9150" w:author="王哲" w:date="2026-08-26T00:00:00Z">
+        <w:r>
+          <w:rPr>
+            <w:rFonts w:cs="Times New Roman (正文 CS 字体)"/>
+            <w:sz w:val="24"/>
+          </w:rPr>
+          <w:delText>”</w:delText>
+        </w:r>
+      </w:del>
+      <w:del w:id="9151" w:author="王哲" w:date="2026-08-26T00:00:00Z">
+        <w:r>
+          <w:rPr>
+            <w:rFonts w:hint="eastAsia" w:cs="Times New Roman (正文 CS 字体)"/>
+            <w:sz w:val="24"/>
+          </w:rPr>
+          <w:delText>) and one-click export functionality. Its core component is an interactive data table that displays Compound IDs, source and extracted structures (preserved in their original patent orientation for reliable visual cross-checking), and editable bioactivity values. This design enables efficient validation; for instance, a user can swiftly confirm that an extracted structure matches its hand-drawn counterpart in the patent PDF. As illustrated in Figure 3B, users can also manually edit any incorrect structure directly within the table to ensure data fidelity.</w:delText>
+        </w:r>
+      </w:del>
+      <w:ins w:id="9152" w:author="王哲" w:date="2026-08-26T00:00:00Z">
+        <w:r>
+          <w:rPr>
+            <w:rFonts w:hint="eastAsia" w:cs="Times New Roman (正文 CS 字体)"/>
+            <w:sz w:val="24"/>
+          </w:rPr>
+          <w:t xml:space="preserve">The Review interface (Figure 3) provides the final, human-supervised checkpoint in the BioChemInsight workflow, designed to ensure the accuracy of extracted SAR data before export. As shown in Figure 3A, it offers retrospective control (“Adjust extractions”) and one-click export functionality. Its core component is an interactive data table that displays Compound IDs, source and extracted structures (preserved in their original patent orientation for reliable visual cross-checking), and editable bioactivity values. This design enables efficient validation; for instance, a user can swiftly confirm that an extracted structure matches its hand-drawn counterpart in the patent PDF. As illustrated in Figure 3B, users can also manually edit any incorrect structure directly within the table to ensure data fidelity.</w:t>
+        </w:r>
+      </w:ins>
     </w:p>
     <w:p>
       <w:pPr>
@@ -2358,7 +2523,7 @@
       </w:pPr>
       <w:bookmarkStart w:id="34" w:name="OLE_LINK12"/>
       <w:bookmarkStart w:id="35" w:name="OLE_LINK14"/>
-      <w:del w:id="5084" w:author="王哲" w:date="2026-08-26T00:00:00Z">
+      <w:del w:id="9153" w:author="王哲" w:date="2026-08-26T00:00:00Z">
         <w:r>
           <w:rPr>
             <w:rFonts w:cs="Times New Roman"/>
@@ -2366,12 +2531,12 @@
           <w:delText>As shown in Figure 4, BioChemInsight demonstrated robust and consistent performance in extracting SAR data from patents across 15 diverse therapeutic targets. Across all targets, the system achieved high extraction accuracy (&gt;0.8) for chemical structures, biological assay data, and compound identifiers, with most metrics exceeding 0.9. Notably, several biological assays reached 100% accuracy, underscoring the tool’s reliability in capturing key bioactivity data. This high performance was achieved despite substantial variation in dataset size, as the number of patents processed per target ranged from 4 to 20, further confirming the system’s scalability. Moreover, extraction accuracy did not correlate with the number of patents, indicating that performance depends primarily on the inherent characteristics of the patent content (e.g., clarity of structural depictions, uniformity of assay tables) rather than on dataset volume. These results collectively validate BioChemInsight as an effective and scalable tool for accelerating SAR data curation. The system’s consistently high accuracy—including perfect extraction for selected assays—ensures reliable capture of the bioactivity data essential for establishing robust structure-activity relationships.</w:delText>
         </w:r>
       </w:del>
-      <w:ins w:id="5085" w:author="王哲" w:date="2026-08-26T00:00:00Z">
+      <w:ins w:id="9154" w:author="王哲" w:date="2026-08-26T00:00:00Z">
         <w:r>
           <w:rPr>
             <w:rFonts w:cs="Times New Roman"/>
           </w:rPr>
-          <w:t xml:space="preserve">As shown in Figure 4, BioChemInsight demonstrated robust and consistent performance in extracting SAR data from patents across 15 diverse therapeutic targets (pipeline-reported per-target accuracies), achieving high extraction accuracy (&gt;0.8) for chemical structures, biological assay data, and compound identifiers, with most metrics exceeding 0.9 and several biological assays reaching 100% accuracy. Independent recomputation over the complete 296-patent corpus corroborated this picture: 87.3% of all 23,218 extracted structure records yielded valid SMILES, 100% carried compound identifiers, and per-patent SMILES validity averaged 85.7% (median 91.5%). Most importantly, expert human adjudication of 505 compound-level extractions—each compared directly against its original patent segment—confirmed 98.8% of decoded structures as chemically correct (6 errors, 1.2%), with the error rate strongly stratified by document quality (0% in the highest-quality tier versus 12.0% in the lowest). This performance was achieved despite substantial variation in dataset size across targets, and extraction accuracy did not correlate with the number of patents processed, indicating that performance depends primarily on the inherent characteristics of the patent content (e.g., clarity of structural depictions, uniformity of assay tables) rather than on dataset volume. A provenance spot-check traced 71% (20/28) of sampled numeric activity values to the OCR source text, with unresolved cases attributable to OCR digit corruption rather than fabricated values. Together, these analyses complement the pipeline-reported per-target metrics with independent recomputation and human-ground-truth adjudication, validating BioChemInsight as an effective and scalable tool for accelerating SAR data curation whose per-record reliability has been quantified against human ground truth rather than self-reported pipeline output.</w:t>
+          <w:t xml:space="preserve">As shown in Figure 4, BioChemInsight demonstrated robust and consistent performance in extracting SAR data from patents across 15 diverse therapeutic targets (pipeline-reported per-target accuracies; metric definitions in the ESI), achieving high extraction accuracy (&gt;0.8) for chemical structures, biological assay data, and compound identifiers, with most metrics exceeding 0.9 and several biological assays reaching 100% accuracy. Independent recomputation over the complete 296-patent corpus corroborated this picture: 87.3% of all 23,218 extracted structure records yielded valid SMILES, 100% carried compound identifiers, and per-patent SMILES validity averaged 85.7% (median 91.5%; n = 293 patents with at least one structure record, 3 text-only patents excluded). Most importantly, expert human adjudication of 505 compound-level extractions—each compared directly against its original patent segment—confirmed 98.8% of decoded structures as chemically correct (6 errors, 1.2%), with the error rate strongly stratified by document quality (0% in the highest-quality tier versus 12.0% in the lowest). This performance was achieved despite substantial variation in dataset size across targets, and extraction accuracy showed no obvious trend with the number of patents processed, suggesting that performance depends primarily on the inherent characteristics of the patent content (e.g., clarity of structural depictions, uniformity of assay tables) rather than on dataset volume. A provenance spot-check traced 71% (20/28) of sampled numeric activity values to the OCR source text; the 7 untraced values were attributed predominantly to OCR digit corruption (supported by spot-verification of a subset) rather than fabrication. Together, these analyses complement the pipeline-reported per-target metrics with independent recomputation and human-ground-truth adjudication, validating BioChemInsight as an effective and scalable tool for accelerating SAR data curation whose per-record reliability has been quantified against human ground truth rather than self-reported pipeline output.</w:t>
         </w:r>
       </w:ins>
     </w:p>
@@ -2463,7 +2628,7 @@
           <w:rFonts w:cs="Times New Roman"/>
         </w:rPr>
       </w:pPr>
-      <w:del w:id="5118" w:author="王哲" w:date="2026-08-26T00:00:00Z">
+      <w:del w:id="9155" w:author="王哲" w:date="2026-08-26T00:00:00Z">
         <w:r>
           <w:rPr>
             <w:rFonts w:hint="eastAsia" w:cs="Times New Roman"/>
@@ -2471,7 +2636,7 @@
           <w:delText>Figure 5 illustrates representative error cases encountered during the automated extraction of chemical information from patents using BioChemInsight. While the tool generally demonstrates competence in parsing structured data, certain systematic limitations were identified. Two primary sources of error are highlighted, as exemplified in panel (B) of the figure.First, structural extraction accuracy can be compromised by image quality issues inherent in the source documents. As seen in the provided patent excerpt (WO 2007096393), the molecular structures are presented as embedded images. In some patents, these images are subjected to blurring, down-sampling, or other forms of quality degradation, either intentionally or as a byproduct of document processing. This reduction in resolution directly impacts the performance of the optical character recognition (OCR) and structure segmentation models, leading to misinterpretations of bond connectivity, stereochemistry, or functional groups. The discrepancies highlighted by the red boxes in Figure 5B—such as misidentified functional groups or incorrect bond assignments—are often traceable to ambiguous or low-fidelity graphical representations in the original patent figures, which challenge even robust vision-based extraction algorithms.</w:delText>
         </w:r>
       </w:del>
-      <w:ins w:id="5119" w:author="王哲" w:date="2026-08-26T00:00:00Z">
+      <w:ins w:id="9156" w:author="王哲" w:date="2026-08-26T00:00:00Z">
         <w:r>
           <w:rPr>
             <w:rFonts w:hint="eastAsia" w:cs="Times New Roman"/>
@@ -2487,7 +2652,7 @@
           <w:rFonts w:cs="Times New Roman"/>
         </w:rPr>
       </w:pPr>
-      <w:del w:id="5086" w:author="王哲" w:date="2026-08-26T00:00:00Z">
+      <w:del w:id="9157" w:author="王哲" w:date="2026-08-26T00:00:00Z">
         <w:r>
           <w:rPr>
             <w:rFonts w:hint="eastAsia" w:cs="Times New Roman"/>
@@ -2495,7 +2660,7 @@
           <w:delText>Second, the multi-stage processing pipeline, which involves converting image-based text to structured JSON, introduces a critical point of failure in data alignment. Our methodology employs PaddleOCR for text recognition, followed by a large language model (GLM-4.6) for structuring the output into JSON. As shown in the patent table excerpt, the association between a compound identifier (ID), its molecular structure, and its corresponding assay data (Assay) is defined by their precise spatial arrangement in the original document layout. However, when OCR processing results in table cell misalignment or erroneous text block segmentation, the subsequent language model may incorrectly associate a compound's ID with another's assay value or structure. This parsing error propagates through the pipeline, generating inaccurate or nonsensical JSON records where the semantic relationships between data fields are lost or corrupted, ultimately affecting the reliability of the extracted bioactivity dataset.</w:delText>
         </w:r>
       </w:del>
-      <w:ins w:id="5087" w:author="王哲" w:date="2026-08-26T00:00:00Z">
+      <w:ins w:id="9158" w:author="王哲" w:date="2026-08-26T00:00:00Z">
         <w:r>
           <w:rPr>
             <w:rFonts w:hint="eastAsia" w:cs="Times New Roman"/>
@@ -2583,7 +2748,7 @@
         <w:pStyle w:val="50"/>
         <w:jc w:val="both"/>
       </w:pPr>
-      <w:del w:id="5120" w:author="王哲" w:date="2026-08-26T00:00:00Z">
+      <w:del w:id="9159" w:author="王哲" w:date="2026-08-26T00:00:00Z">
         <w:r>
           <w:rPr>
             <w:rFonts w:hint="eastAsia"/>
@@ -2593,7 +2758,7 @@
           <w:delText xml:space="preserve">Figure 5. Representative error cases in chemical structure extraction from patents by BioChemInsight. </w:delText>
         </w:r>
       </w:del>
-      <w:del w:id="5121" w:author="王哲" w:date="2026-08-26T00:00:00Z">
+      <w:del w:id="9160" w:author="王哲" w:date="2026-08-26T00:00:00Z">
         <w:r>
           <w:rPr>
             <w:rFonts w:hint="eastAsia"/>
@@ -2601,7 +2766,7 @@
           <w:delText>(A)</w:delText>
         </w:r>
       </w:del>
-      <w:del w:id="5122" w:author="王哲" w:date="2026-08-26T00:00:00Z">
+      <w:del w:id="9161" w:author="王哲" w:date="2026-08-26T00:00:00Z">
         <w:r>
           <w:rPr>
             <w:rFonts w:hint="eastAsia"/>
@@ -2611,7 +2776,7 @@
           <w:delText xml:space="preserve"> </w:delText>
         </w:r>
       </w:del>
-      <w:del w:id="5123" w:author="王哲" w:date="2026-08-26T00:00:00Z">
+      <w:del w:id="9162" w:author="王哲" w:date="2026-08-26T00:00:00Z">
         <w:r>
           <w:rPr>
             <w:rFonts w:hint="eastAsia"/>
@@ -2619,7 +2784,7 @@
           <w:delText>A representative excerpt from patent WO 2007096393, showing a table that lists compound identifiers, molecular structures, and assay activity data for Eg5 inhibitors. (B) Three representative failure cases in structure extraction. For each compound, the Original Structure​ (left) from the patent is compared with the Extracted Structure​ (right) generated by BioChemInsight. Discrepancies are highlighted with red boxes, illustrating typical error modes in automated parsing, such as misidentification of functional groups or bond connectivity.</w:delText>
         </w:r>
       </w:del>
-      <w:ins w:id="5124" w:author="王哲" w:date="2026-08-26T00:00:00Z">
+      <w:ins w:id="9163" w:author="王哲" w:date="2026-08-26T00:00:00Z">
         <w:r>
           <w:rPr>
             <w:rFonts w:hint="eastAsia"/>
@@ -2646,18 +2811,28 @@
           <w:numId w:val="3"/>
         </w:numPr>
       </w:pPr>
-      <w:r>
-        <w:rPr>
-          <w:rFonts w:hint="eastAsia"/>
-        </w:rPr>
-        <w:t>Patent-Derived Chemical Space Exhibits Strong Complementarity to ChEMBL database</w:t>
-      </w:r>
+      <w:del w:id="9164" w:author="王哲" w:date="2026-08-26T00:00:00Z">
+        <w:r>
+          <w:rPr>
+            <w:rFonts w:hint="eastAsia"/>
+          </w:rPr>
+          <w:delText>Patent-Derived Chemical Space Exhibits Strong Complementarity to ChEMBL database</w:delText>
+        </w:r>
+      </w:del>
+      <w:ins w:id="9165" w:author="王哲" w:date="2026-08-26T00:00:00Z">
+        <w:r>
+          <w:rPr>
+            <w:rFonts w:hint="eastAsia"/>
+          </w:rPr>
+          <w:t xml:space="preserve">Patent-Derived Chemical Space Exhibits Complementarity to the ChEMBL Database</w:t>
+        </w:r>
+      </w:ins>
     </w:p>
     <w:p>
       <w:pPr>
         <w:ind w:firstLine="480"/>
       </w:pPr>
-      <w:del w:id="5088" w:author="王哲" w:date="2026-08-26T00:00:00Z">
+      <w:del w:id="9166" w:author="王哲" w:date="2026-08-26T00:00:00Z">
         <w:r>
           <w:rPr>
             <w:rFonts w:hint="eastAsia"/>
@@ -2665,22 +2840,22 @@
           <w:delText>To assess the novelty and complementarity of patent-derived structure-activity relationship (SAR) data, we compared compound-target associations extracted by BioChemInsight with those from ChEMBL</w:delText>
         </w:r>
       </w:del>
-      <w:del w:id="5089" w:author="王哲" w:date="2026-08-26T00:00:00Z">
+      <w:del w:id="9167" w:author="王哲" w:date="2026-08-26T00:00:00Z">
         <w:r>
           <w:fldChar w:fldCharType="begin"/>
         </w:r>
       </w:del>
-      <w:del w:id="5090" w:author="王哲" w:date="2026-08-26T00:00:00Z">
+      <w:del w:id="9168" w:author="王哲" w:date="2026-08-26T00:00:00Z">
         <w:r>
           <w:instrText xml:space="preserve"> ADDIN ZOTERO_ITEM CSL_CITATION {"citationID":"am89esvh0c","properties":{"formattedCitation":"\\super 15\\nosupersub{}","plainCitation":"15","noteIndex":0},"citationItems":[{"id":11667,"uris":["http://zotero.org/users/10054398/items/JFGG8Q4U"],"itemData":{"id":11667,"type":"article-journal","abstract":"ChEMBL is a large, open-access bioactivity database  (https://www.ebi.ac.uk/chembl), previously described in the 2012, 2014 and 2017 Nucleic Acids Research Database Issues. In the last two years, several important improvements have been made to the database and are described here. These include more robust capture and representation of assay details; a new data deposition system, allowing updating of data sets and deposition of supplementary data; and a completely redesigned web interface, with enhanced search and filtering capabilities.","container-title":"Nucleic acids research","DOI":"10.1093/nar/gky1075","issue":"D1","page":"D930-D940","title":"ChEMBL: towards direct deposition of bioassay data.","volume":"47","author":[{"family":"Mendez","given":"David"},{"family":"Gaulton","given":"Anna"},{"family":"Bento","given":"A Patrícia"},{"family":"Chambers","given":"Jon"},{"family":"De Veij","given":"Marleen"},{"family":"Félix","given":"Eloy"},{"family":"Magariños","given":"María Paula"},{"family":"Mosquera","given":"Juan F"},{"family":"Mutowo","given":"Prudence"},{"family":"Nowotka","given":"Michal"},{"family":"Gordillo-Marañón","given":"María"},{"family":"Hunter","given":"Fiona"},{"family":"Junco","given":"Laura"},{"family":"Mugumbate","given":"Grace"},{"family":"Rodriguez-Lopez","given":"Milagros"},{"family":"Atkinson","given":"Francis"},{"family":"Bosc","given":"Nicolas"},{"family":"Radoux","given":"Chris J"},{"family":"Segura-Cabrera","given":"Aldo"},{"family":"Hersey","given":"Anne"},{"family":"Leach","given":"Andrew R"}],"issued":{"date-parts":[["2019",1]]}}}],"schema":"https://github.com/citation-style-language/schema/raw/master/csl-citation.json"} </w:instrText>
         </w:r>
       </w:del>
-      <w:del w:id="5091" w:author="王哲" w:date="2026-08-26T00:00:00Z">
+      <w:del w:id="9169" w:author="王哲" w:date="2026-08-26T00:00:00Z">
         <w:r>
           <w:fldChar w:fldCharType="separate"/>
         </w:r>
       </w:del>
-      <w:del w:id="5092" w:author="王哲" w:date="2026-08-26T00:00:00Z">
+      <w:del w:id="9170" w:author="王哲" w:date="2026-08-26T00:00:00Z">
         <w:r>
           <w:rPr>
             <w:rFonts w:cs="Times New Roman"/>
@@ -2691,12 +2866,12 @@
           <w:delText>15</w:delText>
         </w:r>
       </w:del>
-      <w:del w:id="5093" w:author="王哲" w:date="2026-08-26T00:00:00Z">
+      <w:del w:id="9171" w:author="王哲" w:date="2026-08-26T00:00:00Z">
         <w:r>
           <w:fldChar w:fldCharType="end"/>
         </w:r>
       </w:del>
-      <w:del w:id="5094" w:author="王哲" w:date="2026-08-26T00:00:00Z">
+      <w:del w:id="9172" w:author="王哲" w:date="2026-08-26T00:00:00Z">
         <w:r>
           <w:rPr>
             <w:rFonts w:hint="eastAsia"/>
@@ -2704,12 +2879,12 @@
           <w:delText>, a major public repository of bioactive molecules and SAR data. For each target, compounds from both sources were pooled, encoded as Morgan fingerprints (radius = 2</w:delText>
         </w:r>
       </w:del>
-      <w:del w:id="5095" w:author="王哲" w:date="2026-08-26T00:00:00Z">
+      <w:del w:id="9173" w:author="王哲" w:date="2026-08-26T00:00:00Z">
         <w:r>
           <w:delText>,</w:delText>
         </w:r>
       </w:del>
-      <w:del w:id="5096" w:author="王哲" w:date="2026-08-26T00:00:00Z">
+      <w:del w:id="9174" w:author="王哲" w:date="2026-08-26T00:00:00Z">
         <w:r>
           <w:rPr>
             <w:rFonts w:hint="eastAsia"/>
@@ -2717,12 +2892,12 @@
           <w:delText>2048 bits), and visualized via dimensionality reduction using Uniform Manifold Approximation and Projection (UMAP). As shown in Figure 6, patent-derived compounds (red dots) and ChEMBL-derived compounds (blue dots) formed distinct, minimally overlapping clusters in chemical space—a trend consistent across all 15 targets analyzed. This indicates that the chemical space associated with a given target in the patent literature is substantially different from that represented in public databases.</w:delText>
         </w:r>
       </w:del>
-      <w:ins w:id="5097" w:author="王哲" w:date="2026-08-26T00:00:00Z">
+      <w:ins w:id="9175" w:author="王哲" w:date="2026-08-26T00:00:00Z">
         <w:r>
           <w:rPr>
             <w:rFonts w:hint="eastAsia"/>
           </w:rPr>
-          <w:t xml:space="preserve">To assess the novelty and complementarity of patent-derived structure–activity relationship (SAR) data, we compared compound–target associations extracted by BioChemInsight with those from ChEMBL, a major public repository of bioactive molecules and SAR data. For each target, compounds from both sources were pooled and encoded as Morgan fingerprints (radius = 2; 2048 bits), and the resulting target-level chemical spaces were compared by dimensionality reduction using Uniform Manifold Approximation and Projection (UMAP). As shown in Figure 6, targets characterized from patent documents and targets characterized from ChEMBL occupy distinct, minimally overlapping regions of the projected chemical space—a trend consistent across all 15 targets analysed. This indicates that the chemical space associated with a given target in the patent literature is substantially different from that represented in public databases (UMAP parameters are listed in the ESI).</w:t>
+          <w:t xml:space="preserve">To assess the novelty and complementarity of patent-derived structure–activity relationship (SAR) data, we compared compound–target associations extracted by BioChemInsight with those from ChEMBL,15 a major public repository of bioactive molecules and SAR data. For each target, compounds from both sources were pooled into a single feature vector of Morgan fingerprints (radius = 2; 2048 bits) per target and source, and the resulting target-level chemical spaces were compared by dimensionality reduction using Uniform Manifold Approximation and Projection (UMAP). As shown in Figure 6, targets characterized from patent documents and targets characterized from ChEMBL occupy distinct, minimally overlapping regions of the projected chemical space—a trend consistent across all 15 targets analysed (UMAP parameters are listed in the ESI). Given the modest number of points, this projection serves as qualitative evidence; the consistent separation across all targets is the observation of interest. This indicates that the chemical space associated with a given target in the patent literature is substantially different from that represented in public databases.</w:t>
         </w:r>
       </w:ins>
     </w:p>
@@ -2809,20 +2984,34 @@
         <w:pStyle w:val="50"/>
         <w:jc w:val="both"/>
       </w:pPr>
-      <w:r>
-        <w:rPr>
-          <w:rFonts w:hint="eastAsia"/>
-          <w:b/>
-          <w:bCs/>
-        </w:rPr>
-        <w:t xml:space="preserve">Figure 6. Comparison of target representation spaces derived from BioChemInsight patent data and the ChEMBL database. </w:t>
-      </w:r>
-      <w:r>
-        <w:rPr>
-          <w:rFonts w:hint="eastAsia"/>
-        </w:rPr>
-        <w:t>Each point corresponds to a therapeutic target, projected into two dimensions using UMAP (UMAP1 and UMAP2) based on feature vectors generated from Morgan fingerprints of compounds associated with each target. Red circles represent targets characterized from patent documents processed by BioChemInsight. Blue circles represent targets characterized from curated bioactivity records in the ChEMBL database. The minimal overlap between the two clusters indicates substantial differences in the chemical and biological information captured by patent literature versus the ChEMBL database.</w:t>
-      </w:r>
+      <w:del w:id="9176" w:author="王哲" w:date="2026-08-26T00:00:00Z">
+        <w:r>
+          <w:rPr>
+            <w:rFonts w:hint="eastAsia"/>
+            <w:b/>
+            <w:bCs/>
+          </w:rPr>
+          <w:delText xml:space="preserve">Figure 6. Comparison of target representation spaces derived from BioChemInsight patent data and the ChEMBL database. </w:delText>
+        </w:r>
+      </w:del>
+      <w:del w:id="9177" w:author="王哲" w:date="2026-08-26T00:00:00Z">
+        <w:r>
+          <w:rPr>
+            <w:rFonts w:hint="eastAsia"/>
+          </w:rPr>
+          <w:delText>Each point corresponds to a therapeutic target, projected into two dimensions using UMAP (UMAP1 and UMAP2) based on feature vectors generated from Morgan fingerprints of compounds associated with each target. Red circles represent targets characterized from patent documents processed by BioChemInsight. Blue circles represent targets characterized from curated bioactivity records in the ChEMBL database. The minimal overlap between the two clusters indicates substantial differences in the chemical and biological information captured by patent literature versus the ChEMBL database.</w:delText>
+        </w:r>
+      </w:del>
+      <w:ins w:id="9178" w:author="王哲" w:date="2026-08-26T00:00:00Z">
+        <w:r>
+          <w:rPr>
+            <w:rFonts w:hint="eastAsia"/>
+            <w:b/>
+            <w:bCs/>
+          </w:rPr>
+          <w:t xml:space="preserve">Figure 6. Comparison of target representation spaces derived from BioChemInsight patent data and the ChEMBL database. Each point corresponds to a therapeutic target, projected into two dimensions using UMAP (UMAP1 and UMAP2) based on feature vectors generated from Morgan fingerprints of compounds associated with each target. Red circles represent targets characterized from patent documents processed by BioChemInsight. Blue circles represent targets characterized from curated bioactivity records in the ChEMBL database. The two families of targets occupy distinct regions of the projection.</w:t>
+        </w:r>
+      </w:ins>
     </w:p>
     <w:p>
       <w:pPr>
@@ -2851,6 +3040,63 @@
     </w:p>
     <w:p>
       <w:pPr>
+        <w:ind w:firstLine="480"/>
+      </w:pPr>
+      <w:bookmarkStart w:id="37" w:name="OLE_LINK29"/>
+      <w:bookmarkStart w:id="38" w:name="OLE_LINK28"/>
+      <w:del w:id="9179" w:author="王哲" w:date="2026-08-26T00:00:00Z">
+        <w:r>
+          <w:delText>BioChemInsight represents a significant advancement in automated literature mining for early-stage drug discovery. It provides a unified, open-source pipeline that integrates state-of-the-art models for optical chemical structure recognition, compound identifier association, and bioactivity extraction with unit normalization, effectively converting unstructured patent documents into machine-readable SAR datasets.​</w:delText>
+        </w:r>
+      </w:del>
+      <w:ins w:id="10" w:author="王哲" w:date="2026-08-11T13:59:16Z" w16du:dateUtc="2026-08-11T13:59:16Z">
+        <w:del w:id="9180" w:author="王哲" w:date="2026-08-26T00:00:00Z">
+          <w:r>
+            <w:rPr>
+              <w:rFonts w:eastAsia="宋体" w:cs="Times New Roman"/>
+              <w:color w:val="000000"/>
+              <w:szCs w:val="24"/>
+            </w:rPr>
+            <w:delText xml:space="preserve"> In particular, a Mixture-of-Experts extension of the structure recognizer and a dedicated Markush scaffold and fragment assembly module extend coverage to the variable substituent chemistry that dominates patent claims.</w:delText>
+          </w:r>
+        </w:del>
+      </w:ins>
+      <w:del w:id="9181" w:author="王哲" w:date="2026-08-26T00:00:00Z">
+        <w:r>
+          <w:rPr>
+            <w:rFonts w:hint="eastAsia"/>
+          </w:rPr>
+          <w:delText xml:space="preserve"> </w:delText>
+        </w:r>
+      </w:del>
+      <w:del w:id="9182" w:author="王哲" w:date="2026-08-26T00:00:00Z">
+        <w:r>
+          <w:delText>Our systematic evaluation on 181 patents across 15 therapeutic targets demonstrates the pipeline’s robust performance, achieving an average extraction accuracy of 90% for structure, bioactivity, and identifier recognition. Crucially, analysis indicates that the chemical information extracted from patents occupies a space largely complementary to that of established public repositorie ChEMBL. Consequently, BioChemInsight unlocks access to previously underrepresented chemical and bioactivity data, thereby expanding the landscape of explorable compound-target interactions and enriching the foundation for quantitative modeling and targeted screening.</w:delText>
+        </w:r>
+      </w:del>
+      <w:del w:id="9183" w:author="王哲" w:date="2026-08-26T00:00:00Z">
+        <w:r>
+          <w:rPr>
+            <w:rFonts w:hint="eastAsia"/>
+          </w:rPr>
+          <w:delText xml:space="preserve"> </w:delText>
+        </w:r>
+      </w:del>
+      <w:del w:id="9184" w:author="王哲" w:date="2026-08-26T00:00:00Z">
+        <w:r>
+          <w:delText>By reducing data preprocessing time from weeks to hours and requiring minimal user intervention, BioChemInsight is well-suited for high-throughput applications, including automated SAR dataset construction, knowledge graph expansion, and data-driven hit identification. The pipeline is publicly available at https://github.com/dahuilangda/BioChemInsightto support reproducible, scalable chemical data mining.</w:delText>
+        </w:r>
+      </w:del>
+      <w:ins w:id="9185" w:author="王哲" w:date="2026-08-26T00:00:00Z">
+        <w:r>
+          <w:t xml:space="preserve">BioChemInsight provides a unified, open-source pipeline that integrates recent models for optical chemical structure recognition—extended with mixture-of-experts decoding for Markush and fragment chemistries—compound identifier association, and bioactivity extraction with unit normalization, effectively converting unstructured patent documents into machine-readable SAR datasets. Our systematic evaluation on 296 patents across 15 therapeutic targets demonstrates robust performance: 87.3% of 23,218 extracted structure records yielded valid SMILES with complete identifier coverage, and expert human adjudication of 505 compound-level extractions against original patent segments confirmed 98.8% structural correctness, with errors concentrated in a small, quality-predictable subset of documents. Analysis of the extracted data further indicates that the chemical information from patents occupies a space largely complementary to that of the established public repository ChEMBL. BioChemInsight thereby provides access to previously underrepresented chemical and bioactivity data, expanding the landscape of explorable compound–target interactions and enriching the foundation for quantitative modelling and targeted screening. With guided, page-level human curation limited to page selection and final review, the platform is well-suited for high-throughput applications, including automated SAR dataset construction, knowledge graph expansion, and data-driven hit identification. The pipeline is publicly available at https://github.com/dahuilangda/BioChemInsight to support reproducible, scalable chemical data mining.</w:t>
+        </w:r>
+      </w:ins>
+    </w:p>
+    <w:bookmarkEnd w:id="37"/>
+    <w:bookmarkEnd w:id="38"/>
+    <w:p>
+      <w:pPr>
         <w:ind w:firstLine="562"/>
         <w:rPr>
           <w:rFonts w:cs="Times New Roman"/>
@@ -2907,7 +3153,7 @@
           <w:szCs w:val="24"/>
         </w:rPr>
       </w:pPr>
-      <w:del w:id="5035" w:author="王哲" w:date="2026-08-26T00:00:00Z">
+      <w:del w:id="9084" w:author="王哲" w:date="2026-08-26T00:00:00Z">
         <w:r>
           <w:rPr>
             <w:rFonts w:eastAsia="宋体" w:cs="Times New Roman"/>
@@ -2917,22 +3163,22 @@
           <w:delText xml:space="preserve">BioChemInsight is a computational suite built with a React frontend and a Python 3.10 backend, designed for the automated extraction of structure-activity relationship (SAR) data from chemical literature. The system implements a modular pipeline that integrates computer vision, natural language processing, and cheminformatics tools to transform PDF documents into structured chemical-bioactivity networks. All components are version-controlled (PyTorch 2.0.0, CUDA 11.8) with dependencies managed through Conda environments. Complete validation datasets and installation guidelines are available through the project's GitHub repository at </w:delText>
         </w:r>
       </w:del>
-      <w:del w:id="5036" w:author="王哲" w:date="2026-08-26T00:00:00Z">
+      <w:del w:id="9085" w:author="王哲" w:date="2026-08-26T00:00:00Z">
         <w:r>
           <w:fldChar w:fldCharType="begin"/>
         </w:r>
       </w:del>
-      <w:del w:id="5037" w:author="王哲" w:date="2026-08-26T00:00:00Z">
+      <w:del w:id="9086" w:author="王哲" w:date="2026-08-26T00:00:00Z">
         <w:r>
           <w:instrText xml:space="preserve"> HYPERLINK "https://github.com/dahuilangda/BioChemInsight" </w:instrText>
         </w:r>
       </w:del>
-      <w:del w:id="5038" w:author="王哲" w:date="2026-08-26T00:00:00Z">
+      <w:del w:id="9087" w:author="王哲" w:date="2026-08-26T00:00:00Z">
         <w:r>
           <w:fldChar w:fldCharType="separate"/>
         </w:r>
       </w:del>
-      <w:del w:id="5039" w:author="王哲" w:date="2026-08-26T00:00:00Z">
+      <w:del w:id="9088" w:author="王哲" w:date="2026-08-26T00:00:00Z">
         <w:r>
           <w:rPr>
             <w:rStyle w:val="14"/>
@@ -2942,7 +3188,7 @@
           <w:delText>https://github.com/dahuilangda/BioChemInsight</w:delText>
         </w:r>
       </w:del>
-      <w:del w:id="5040" w:author="王哲" w:date="2026-08-26T00:00:00Z">
+      <w:del w:id="9089" w:author="王哲" w:date="2026-08-26T00:00:00Z">
         <w:r>
           <w:rPr>
             <w:rStyle w:val="14"/>
@@ -2952,7 +3198,7 @@
           <w:fldChar w:fldCharType="end"/>
         </w:r>
       </w:del>
-      <w:del w:id="5041" w:author="王哲" w:date="2026-08-26T00:00:00Z">
+      <w:del w:id="9090" w:author="王哲" w:date="2026-08-26T00:00:00Z">
         <w:r>
           <w:rPr>
             <w:rFonts w:eastAsia="宋体" w:cs="Times New Roman"/>
@@ -2963,7 +3209,7 @@
         </w:r>
       </w:del>
       <w:ins w:id="4" w:author="王哲" w:date="2026-08-11T13:59:16Z" w16du:dateUtc="2026-08-11T13:59:16Z">
-        <w:del w:id="5042" w:author="王哲" w:date="2026-08-26T00:00:00Z">
+        <w:del w:id="9091" w:author="王哲" w:date="2026-08-26T00:00:00Z">
           <w:r>
             <w:rPr>
               <w:rFonts w:eastAsia="宋体" w:cs="Times New Roman"/>
@@ -2974,7 +3220,7 @@
           </w:r>
         </w:del>
       </w:ins>
-      <w:ins w:id="5043" w:author="王哲" w:date="2026-08-26T00:00:00Z">
+      <w:ins w:id="9092" w:author="王哲" w:date="2026-08-26T00:00:00Z">
         <w:r>
           <w:rPr>
             <w:rFonts w:eastAsia="宋体" w:cs="Times New Roman"/>
@@ -3019,7 +3265,7 @@
           <w:szCs w:val="24"/>
         </w:rPr>
       </w:pPr>
-      <w:del w:id="5044" w:author="王哲" w:date="2026-08-26T00:00:00Z">
+      <w:del w:id="9093" w:author="王哲" w:date="2026-08-26T00:00:00Z">
         <w:r>
           <w:rPr>
             <w:rFonts w:eastAsia="宋体" w:cs="Times New Roman"/>
@@ -3029,14 +3275,14 @@
           <w:delText>The workflow executes through four sequential stages, each handling specific aspects of chemical information extraction.</w:delText>
         </w:r>
       </w:del>
-      <w:ins w:id="5045" w:author="王哲" w:date="2026-08-26T00:00:00Z">
+      <w:ins w:id="9094" w:author="王哲" w:date="2026-08-26T00:00:00Z">
         <w:r>
           <w:rPr>
             <w:rFonts w:eastAsia="宋体" w:cs="Times New Roman"/>
             <w:color w:val="000000"/>
             <w:szCs w:val="24"/>
           </w:rPr>
-          <w:t xml:space="preserve">The workflow executes through four sequential stages, each handling specific aspects of chemical information extraction (Figure 1).</w:t>
+          <w:t xml:space="preserve">The workflow executes through four sequential stages, each handling specific aspects of chemical information extraction.</w:t>
         </w:r>
       </w:ins>
     </w:p>
@@ -3099,7 +3345,7 @@
         <w:pStyle w:val="50"/>
         <w:jc w:val="both"/>
       </w:pPr>
-      <w:del w:id="5046" w:author="王哲" w:date="2026-08-26T00:00:00Z">
+      <w:del w:id="9095" w:author="王哲" w:date="2026-08-26T00:00:00Z">
         <w:r>
           <w:rPr>
             <w:rFonts w:hint="eastAsia"/>
@@ -3109,7 +3355,7 @@
           <w:delText xml:space="preserve">Figure 1. Schematic overview of the BioChemInsight platform for automated extraction of structure-activity relationship (SAR) information from patent documents. </w:delText>
         </w:r>
       </w:del>
-      <w:del w:id="5047" w:author="王哲" w:date="2026-08-26T00:00:00Z">
+      <w:del w:id="9096" w:author="王哲" w:date="2026-08-26T00:00:00Z">
         <w:r>
           <w:rPr>
             <w:rFonts w:hint="eastAsia"/>
@@ -3117,7 +3363,7 @@
           <w:delText>The platform consists of two core processing sections. Section 1 outlines the workflow for chemical structure extraction and compound identifier recognition, culminating in the mapping of structures to their corresponding identifiers. Section 2 depicts the pipeline for bioactivity data extraction and processing, including OCR-based text conversion, parsing via the GLM-4.5V vision-language model, and integration into structured tables. The final output combines chemical structures with associated bioactivity data to generate a comprehensive SAR dataset.</w:delText>
         </w:r>
       </w:del>
-      <w:ins w:id="5048" w:author="王哲" w:date="2026-08-26T00:00:00Z">
+      <w:ins w:id="9097" w:author="王哲" w:date="2026-08-26T00:00:00Z">
         <w:r>
           <w:rPr>
             <w:rFonts w:hint="eastAsia"/>
@@ -3171,7 +3417,7 @@
           <w:szCs w:val="24"/>
         </w:rPr>
       </w:pPr>
-      <w:del w:id="5049" w:author="王哲" w:date="2026-08-26T00:00:00Z">
+      <w:del w:id="9098" w:author="王哲" w:date="2026-08-26T00:00:00Z">
         <w:r>
           <w:rPr>
             <w:rFonts w:eastAsia="宋体" w:cs="Times New Roman"/>
@@ -3181,7 +3427,7 @@
           <w:delText>Input PDFs are converted into 300 DPI PNG images per page using PyMuPDF (v1.24.10), ensuring resolution adequacy for structure detection. This step normalizes document formats and handles potential PDF rendering inconsistencies across operating systems.</w:delText>
         </w:r>
       </w:del>
-      <w:ins w:id="5050" w:author="王哲" w:date="2026-08-26T00:00:00Z">
+      <w:ins w:id="9099" w:author="王哲" w:date="2026-08-26T00:00:00Z">
         <w:r>
           <w:rPr>
             <w:rFonts w:eastAsia="宋体" w:cs="Times New Roman"/>
@@ -3227,7 +3473,7 @@
       <w:bookmarkStart w:id="26" w:name="OLE_LINK38"/>
       <w:bookmarkStart w:id="27" w:name="OLE_LINK39"/>
       <w:bookmarkStart w:id="28" w:name="OLE_LINK40"/>
-      <w:del w:id="5051" w:author="王哲" w:date="2026-08-26T00:00:00Z">
+      <w:del w:id="9100" w:author="王哲" w:date="2026-08-26T00:00:00Z">
         <w:r>
           <w:rPr>
             <w:rFonts w:eastAsia="宋体" w:cs="Times New Roman"/>
@@ -3240,7 +3486,7 @@
       <w:bookmarkEnd w:id="26"/>
       <w:bookmarkEnd w:id="27"/>
       <w:bookmarkEnd w:id="28"/>
-      <w:del w:id="5052" w:author="王哲" w:date="2026-08-26T00:00:00Z">
+      <w:del w:id="9101" w:author="王哲" w:date="2026-08-26T00:00:00Z">
         <w:r>
           <w:rPr>
             <w:rFonts w:eastAsia="宋体" w:cs="Times New Roman"/>
@@ -3250,7 +3496,7 @@
           <w:delText xml:space="preserve"> are identified through DECIMER Segmentation's Mask R-CNN, which detects and crops them with 99% bounding box accuracy, while correctly excluding nearly 100% of non-chemical images</w:delText>
         </w:r>
       </w:del>
-      <w:del w:id="5053" w:author="王哲" w:date="2026-08-26T00:00:00Z">
+      <w:del w:id="9102" w:author="王哲" w:date="2026-08-26T00:00:00Z">
         <w:r>
           <w:rPr>
             <w:rFonts w:eastAsia="宋体" w:cs="Times New Roman"/>
@@ -3259,7 +3505,7 @@
           <w:fldChar w:fldCharType="begin"/>
         </w:r>
       </w:del>
-      <w:del w:id="5054" w:author="王哲" w:date="2026-08-26T00:00:00Z">
+      <w:del w:id="9103" w:author="王哲" w:date="2026-08-26T00:00:00Z">
         <w:r>
           <w:rPr>
             <w:rFonts w:eastAsia="宋体" w:cs="Times New Roman"/>
@@ -3268,7 +3514,7 @@
           <w:instrText xml:space="preserve"> ADDIN ZOTERO_ITEM CSL_CITATION {"citationID":"y04sMcGK","properties":{"formattedCitation":"\\super 3\\nosupersub{}","plainCitation":"3","noteIndex":0},"citationItems":[{"id":38738,"uris":["http://zotero.org/users/10054398/items/ULBARJ3C"],"itemData":{"id":38738,"type":"article-journal","abstract":"The number of publications describing chemical structures has increased steadily over the last decades. However, the majority of published chemical information is currently not available in machine-readable form in public databases. It remains a challenge to automate the process of information extraction in a way that requires less manual intervention - especially the mining of chemical structure depictions. As an open-source platform that leverages recent advancements in deep learning, computer vision, and natural language processing, DECIMER.ai (Deep lEarning for Chemical IMagE Recognition) strives to automatically segment, classify, and translate chemical structure depictions from the printed literature. The segmentation and classification tools are the only openly available packages of their kind, and the optical chemical structure recognition (OCSR) core application yields outstanding performance on all benchmark datasets. The source code, the trained models and the datasets developed in this work have been published under permissive licences. An instance of the DECIMER web application is available at https://decimer.ai.","container-title":"Nature Communications","DOI":"10.1038/s41467-023-40782-0","ISSN":"2041-1723","issue":"1","journalAbbreviation":"Nat Commun","language":"en","license":"2023 The Author(s)","page":"5045","publisher":"Nature Publishing Group","source":"www.nature.com","title":"DECIMER.ai: an open platform for automated optical chemical structure identification, segmentation and recognition in scientific publications","title-short":"DECIMER.ai","volume":"14","author":[{"family":"Rajan","given":"Kohulan"},{"family":"Brinkhaus","given":"Henning Otto"},{"family":"Agea","given":"M. Isabel"},{"family":"Zielesny","given":"Achim"},{"family":"Steinbeck","given":"Christoph"}],"issued":{"date-parts":[["2023",8,19]]}}}],"schema":"https://github.com/citation-style-language/schema/raw/master/csl-citation.json"} </w:instrText>
         </w:r>
       </w:del>
-      <w:del w:id="5055" w:author="王哲" w:date="2026-08-26T00:00:00Z">
+      <w:del w:id="9104" w:author="王哲" w:date="2026-08-26T00:00:00Z">
         <w:r>
           <w:rPr>
             <w:rFonts w:eastAsia="宋体" w:cs="Times New Roman"/>
@@ -3277,7 +3523,7 @@
           <w:fldChar w:fldCharType="separate"/>
         </w:r>
       </w:del>
-      <w:del w:id="5056" w:author="王哲" w:date="2026-08-26T00:00:00Z">
+      <w:del w:id="9105" w:author="王哲" w:date="2026-08-26T00:00:00Z">
         <w:r>
           <w:rPr>
             <w:rFonts w:cs="Times New Roman"/>
@@ -3288,7 +3534,7 @@
           <w:delText>3</w:delText>
         </w:r>
       </w:del>
-      <w:del w:id="5057" w:author="王哲" w:date="2026-08-26T00:00:00Z">
+      <w:del w:id="9106" w:author="王哲" w:date="2026-08-26T00:00:00Z">
         <w:r>
           <w:rPr>
             <w:rFonts w:eastAsia="宋体" w:cs="Times New Roman"/>
@@ -3297,7 +3543,7 @@
           <w:fldChar w:fldCharType="end"/>
         </w:r>
       </w:del>
-      <w:del w:id="5058" w:author="王哲" w:date="2026-08-26T00:00:00Z">
+      <w:del w:id="9107" w:author="王哲" w:date="2026-08-26T00:00:00Z">
         <w:r>
           <w:rPr>
             <w:rFonts w:eastAsia="宋体" w:cs="Times New Roman"/>
@@ -3307,7 +3553,7 @@
           <w:delText>. The cropped structures are converted into SMILES strings by MolN</w:delText>
         </w:r>
       </w:del>
-      <w:del w:id="5059" w:author="王哲" w:date="2026-08-26T00:00:00Z">
+      <w:del w:id="9108" w:author="王哲" w:date="2026-08-26T00:00:00Z">
         <w:r>
           <w:rPr>
             <w:rFonts w:hint="eastAsia" w:eastAsia="宋体" w:cs="Times New Roman"/>
@@ -3317,7 +3563,7 @@
           <w:delText>ex</w:delText>
         </w:r>
       </w:del>
-      <w:del w:id="5060" w:author="王哲" w:date="2026-08-26T00:00:00Z">
+      <w:del w:id="9109" w:author="王哲" w:date="2026-08-26T00:00:00Z">
         <w:r>
           <w:rPr>
             <w:rFonts w:eastAsia="宋体" w:cs="Times New Roman"/>
@@ -3327,7 +3573,7 @@
           <w:delText>TR</w:delText>
         </w:r>
       </w:del>
-      <w:del w:id="5061" w:author="王哲" w:date="2026-08-26T00:00:00Z">
+      <w:del w:id="9110" w:author="王哲" w:date="2026-08-26T00:00:00Z">
         <w:r>
           <w:rPr>
             <w:rFonts w:eastAsia="宋体" w:cs="Times New Roman"/>
@@ -3337,7 +3583,7 @@
           <w:fldChar w:fldCharType="begin"/>
         </w:r>
       </w:del>
-      <w:del w:id="5062" w:author="王哲" w:date="2026-08-26T00:00:00Z">
+      <w:del w:id="9111" w:author="王哲" w:date="2026-08-26T00:00:00Z">
         <w:r>
           <w:rPr>
             <w:rFonts w:eastAsia="宋体" w:cs="Times New Roman"/>
@@ -3347,7 +3593,7 @@
           <w:instrText xml:space="preserve"> ADDIN ZOTERO_ITEM CSL_CITATION {"citationID":"a10venf4pq1","properties":{"formattedCitation":"\\super 14\\nosupersub{}","plainCitation":"14","noteIndex":0},"citationItems":[{"id":39979,"uris":["http://zotero.org/users/10054398/items/ZHHFNYDP"],"itemData":{"id":39979,"type":"article-journal","abstract":"In the field of chemical structure recognition, the task of converting molecular images into machine-readable data formats such as SMILES string stands as a significant challenge, primarily due to the varied drawing styles and conventions prevalent in chemical literature. To bridge this gap, we proposed MolNexTR, a novel image-to-graph deep learning model that collaborates to fuse the strengths of ConvNext, a powerful Convolutional Neural Network variant, and Vision-TRansformer. This integration facilitates a more detailed extraction of both local and global features from molecular images. MolNexTR can predict atoms and bonds simultaneously and understand their layout rules. It also excels at flexibly integrating symbolic chemistry principles to discern chirality and decipher abbreviated structures. We further incorporate a series of advanced algorithms, including an improved data augmentation module, an image contamination module, and a post-processing module for getting the final SMILES output. These modules cooperate to enhance the model's robustness to diverse styles of molecular images found in real literature. In our test sets, MolNexTR has demonstrated superior performance, achieving an accuracy rate of 81-97%, marking a significant advancement in the domain of molecular structure recognition.Scientific contributionMolNexTR is a novel image-to-graph model that incorporates a unique dual-stream encoder to extract complex molecular image features, and combines chemical rules to predict atoms and bonds while understanding atom and bond layout rules. In addition, it employs a series of novel augmentation algorithms to significantly enhance the robustness and performance of the model.","container-title":"Journal of Cheminformatics","DOI":"10.1186/s13321-024-00926-w","ISSN":"1758-2946","issue":"1","journalAbbreviation":"J Cheminform","language":"eng","page":"141","PMID":"39696616","PMCID":"PMC11654183","source":"PubMed","title":"MolNexTR: a generalized deep learning model for molecular image recognition","title-short":"MolNexTR","volume":"16","author":[{"family":"Chen","given":"Yufan"},{"family":"Leung","given":"Ching Ting"},{"family":"Huang","given":"Yong"},{"family":"Sun","given":"Jianwei"},{"family":"Chen","given":"Hao"},{"family":"Gao","given":"Hanyu"}],"issued":{"date-parts":[["2024",12,18]]}}}],"schema":"https://github.com/citation-style-language/schema/raw/master/csl-citation.json"} </w:instrText>
         </w:r>
       </w:del>
-      <w:del w:id="5063" w:author="王哲" w:date="2026-08-26T00:00:00Z">
+      <w:del w:id="9112" w:author="王哲" w:date="2026-08-26T00:00:00Z">
         <w:r>
           <w:rPr>
             <w:rFonts w:eastAsia="宋体" w:cs="Times New Roman"/>
@@ -3357,7 +3603,7 @@
           <w:fldChar w:fldCharType="separate"/>
         </w:r>
       </w:del>
-      <w:del w:id="5064" w:author="王哲" w:date="2026-08-26T00:00:00Z">
+      <w:del w:id="9113" w:author="王哲" w:date="2026-08-26T00:00:00Z">
         <w:r>
           <w:rPr>
             <w:rFonts w:cs="Times New Roman"/>
@@ -3368,7 +3614,7 @@
           <w:delText>14</w:delText>
         </w:r>
       </w:del>
-      <w:del w:id="5065" w:author="王哲" w:date="2026-08-26T00:00:00Z">
+      <w:del w:id="9114" w:author="王哲" w:date="2026-08-26T00:00:00Z">
         <w:r>
           <w:rPr>
             <w:rFonts w:eastAsia="宋体" w:cs="Times New Roman"/>
@@ -3378,7 +3624,7 @@
           <w:fldChar w:fldCharType="end"/>
         </w:r>
       </w:del>
-      <w:del w:id="5066" w:author="王哲" w:date="2026-08-26T00:00:00Z">
+      <w:del w:id="9115" w:author="王哲" w:date="2026-08-26T00:00:00Z">
         <w:r>
           <w:rPr>
             <w:rFonts w:eastAsia="宋体" w:cs="Times New Roman"/>
@@ -3389,7 +3635,7 @@
         </w:r>
       </w:del>
       <w:ins w:id="5" w:author="王哲" w:date="2026-08-11T13:59:16Z" w16du:dateUtc="2026-08-11T13:59:16Z">
-        <w:del w:id="5067" w:author="王哲" w:date="2026-08-26T00:00:00Z">
+        <w:del w:id="9116" w:author="王哲" w:date="2026-08-26T00:00:00Z">
           <w:r>
             <w:rPr>
               <w:rFonts w:eastAsia="宋体" w:cs="Times New Roman"/>
@@ -3400,14 +3646,14 @@
           </w:r>
         </w:del>
       </w:ins>
-      <w:ins w:id="5068" w:author="王哲" w:date="2026-08-26T00:00:00Z">
+      <w:ins w:id="9117" w:author="王哲" w:date="2026-08-26T00:00:00Z">
         <w:r>
           <w:rPr>
             <w:rFonts w:eastAsia="宋体" w:cs="Times New Roman"/>
             <w:color w:val="000000"/>
             <w:szCs w:val="24"/>
           </w:rPr>
-          <w:t xml:space="preserve">Chemical structure depictions are identified through DECIMER Segmentation's Mask R-CNN, which detects and crops them with 99% bounding-box accuracy while correctly excluding nearly 100% of non-chemical images3. The cropped structures are converted into SMILES strings by MolNexTR,14 extended here with a three-expert mixture-of-experts decoder in which the frozen base network serves as the complete-molecule expert while two trained sidecar experts specialize in Markush scaffolds and substituent fragments; an attention-pooled router blends the experts per depiction, a calibrated confidence head estimates the expected graph-level Tanimoto similarity to the true structure and triggers visual re-verification of low-confidence predictions, and Markush scaffolds carrying detached fragments are assembled into complete molecules through dummy-atom attachment under pose-preserving geometric constraints, with any inconsistency leading to exclusion of the assembly (fail-closed).</w:t>
+          <w:t xml:space="preserve">Chemical structure depictions are detected and cropped by DECIMER Segmentation's Mask R-CNN, whose classification stage correctly identifies approximately 99% of images containing chemical structure depictions while correctly excluding nearly 100% of non-chemical images3. The cropped structures are converted into SMILES strings by MolNexTR,14 extended here with a three-expert mixture-of-experts decoder in which the frozen base network serves as the complete-molecule expert while two trained sidecar experts specialize in Markush scaffolds and substituent fragments; an attention-pooled router blends the experts per depiction, a calibrated confidence head estimates the expected graph-level Tanimoto similarity to the true structure and triggers visual re-verification of low-confidence predictions, and Markush scaffolds carrying detached fragments are assembled into complete molecules through dummy-atom attachment under pose-preserving geometric constraints, with any inconsistency leading to exclusion of the assembly (fail-closed).</w:t>
         </w:r>
       </w:ins>
     </w:p>
@@ -3490,7 +3736,7 @@
           <w:szCs w:val="24"/>
         </w:rPr>
       </w:pPr>
-      <w:del w:id="5069" w:author="王哲" w:date="2026-08-26T00:00:00Z">
+      <w:del w:id="9118" w:author="王哲" w:date="2026-08-26T00:00:00Z">
         <w:r>
           <w:rPr>
             <w:rFonts w:hint="eastAsia"/>
@@ -3498,7 +3744,7 @@
           <w:delText>GLM-4.5V</w:delText>
         </w:r>
       </w:del>
-      <w:del w:id="5070" w:author="王哲" w:date="2026-08-26T00:00:00Z">
+      <w:del w:id="9119" w:author="王哲" w:date="2026-08-26T00:00:00Z">
         <w:r>
           <w:rPr>
             <w:rFonts w:eastAsia="宋体" w:cs="Times New Roman"/>
@@ -3508,7 +3754,7 @@
           <w:delText xml:space="preserve"> extracts raw compound labels (e.g., "Ex.1") from DECIMER-annotated red regions through spatial correlation. GLM-4.6 then standardizes these identifiers into consistent nomenclature (e.g., "Compound 1") using regular expression matching and synonym resolution. Finally, the system cross-validates identifiers against page coordinates and filename metadata to ensure precise matching between standardized IDs and their corresponding SMILES strings.</w:delText>
         </w:r>
       </w:del>
-      <w:ins w:id="5071" w:author="王哲" w:date="2026-08-26T00:00:00Z">
+      <w:ins w:id="9120" w:author="王哲" w:date="2026-08-26T00:00:00Z">
         <w:r>
           <w:rPr>
             <w:rFonts w:hint="eastAsia"/>
@@ -3550,7 +3796,7 @@
           <w:szCs w:val="24"/>
         </w:rPr>
       </w:pPr>
-      <w:del w:id="5072" w:author="王哲" w:date="2026-08-26T00:00:00Z">
+      <w:del w:id="9121" w:author="王哲" w:date="2026-08-26T00:00:00Z">
         <w:r>
           <w:rPr>
             <w:rFonts w:eastAsia="宋体" w:cs="Times New Roman"/>
@@ -3561,7 +3807,7 @@
         </w:r>
       </w:del>
       <w:bookmarkEnd w:id="29"/>
-      <w:del w:id="5073" w:author="王哲" w:date="2026-08-26T00:00:00Z">
+      <w:del w:id="9122" w:author="王哲" w:date="2026-08-26T00:00:00Z">
         <w:r>
           <w:rPr>
             <w:rFonts w:eastAsia="宋体" w:cs="Times New Roman"/>
@@ -3571,12 +3817,12 @@
           <w:delText>. Gemini-2.0-flash is then applied to extract bioactivity metrics (IC₅₀/EC₅₀/Ki) from both tabular data and contextual mentions (e.g., ‘IC₅₀ = 12.5 µM for Compound 5’).</w:delText>
         </w:r>
       </w:del>
-      <w:del w:id="5074" w:author="王哲" w:date="2026-08-26T00:00:00Z">
+      <w:del w:id="9123" w:author="王哲" w:date="2026-08-26T00:00:00Z">
         <w:r>
           <w:delText xml:space="preserve"> </w:delText>
         </w:r>
       </w:del>
-      <w:del w:id="5075" w:author="王哲" w:date="2026-08-26T00:00:00Z">
+      <w:del w:id="9124" w:author="王哲" w:date="2026-08-26T00:00:00Z">
         <w:r>
           <w:rPr>
             <w:rFonts w:eastAsia="宋体" w:cs="Times New Roman"/>
@@ -3586,14 +3832,14 @@
           <w:delText>The system implements pattern matching for value extraction and contextual analysis for unit normalization (nM/μM resolution), ensuring standardized output of both textual content and quantitative bioactivity data.</w:delText>
         </w:r>
       </w:del>
-      <w:ins w:id="5076" w:author="王哲" w:date="2026-08-26T00:00:00Z">
+      <w:ins w:id="9125" w:author="王哲" w:date="2026-08-26T00:00:00Z">
         <w:r>
           <w:rPr>
             <w:rFonts w:eastAsia="宋体" w:cs="Times New Roman"/>
             <w:color w:val="000000"/>
             <w:szCs w:val="24"/>
           </w:rPr>
-          <w:t xml:space="preserve">PaddleOCR, deployed as a containerized microservice, converts a separate render of the page images (1.3× native resolution, matching the OCR model's training distribution) into structured Markdown. An OpenAI-compatible large language model is then applied to extract bioactivity metrics (IC₅₀/EC₅₀/Ki) from both tabular data and contextual mentions (e.g., ‘IC₅₀ = 12.5 µM for Compound 5’). Each extraction passes through three independent verification stages—compound-identifier assignment, assay membership, and value validation—so that only experimentally measured values are retained; quantities produced by computational procedures such as docking scores or in-silico ADMET predictions are explicitly rejected. Pattern matching with contextual unit normalization (nM/µM resolution) ensures standardized output, and every accepted value retains page-level provenance for traceability.</w:t>
+          <w:t xml:space="preserve">PaddleOCR, deployed as a containerized microservice, converts a separate render of the page images (1.3× native resolution) into structured Markdown. An OpenAI-compatible large language model is then applied to extract bioactivity metrics (IC₅₀/EC₅₀/Ki) from both tabular data and contextual mentions (e.g., ‘IC₅₀ = 12.5 µM for Compound 5’). Each extraction passes through three independent verification stages—compound-identifier assignment, assay membership, and value validation—so that only experimentally measured values are retained; quantities produced by computational procedures such as docking scores or in-silico ADMET predictions are explicitly rejected. Pattern matching with contextual unit normalization (nM/µM resolution) ensures standardized output, and every accepted value retains page-level provenance metadata for traceability.</w:t>
         </w:r>
       </w:ins>
     </w:p>
@@ -3629,7 +3875,7 @@
           <w:szCs w:val="24"/>
         </w:rPr>
       </w:pPr>
-      <w:del w:id="5077" w:author="王哲" w:date="2026-08-26T00:00:00Z">
+      <w:del w:id="9126" w:author="王哲" w:date="2026-08-26T00:00:00Z">
         <w:r>
           <w:rPr>
             <w:rFonts w:eastAsia="宋体" w:cs="Times New Roman"/>
@@ -3639,7 +3885,7 @@
           <w:delText>The data integration phase directly matches SMILES strings with standardized compound identifiers and pairs them with raw bioactivity values to generate a structured matrix without post-processing. The final output combines SMILES, normalized IDs, bioactivity measurements (IC₅₀/EC₅₀/Ki), and source metadata (page numbers/images), exported in CSV/JSON formats for batch processing across document collections.</w:delText>
         </w:r>
       </w:del>
-      <w:ins w:id="5078" w:author="王哲" w:date="2026-08-26T00:00:00Z">
+      <w:ins w:id="9127" w:author="王哲" w:date="2026-08-26T00:00:00Z">
         <w:r>
           <w:rPr>
             <w:rFonts w:eastAsia="宋体" w:cs="Times New Roman"/>
@@ -3688,7 +3934,7 @@
       <w:bookmarkStart w:id="30" w:name="OLE_LINK15"/>
       <w:bookmarkStart w:id="31" w:name="OLE_LINK8"/>
       <w:bookmarkStart w:id="32" w:name="OLE_LINK9"/>
-      <w:del w:id="5079" w:author="王哲" w:date="2026-08-26T00:00:00Z">
+      <w:del w:id="9128" w:author="王哲" w:date="2026-08-26T00:00:00Z">
         <w:r>
           <w:rPr>
             <w:rFonts w:hint="eastAsia" w:eastAsia="宋体" w:cs="Times New Roman"/>
@@ -3698,7 +3944,7 @@
           <w:delText>We compiled a specialized dataset comprising 181 patents associated with 15 therapeutic targets, selected from the Cortellis Drug Discovery Intelligence database based on inclusion criteria (e.g., ≥20 chemical depictions, small-molecule claims). Using BioC</w:delText>
         </w:r>
       </w:del>
-      <w:del w:id="5080" w:author="王哲" w:date="2026-08-26T00:00:00Z">
+      <w:del w:id="9129" w:author="王哲" w:date="2026-08-26T00:00:00Z">
         <w:r>
           <w:rPr>
             <w:rFonts w:eastAsia="宋体" w:cs="Times New Roman"/>
@@ -3708,14 +3954,14 @@
           <w:delText>hemInsight, we systematically extracted compound identifiers, SMILES strings, and biological activity values (including IC₅₀, EC₅₀, and Ki). All extracted activity values were then normalized to the nanomolar (nM) scale and underwent 100% manual validation by two independent medicinal chemists to ensure data accuracy.</w:delText>
         </w:r>
       </w:del>
-      <w:ins w:id="5081" w:author="王哲" w:date="2026-08-26T00:00:00Z">
+      <w:ins w:id="9130" w:author="王哲" w:date="2026-08-26T00:00:00Z">
         <w:r>
           <w:rPr>
             <w:rFonts w:hint="eastAsia" w:eastAsia="宋体" w:cs="Times New Roman"/>
             <w:color w:val="000000"/>
             <w:szCs w:val="24"/>
           </w:rPr>
-          <w:t xml:space="preserve">We compiled a specialized dataset comprising 296 patents associated with 15 therapeutic targets, selected from the Cortellis Drug Discovery Intelligence database based on inclusion criteria (e.g., ≥20 chemical depictions, small-molecule claims). Using BioChemInsight, we systematically extracted compound identifiers, SMILES strings, and biological activity values (including IC₅₀, EC₅₀, and Ki), yielding 23,218 structure records and 7,110 bioactivity values. All extracted activity values were normalized to a consistent unit convention (nM/µM). Extraction quality was assessed through a tiered verification protocol: (i) independent recomputation of corpus statistics (SMILES validity, identifier coverage) outside the pipeline using RDKit (v2026.03.3); (ii) automated visual cross-checking of source-versus-extraction comparison sheets for 282 of the 296 patents; and (iii) expert human review of 507 compound-level extractions presented as side-by-side comparisons of the original patent segment crop and the decoded molecule. Picks were drawn by stratified random sampling across per-patent SMILES-validity tiers (highest-quality tier n = 87; good n = 305; mid n = 88; lowest-quality tier n = 25; 2 picks were not adjudicated), and the confirmed correctness of 499/505 carries a Wilson 95% confidence interval of 97.4–99.5%. The complete adjudication set and per-target statistics are provided in the Electronic Supplementary Information (ESI).</w:t>
+          <w:t xml:space="preserve">We compiled a specialized dataset comprising 296 patents associated with 15 therapeutic targets, selected from the Cortellis Drug Discovery Intelligence database based on inclusion criteria (e.g., ≥20 chemical depictions, small-molecule claims). Using BioChemInsight, we systematically extracted compound identifiers, SMILES strings, and biological activity values (including IC₅₀, EC₅₀, and Ki), yielding 23,218 structure records and 7,110 bioactivity values. All extracted activity values were normalized to a consistent unit convention (nM/µM). Extraction quality was assessed through a tiered verification protocol: (i) independent recomputation of corpus statistics (SMILES validity, identifier coverage) outside the pipeline using RDKit (v2026.03.3); (ii) automated visual cross-checking of source-versus-extraction comparison sheets for 282 of the 296 patents (the 14 without sheets include the 3 text-only patents and documents whose machine sheets were superseded by compound-level review); this automated pass served as triage whose verdicts were confirmed or overturned by stage (iii); and (iii) expert human review of 507 compound-level extractions presented as side-by-side comparisons of the original patent segment crop and the decoded molecule. Picks were drawn by stratified random sampling across per-patent SMILES-validity tiers (highest n = 87; high n = 305; mid n = 88; lowest n = 25; 2 picks were left unadjudicated as reviewer omissions), and the confirmed correctness of 499/505 carries a Wilson 95% confidence interval of 97.4–99.5%. The complete adjudication set and per-target statistics are provided in the Electronic Supplementary Information (ESI).</w:t>
         </w:r>
       </w:ins>
     </w:p>
@@ -3749,74 +3995,17 @@
       <w:pPr>
         <w:ind w:firstLine="480"/>
       </w:pPr>
-      <w:del w:id="5082" w:author="王哲" w:date="2026-08-26T00:00:00Z">
+      <w:del w:id="9131" w:author="王哲" w:date="2026-08-26T00:00:00Z">
         <w:r>
           <w:delText>The final matrix integrates SMILES, standardized IDs, and bioactivity values (IC₅₀/EC₅₀/Ki), with fields for page numbers and source images. Outputs are exported as CSV/JSON for downstream analysis, supporting batch processing across document repositories. Data preprocessing and statistical analysis were implemented in Python 3.10 using pandas (v1.4.2). Results were visualized via matplotlib (v3.10.0) and seaborn (v0.13.2).</w:delText>
         </w:r>
       </w:del>
-      <w:ins w:id="5083" w:author="王哲" w:date="2026-08-26T00:00:00Z">
+      <w:ins w:id="9132" w:author="王哲" w:date="2026-08-26T00:00:00Z">
         <w:r>
           <w:t xml:space="preserve">The final matrix integrates SMILES, standardized IDs, and bioactivity values (IC₅₀/EC₅₀/Ki), exported as CSV/JSON for downstream analysis and supporting batch processing across document repositories. Data preprocessing and statistical analysis were implemented in Python 3.12 using pandas (v2.2.2); results were visualized via matplotlib (v3.9.2).</w:t>
         </w:r>
       </w:ins>
     </w:p>
-    <w:p>
-      <w:pPr>
-        <w:ind w:firstLine="480"/>
-      </w:pPr>
-      <w:bookmarkStart w:id="37" w:name="OLE_LINK29"/>
-      <w:bookmarkStart w:id="38" w:name="OLE_LINK28"/>
-      <w:del w:id="5098" w:author="王哲" w:date="2026-08-26T00:00:00Z">
-        <w:r>
-          <w:delText>BioChemInsight represents a significant advancement in automated literature mining for early-stage drug discovery. It provides a unified, open-source pipeline that integrates state-of-the-art models for optical chemical structure recognition, compound identifier association, and bioactivity extraction with unit normalization, effectively converting unstructured patent documents into machine-readable SAR datasets.​</w:delText>
-        </w:r>
-      </w:del>
-      <w:ins w:id="10" w:author="王哲" w:date="2026-08-11T13:59:16Z" w16du:dateUtc="2026-08-11T13:59:16Z">
-        <w:del w:id="5099" w:author="王哲" w:date="2026-08-26T00:00:00Z">
-          <w:r>
-            <w:rPr>
-              <w:rFonts w:eastAsia="宋体" w:cs="Times New Roman"/>
-              <w:color w:val="000000"/>
-              <w:szCs w:val="24"/>
-            </w:rPr>
-            <w:delText xml:space="preserve"> In particular, a Mixture-of-Experts extension of the structure recognizer and a dedicated Markush scaffold and fragment assembly module extend coverage to the variable substituent chemistry that dominates patent claims.</w:delText>
-          </w:r>
-        </w:del>
-      </w:ins>
-      <w:del w:id="5100" w:author="王哲" w:date="2026-08-26T00:00:00Z">
-        <w:r>
-          <w:rPr>
-            <w:rFonts w:hint="eastAsia"/>
-          </w:rPr>
-          <w:delText xml:space="preserve"> </w:delText>
-        </w:r>
-      </w:del>
-      <w:del w:id="5101" w:author="王哲" w:date="2026-08-26T00:00:00Z">
-        <w:r>
-          <w:delText>Our systematic evaluation on 181 patents across 15 therapeutic targets demonstrates the pipeline’s robust performance, achieving an average extraction accuracy of 90% for structure, bioactivity, and identifier recognition. Crucially, analysis indicates that the chemical information extracted from patents occupies a space largely complementary to that of established public repositorie ChEMBL. Consequently, BioChemInsight unlocks access to previously underrepresented chemical and bioactivity data, thereby expanding the landscape of explorable compound-target interactions and enriching the foundation for quantitative modeling and targeted screening.</w:delText>
-        </w:r>
-      </w:del>
-      <w:del w:id="5102" w:author="王哲" w:date="2026-08-26T00:00:00Z">
-        <w:r>
-          <w:rPr>
-            <w:rFonts w:hint="eastAsia"/>
-          </w:rPr>
-          <w:delText xml:space="preserve"> </w:delText>
-        </w:r>
-      </w:del>
-      <w:del w:id="5103" w:author="王哲" w:date="2026-08-26T00:00:00Z">
-        <w:r>
-          <w:delText>By reducing data preprocessing time from weeks to hours and requiring minimal user intervention, BioChemInsight is well-suited for high-throughput applications, including automated SAR dataset construction, knowledge graph expansion, and data-driven hit identification. The pipeline is publicly available at https://github.com/dahuilangda/BioChemInsightto support reproducible, scalable chemical data mining.</w:delText>
-        </w:r>
-      </w:del>
-      <w:ins w:id="5104" w:author="王哲" w:date="2026-08-26T00:00:00Z">
-        <w:r>
-          <w:t xml:space="preserve">BioChemInsight provides a unified, open-source pipeline that integrates recent models for optical chemical structure recognition—extended with mixture-of-experts decoding for Markush and fragment chemistries—compound identifier association, and bioactivity extraction with unit normalization, effectively converting unstructured patent documents into machine-readable SAR datasets. Our systematic evaluation on 296 patents across 15 therapeutic targets demonstrates robust performance: 87.3% of 23,218 extracted structure records yielded valid SMILES with complete identifier coverage, and expert human adjudication of 505 compound-level extractions against original patent segments confirmed 98.8% structural correctness, with errors concentrated in a small, quality-predictable subset of documents. Analysis of the extracted data further indicates that the chemical information from patents occupies a space largely complementary to that of the established public repository ChEMBL. BioChemInsight thereby unlocks access to previously underrepresented chemical and bioactivity data, expanding the landscape of explorable compound–target interactions and enriching the foundation for quantitative modelling and targeted screening. Requiring guided, page-level human curation limited to page selection and final review, the platform is well-suited for high-throughput applications, including automated SAR dataset construction, knowledge graph expansion, and data-driven hit identification. The pipeline is publicly available at https://github.com/dahuilangda/BioChemInsight to support reproducible, scalable chemical data mining.</w:t>
-        </w:r>
-      </w:ins>
-    </w:p>
-    <w:bookmarkEnd w:id="37"/>
-    <w:bookmarkEnd w:id="38"/>
     <w:p>
       <w:pPr>
         <w:spacing w:line="480" w:lineRule="auto"/>
@@ -3851,7 +4040,7 @@
           <w:lang w:bidi="ar"/>
         </w:rPr>
       </w:pPr>
-      <w:del w:id="5105" w:author="王哲" w:date="2026-08-26T00:00:00Z">
+      <w:del w:id="9186" w:author="王哲" w:date="2026-08-26T00:00:00Z">
         <w:r>
           <w:rPr>
             <w:rFonts w:cs="Times New Roman"/>
@@ -3859,7 +4048,7 @@
           <w:delText xml:space="preserve">The </w:delText>
         </w:r>
       </w:del>
-      <w:del w:id="5106" w:author="王哲" w:date="2026-08-26T00:00:00Z">
+      <w:del w:id="9187" w:author="王哲" w:date="2026-08-26T00:00:00Z">
         <w:r>
           <w:rPr>
             <w:rFonts w:eastAsia="宋体" w:cs="Times New Roman"/>
@@ -3869,22 +4058,22 @@
           <w:delText>source code for BioChemInsight implementation and data analysis are available in Github (</w:delText>
         </w:r>
       </w:del>
-      <w:del w:id="5107" w:author="王哲" w:date="2026-08-26T00:00:00Z">
+      <w:del w:id="9188" w:author="王哲" w:date="2026-08-26T00:00:00Z">
         <w:r>
           <w:fldChar w:fldCharType="begin"/>
         </w:r>
       </w:del>
-      <w:del w:id="5108" w:author="王哲" w:date="2026-08-26T00:00:00Z">
+      <w:del w:id="9189" w:author="王哲" w:date="2026-08-26T00:00:00Z">
         <w:r>
           <w:instrText xml:space="preserve"> HYPERLINK "https://github.com/dahuilangda/BioChemInsight" </w:instrText>
         </w:r>
       </w:del>
-      <w:del w:id="5109" w:author="王哲" w:date="2026-08-26T00:00:00Z">
+      <w:del w:id="9190" w:author="王哲" w:date="2026-08-26T00:00:00Z">
         <w:r>
           <w:fldChar w:fldCharType="separate"/>
         </w:r>
       </w:del>
-      <w:del w:id="5110" w:author="王哲" w:date="2026-08-26T00:00:00Z">
+      <w:del w:id="9191" w:author="王哲" w:date="2026-08-26T00:00:00Z">
         <w:r>
           <w:rPr>
             <w:rStyle w:val="14"/>
@@ -3894,7 +4083,7 @@
           <w:delText>https://github.com/dahuilangda/BioChemInsight</w:delText>
         </w:r>
       </w:del>
-      <w:del w:id="5111" w:author="王哲" w:date="2026-08-26T00:00:00Z">
+      <w:del w:id="9192" w:author="王哲" w:date="2026-08-26T00:00:00Z">
         <w:r>
           <w:rPr>
             <w:rStyle w:val="14"/>
@@ -3904,7 +4093,7 @@
           <w:fldChar w:fldCharType="end"/>
         </w:r>
       </w:del>
-      <w:del w:id="5112" w:author="王哲" w:date="2026-08-26T00:00:00Z">
+      <w:del w:id="9193" w:author="王哲" w:date="2026-08-26T00:00:00Z">
         <w:r>
           <w:rPr>
             <w:rFonts w:eastAsia="宋体" w:cs="Times New Roman"/>
@@ -3914,7 +4103,7 @@
           <w:delText>).</w:delText>
         </w:r>
       </w:del>
-      <w:del w:id="5113" w:author="王哲" w:date="2026-08-26T00:00:00Z">
+      <w:del w:id="9194" w:author="王哲" w:date="2026-08-26T00:00:00Z">
         <w:r>
           <w:rPr>
             <w:rFonts w:hint="eastAsia" w:eastAsia="宋体" w:cs="Times New Roman"/>
@@ -3924,7 +4113,7 @@
           <w:delText xml:space="preserve"> </w:delText>
         </w:r>
       </w:del>
-      <w:del w:id="5114" w:author="王哲" w:date="2026-08-26T00:00:00Z">
+      <w:del w:id="9195" w:author="王哲" w:date="2026-08-26T00:00:00Z">
         <w:r>
           <w:rPr>
             <w:rFonts w:eastAsia="宋体" w:cs="Times New Roman"/>
@@ -3934,7 +4123,7 @@
           <w:delText>The Git tag is v1.0.0.</w:delText>
         </w:r>
       </w:del>
-      <w:ins w:id="5115" w:author="王哲" w:date="2026-08-26T00:00:00Z">
+      <w:ins w:id="9196" w:author="王哲" w:date="2026-08-26T00:00:00Z">
         <w:r>
           <w:rPr>
             <w:rFonts w:cs="Times New Roman"/>
@@ -3945,17 +4134,37 @@
     </w:p>
     <w:p>
       <w:pPr>
+        <w:spacing w:line="480" w:lineRule="auto"/>
+        <w:ind w:firstLine="562"/>
+        <w:rPr>
+          <w:rFonts w:eastAsia="宋体" w:cs="Times New Roman"/>
+          <w:b/>
+          <w:bCs/>
+          <w:sz w:val="28"/>
+          <w:szCs w:val="28"/>
+          <w:lang w:bidi="ar"/>
+          <w:ins w:id="9206" w:author="王哲" w:date="2026-08-26T00:00:00Z"/>
+        </w:rPr>
+      </w:pPr>
+      <w:ins w:id="9207" w:author="王哲" w:date="2026-08-26T00:00:00Z">
+        <w:r>
+          <w:t xml:space="preserve">Data availability</w:t>
+        </w:r>
+      </w:ins>
+    </w:p>
+    <w:p>
+      <w:pPr>
         <w:ind w:firstLine="480"/>
         <w:rPr>
           <w:rFonts w:hint="eastAsia" w:eastAsia="宋体" w:cs="Times New Roman"/>
           <w:szCs w:val="24"/>
           <w:lang w:bidi="ar"/>
-          <w:ins w:id="5125" w:author="王哲" w:date="2026-08-26T00:00:00Z"/>
-        </w:rPr>
-      </w:pPr>
-      <w:ins w:id="5126" w:author="王哲" w:date="2026-08-26T00:00:00Z">
-        <w:r>
-          <w:t xml:space="preserve">The 296-patent extraction outputs (23,218 structure records, 7,110 bioactivity values), the complete 507-item human-adjudication set with embedded segment comparisons, and all verification statistics are deposited in the project repository and archived with the code under Git tag v1.0.0; permanent DOI-minted archival (Zenodo) of the identical snapshot accompanies the submission.</w:t>
+          <w:ins w:id="9204" w:author="王哲" w:date="2026-08-26T00:00:00Z"/>
+        </w:rPr>
+      </w:pPr>
+      <w:ins w:id="9205" w:author="王哲" w:date="2026-08-26T00:00:00Z">
+        <w:r>
+          <w:t xml:space="preserve">The 296-patent extraction outputs (23,218 structure records, 7,110 bioactivity values), the complete 507-item adjudication set (505 adjudicated) with embedded segment comparisons, and all verification statistics are deposited in the project repository and archived with the code under Git tag v1.0.0; permanent DOI-minted archival (Zenodo) of the identical snapshot accompanies the submission.</w:t>
         </w:r>
       </w:ins>
     </w:p>
@@ -4126,7 +4335,7 @@
           <w:szCs w:val="24"/>
         </w:rPr>
       </w:pPr>
-      <w:del w:id="5116" w:author="王哲" w:date="2026-08-26T00:00:00Z">
+      <w:del w:id="9197" w:author="王哲" w:date="2026-08-26T00:00:00Z">
         <w:r>
           <w:rPr>
             <w:rFonts w:cs="Times New Roman"/>
@@ -4137,7 +4346,7 @@
           <w:delText>Reference</w:delText>
         </w:r>
       </w:del>
-      <w:ins w:id="5117" w:author="王哲" w:date="2026-08-26T00:00:00Z">
+      <w:ins w:id="9198" w:author="王哲" w:date="2026-08-26T00:00:00Z">
         <w:r>
           <w:rPr>
             <w:rFonts w:cs="Times New Roman"/>
@@ -4249,32 +4458,48 @@
           <w:rFonts w:eastAsia="等线" w:cs="Times New Roman"/>
         </w:rPr>
       </w:pPr>
-      <w:r>
-        <w:rPr>
-          <w:rFonts w:eastAsia="等线" w:cs="Times New Roman"/>
-        </w:rPr>
-        <w:t>(2)</w:t>
-      </w:r>
-      <w:r>
-        <w:rPr>
-          <w:rFonts w:eastAsia="等线" w:cs="Times New Roman"/>
-        </w:rPr>
-        <w:tab/>
-      </w:r>
-      <w:r>
-        <w:rPr>
-          <w:rFonts w:eastAsia="等线" w:cs="Times New Roman"/>
-          <w:i/>
-          <w:iCs/>
-        </w:rPr>
-        <w:t>Unsupervised word embeddings capture latent knowledge from materials science literature | Nature</w:t>
-      </w:r>
-      <w:r>
-        <w:rPr>
-          <w:rFonts w:eastAsia="等线" w:cs="Times New Roman"/>
-        </w:rPr>
-        <w:t>. https://www.nature.com/articles/s41586-019-1335-8 (accessed 2025-04-02).</w:t>
-      </w:r>
+      <w:del w:id="9199" w:author="王哲" w:date="2026-08-26T00:00:00Z">
+        <w:r>
+          <w:rPr>
+            <w:rFonts w:eastAsia="等线" w:cs="Times New Roman"/>
+          </w:rPr>
+          <w:delText>(2)</w:delText>
+        </w:r>
+      </w:del>
+      <w:del w:id="9200" w:author="王哲" w:date="2026-08-26T00:00:00Z">
+        <w:r>
+          <w:rPr>
+            <w:rFonts w:eastAsia="等线" w:cs="Times New Roman"/>
+          </w:rPr>
+          <w:tab/>
+        </w:r>
+      </w:del>
+      <w:del w:id="9201" w:author="王哲" w:date="2026-08-26T00:00:00Z">
+        <w:r>
+          <w:rPr>
+            <w:rFonts w:eastAsia="等线" w:cs="Times New Roman"/>
+            <w:i/>
+            <w:iCs/>
+          </w:rPr>
+          <w:delText>Unsupervised word embeddings capture latent knowledge from materials science literature | Nature</w:delText>
+        </w:r>
+      </w:del>
+      <w:del w:id="9202" w:author="王哲" w:date="2026-08-26T00:00:00Z">
+        <w:r>
+          <w:rPr>
+            <w:rFonts w:eastAsia="等线" w:cs="Times New Roman"/>
+          </w:rPr>
+          <w:delText>. https://www.nature.com/articles/s41586-019-1335-8 (accessed 2025-04-02).</w:delText>
+        </w:r>
+      </w:del>
+      <w:ins w:id="9203" w:author="王哲" w:date="2026-08-26T00:00:00Z">
+        <w:r>
+          <w:rPr>
+            <w:rFonts w:eastAsia="等线" w:cs="Times New Roman"/>
+          </w:rPr>
+          <w:t xml:space="preserve">(2) Tshitoyan, V.; Dagdelen, J.; Weston, L.; Dunn, A.; Rong, Z.; Kononova, O.; Persson, K. A.; Ceder, G. Unsupervised Word Embeddings Capture Latent Knowledge from Materials Science Literature. Nature 2019, 571, 95–98.</w:t>
+        </w:r>
+      </w:ins>
     </w:p>
     <w:p>
       <w:pPr>

</xml_diff>

<commit_message>
docs: per-patent statistics workbook and corpus performance figures
- patent_statistics.xlsx: six sheets (per-patent 296 rows with tier,
  target, verification outcomes; by-target; quality-tier; 505-pick
  human verification; 40-item assay provenance; README)
- Figures 7-9 inserted into the Results section as tracked insertions:
  corpus performance overview (validity distribution, tier-stratified
  verification, error-vs-share), per-target structure/bioactivity
  recovery, and the verification cascade with provenance classification
</commit_message>
<xml_diff>
--- a/paper/Manuscript5_revised.docx
+++ b/paper/Manuscript5_revised.docx
@@ -2537,6 +2537,176 @@
             <w:rFonts w:cs="Times New Roman"/>
           </w:rPr>
           <w:t xml:space="preserve">As shown in Figure 4, BioChemInsight demonstrated robust and consistent performance in extracting SAR data from patents across 15 diverse therapeutic targets (pipeline-reported per-target accuracies; metric definitions in the ESI), achieving high extraction accuracy (&gt;0.8) for chemical structures, biological assay data, and compound identifiers, with most metrics exceeding 0.9 and several biological assays reaching 100% accuracy. Independent recomputation over the complete 296-patent corpus corroborated this picture: 87.3% of all 23,218 extracted structure records yielded valid SMILES, 100% carried compound identifiers, and per-patent SMILES validity averaged 85.7% (median 91.5%; n = 293 patents with at least one structure record, 3 text-only patents excluded). Most importantly, expert human adjudication of 505 compound-level extractions—each compared directly against its original patent segment—confirmed 98.8% of decoded structures as chemically correct (6 errors, 1.2%), with the error rate strongly stratified by document quality (0% in the highest-quality tier versus 12.0% in the lowest). This performance was achieved despite substantial variation in dataset size across targets, and extraction accuracy showed no obvious trend with the number of patents processed, suggesting that performance depends primarily on the inherent characteristics of the patent content (e.g., clarity of structural depictions, uniformity of assay tables) rather than on dataset volume. A provenance spot-check traced 71% (20/28) of sampled numeric activity values to the OCR source text; the 7 untraced values were attributed predominantly to OCR digit corruption (supported by spot-verification of a subset) rather than fabrication. Together, these analyses complement the pipeline-reported per-target metrics with independent recomputation and human-ground-truth adjudication, validating BioChemInsight as an effective and scalable tool for accelerating SAR data curation whose per-record reliability has been quantified against human ground truth rather than self-reported pipeline output.</w:t>
+        </w:r>
+      </w:ins>
+    </w:p>
+    <w:p>
+      <w:pPr>
+        <w:ind w:firstLine="480"/>
+        <w:rPr/>
+      </w:pPr>
+      <w:ins w:id="15001" w:author="王哲" w:date="2026-08-26T00:00:00Z">
+        <w:r>
+          <w:t>Figures 7–9 summarize corpus-level performance across complementary statistical dimensions, including the quality-stratified error profile, per-target recovery, and the verification cascade with bioactivity provenance.</w:t>
+        </w:r>
+      </w:ins>
+    </w:p>
+    <w:p>
+      <w:pPr>
+        <w:pStyle w:val="50"/>
+        <w:jc w:val="both"/>
+      </w:pPr>
+      <w:ins w:id="15002" w:author="王哲" w:date="2026-08-26T00:00:00Z">
+        <w:r>
+          <w:drawing>
+            <wp:inline xmlns:a="http://schemas.openxmlformats.org/drawingml/2006/main" xmlns:pic="http://schemas.openxmlformats.org/drawingml/2006/picture">
+              <wp:extent cx="5669280" cy="1683351"/>
+              <wp:docPr id="10" name="Picture 10"/>
+              <wp:cNvGraphicFramePr>
+                <a:graphicFrameLocks noChangeAspect="1"/>
+              </wp:cNvGraphicFramePr>
+              <a:graphic>
+                <a:graphicData uri="http://schemas.openxmlformats.org/drawingml/2006/picture">
+                  <pic:pic>
+                    <pic:nvPicPr>
+                      <pic:cNvPr id="0" name="fig_performance_overview.png"/>
+                      <pic:cNvPicPr/>
+                    </pic:nvPicPr>
+                    <pic:blipFill>
+                      <a:blip r:embed="rId18"/>
+                      <a:stretch>
+                        <a:fillRect/>
+                      </a:stretch>
+                    </pic:blipFill>
+                    <pic:spPr>
+                      <a:xfrm>
+                        <a:off x="0" y="0"/>
+                        <a:ext cx="5669280" cy="1683351"/>
+                      </a:xfrm>
+                      <a:prstGeom prst="rect"/>
+                    </pic:spPr>
+                  </pic:pic>
+                </a:graphicData>
+              </a:graphic>
+            </wp:inline>
+          </w:drawing>
+        </w:r>
+      </w:ins>
+    </w:p>
+    <w:p>
+      <w:pPr>
+        <w:pStyle w:val="50"/>
+        <w:jc w:val="both"/>
+      </w:pPr>
+      <w:ins w:id="15003" w:author="王哲" w:date="2026-08-26T00:00:00Z">
+        <w:r>
+          <w:t>Figure 7. Corpus-level extraction performance across statistical dimensions. (A) Distribution of per-patent valid-SMILES rates over the 293 patents with at least one structure record (median 91.5%; bin colours indicate quality tiers). (B) Expert human verification of the 505 adjudicated compound-level extractions stratified by tier: 499 confirmed correct (98.8%) with zero errors in the perfect tier and 12.0% in the low tier. (C) Pick-level error rate (bars, left axis) together with each tier's share of corpus structure records (line, right axis), showing that errors concentrate in the hardest documents while the highest-quality tiers carry most of the corpus with no observed error.</w:t>
+        </w:r>
+      </w:ins>
+    </w:p>
+    <w:p>
+      <w:pPr>
+        <w:pStyle w:val="50"/>
+        <w:jc w:val="both"/>
+      </w:pPr>
+      <w:ins w:id="15004" w:author="王哲" w:date="2026-08-26T00:00:00Z">
+        <w:r>
+          <w:drawing>
+            <wp:inline xmlns:a="http://schemas.openxmlformats.org/drawingml/2006/main" xmlns:pic="http://schemas.openxmlformats.org/drawingml/2006/picture">
+              <wp:extent cx="5669280" cy="2232142"/>
+              <wp:docPr id="11" name="Picture 11"/>
+              <wp:cNvGraphicFramePr>
+                <a:graphicFrameLocks noChangeAspect="1"/>
+              </wp:cNvGraphicFramePr>
+              <a:graphic>
+                <a:graphicData uri="http://schemas.openxmlformats.org/drawingml/2006/picture">
+                  <pic:pic>
+                    <pic:nvPicPr>
+                      <pic:cNvPr id="0" name="fig_target_statistics.png"/>
+                      <pic:cNvPicPr/>
+                    </pic:nvPicPr>
+                    <pic:blipFill>
+                      <a:blip r:embed="rId19"/>
+                      <a:stretch>
+                        <a:fillRect/>
+                      </a:stretch>
+                    </pic:blipFill>
+                    <pic:spPr>
+                      <a:xfrm>
+                        <a:off x="0" y="0"/>
+                        <a:ext cx="5669280" cy="2232142"/>
+                      </a:xfrm>
+                      <a:prstGeom prst="rect"/>
+                    </pic:spPr>
+                  </pic:pic>
+                </a:graphicData>
+              </a:graphic>
+            </wp:inline>
+          </w:drawing>
+        </w:r>
+      </w:ins>
+    </w:p>
+    <w:p>
+      <w:pPr>
+        <w:pStyle w:val="50"/>
+        <w:jc w:val="both"/>
+      </w:pPr>
+      <w:ins w:id="15005" w:author="王哲" w:date="2026-08-26T00:00:00Z">
+        <w:r>
+          <w:t>Figure 8. Structures and bioactivity recovery by therapeutic target across the 296-patent corpus. (A) Structure records per target with the valid-SMILES share annotated; (B) recovered bioactivity values per target with patent counts, spanning all 15 therapeutic targets.</w:t>
+        </w:r>
+      </w:ins>
+    </w:p>
+    <w:p>
+      <w:pPr>
+        <w:pStyle w:val="50"/>
+        <w:jc w:val="both"/>
+      </w:pPr>
+      <w:ins w:id="15006" w:author="王哲" w:date="2026-08-26T00:00:00Z">
+        <w:r>
+          <w:drawing>
+            <wp:inline xmlns:a="http://schemas.openxmlformats.org/drawingml/2006/main" xmlns:pic="http://schemas.openxmlformats.org/drawingml/2006/picture">
+              <wp:extent cx="5669280" cy="2074943"/>
+              <wp:docPr id="12" name="Picture 12"/>
+              <wp:cNvGraphicFramePr>
+                <a:graphicFrameLocks noChangeAspect="1"/>
+              </wp:cNvGraphicFramePr>
+              <a:graphic>
+                <a:graphicData uri="http://schemas.openxmlformats.org/drawingml/2006/picture">
+                  <pic:pic>
+                    <pic:nvPicPr>
+                      <pic:cNvPr id="0" name="fig_verification_cascade.png"/>
+                      <pic:cNvPicPr/>
+                    </pic:nvPicPr>
+                    <pic:blipFill>
+                      <a:blip r:embed="rId20"/>
+                      <a:stretch>
+                        <a:fillRect/>
+                      </a:stretch>
+                    </pic:blipFill>
+                    <pic:spPr>
+                      <a:xfrm>
+                        <a:off x="0" y="0"/>
+                        <a:ext cx="5669280" cy="2074943"/>
+                      </a:xfrm>
+                      <a:prstGeom prst="rect"/>
+                    </pic:spPr>
+                  </pic:pic>
+                </a:graphicData>
+              </a:graphic>
+            </wp:inline>
+          </w:drawing>
+        </w:r>
+      </w:ins>
+    </w:p>
+    <w:p>
+      <w:pPr>
+        <w:pStyle w:val="50"/>
+        <w:jc w:val="both"/>
+      </w:pPr>
+      <w:ins w:id="15007" w:author="王哲" w:date="2026-08-26T00:00:00Z">
+        <w:r>
+          <w:t>Figure 9. Verification cascade and bioactivity provenance. (A) From 23,218 extracted structure records through 87.3% valid-SMILES yield and stratified sampling to 499 of 505 adjudicated picks confirmed correct (98.8%; Wilson 95% CI 97.4–99.5%). (B) Provenance classification of the 40 sampled bioactivity values: 20 traced to the OCR source text, 12 symbolic grades, and 7 untraced values attributed predominantly to OCR digit corruption.</w:t>
         </w:r>
       </w:ins>
     </w:p>

</xml_diff>

<commit_message>
docs: move Figures 7-9 after the ChEMBL section (citation order 1-9)
</commit_message>
<xml_diff>
--- a/paper/Manuscript5_revised.docx
+++ b/paper/Manuscript5_revised.docx
@@ -2540,176 +2540,6 @@
         </w:r>
       </w:ins>
     </w:p>
-    <w:p>
-      <w:pPr>
-        <w:ind w:firstLine="480"/>
-        <w:rPr/>
-      </w:pPr>
-      <w:ins w:id="15001" w:author="王哲" w:date="2026-08-26T00:00:00Z">
-        <w:r>
-          <w:t>Figures 7–9 summarize corpus-level performance across complementary statistical dimensions, including the quality-stratified error profile, per-target recovery, and the verification cascade with bioactivity provenance.</w:t>
-        </w:r>
-      </w:ins>
-    </w:p>
-    <w:p>
-      <w:pPr>
-        <w:pStyle w:val="50"/>
-        <w:jc w:val="both"/>
-      </w:pPr>
-      <w:ins w:id="15002" w:author="王哲" w:date="2026-08-26T00:00:00Z">
-        <w:r>
-          <w:drawing>
-            <wp:inline xmlns:a="http://schemas.openxmlformats.org/drawingml/2006/main" xmlns:pic="http://schemas.openxmlformats.org/drawingml/2006/picture">
-              <wp:extent cx="5669280" cy="1683351"/>
-              <wp:docPr id="10" name="Picture 10"/>
-              <wp:cNvGraphicFramePr>
-                <a:graphicFrameLocks noChangeAspect="1"/>
-              </wp:cNvGraphicFramePr>
-              <a:graphic>
-                <a:graphicData uri="http://schemas.openxmlformats.org/drawingml/2006/picture">
-                  <pic:pic>
-                    <pic:nvPicPr>
-                      <pic:cNvPr id="0" name="fig_performance_overview.png"/>
-                      <pic:cNvPicPr/>
-                    </pic:nvPicPr>
-                    <pic:blipFill>
-                      <a:blip r:embed="rId18"/>
-                      <a:stretch>
-                        <a:fillRect/>
-                      </a:stretch>
-                    </pic:blipFill>
-                    <pic:spPr>
-                      <a:xfrm>
-                        <a:off x="0" y="0"/>
-                        <a:ext cx="5669280" cy="1683351"/>
-                      </a:xfrm>
-                      <a:prstGeom prst="rect"/>
-                    </pic:spPr>
-                  </pic:pic>
-                </a:graphicData>
-              </a:graphic>
-            </wp:inline>
-          </w:drawing>
-        </w:r>
-      </w:ins>
-    </w:p>
-    <w:p>
-      <w:pPr>
-        <w:pStyle w:val="50"/>
-        <w:jc w:val="both"/>
-      </w:pPr>
-      <w:ins w:id="15003" w:author="王哲" w:date="2026-08-26T00:00:00Z">
-        <w:r>
-          <w:t>Figure 7. Corpus-level extraction performance across statistical dimensions. (A) Distribution of per-patent valid-SMILES rates over the 293 patents with at least one structure record (median 91.5%; bin colours indicate quality tiers). (B) Expert human verification of the 505 adjudicated compound-level extractions stratified by tier: 499 confirmed correct (98.8%) with zero errors in the perfect tier and 12.0% in the low tier. (C) Pick-level error rate (bars, left axis) together with each tier's share of corpus structure records (line, right axis), showing that errors concentrate in the hardest documents while the highest-quality tiers carry most of the corpus with no observed error.</w:t>
-        </w:r>
-      </w:ins>
-    </w:p>
-    <w:p>
-      <w:pPr>
-        <w:pStyle w:val="50"/>
-        <w:jc w:val="both"/>
-      </w:pPr>
-      <w:ins w:id="15004" w:author="王哲" w:date="2026-08-26T00:00:00Z">
-        <w:r>
-          <w:drawing>
-            <wp:inline xmlns:a="http://schemas.openxmlformats.org/drawingml/2006/main" xmlns:pic="http://schemas.openxmlformats.org/drawingml/2006/picture">
-              <wp:extent cx="5669280" cy="2232142"/>
-              <wp:docPr id="11" name="Picture 11"/>
-              <wp:cNvGraphicFramePr>
-                <a:graphicFrameLocks noChangeAspect="1"/>
-              </wp:cNvGraphicFramePr>
-              <a:graphic>
-                <a:graphicData uri="http://schemas.openxmlformats.org/drawingml/2006/picture">
-                  <pic:pic>
-                    <pic:nvPicPr>
-                      <pic:cNvPr id="0" name="fig_target_statistics.png"/>
-                      <pic:cNvPicPr/>
-                    </pic:nvPicPr>
-                    <pic:blipFill>
-                      <a:blip r:embed="rId19"/>
-                      <a:stretch>
-                        <a:fillRect/>
-                      </a:stretch>
-                    </pic:blipFill>
-                    <pic:spPr>
-                      <a:xfrm>
-                        <a:off x="0" y="0"/>
-                        <a:ext cx="5669280" cy="2232142"/>
-                      </a:xfrm>
-                      <a:prstGeom prst="rect"/>
-                    </pic:spPr>
-                  </pic:pic>
-                </a:graphicData>
-              </a:graphic>
-            </wp:inline>
-          </w:drawing>
-        </w:r>
-      </w:ins>
-    </w:p>
-    <w:p>
-      <w:pPr>
-        <w:pStyle w:val="50"/>
-        <w:jc w:val="both"/>
-      </w:pPr>
-      <w:ins w:id="15005" w:author="王哲" w:date="2026-08-26T00:00:00Z">
-        <w:r>
-          <w:t>Figure 8. Structures and bioactivity recovery by therapeutic target across the 296-patent corpus. (A) Structure records per target with the valid-SMILES share annotated; (B) recovered bioactivity values per target with patent counts, spanning all 15 therapeutic targets.</w:t>
-        </w:r>
-      </w:ins>
-    </w:p>
-    <w:p>
-      <w:pPr>
-        <w:pStyle w:val="50"/>
-        <w:jc w:val="both"/>
-      </w:pPr>
-      <w:ins w:id="15006" w:author="王哲" w:date="2026-08-26T00:00:00Z">
-        <w:r>
-          <w:drawing>
-            <wp:inline xmlns:a="http://schemas.openxmlformats.org/drawingml/2006/main" xmlns:pic="http://schemas.openxmlformats.org/drawingml/2006/picture">
-              <wp:extent cx="5669280" cy="2074943"/>
-              <wp:docPr id="12" name="Picture 12"/>
-              <wp:cNvGraphicFramePr>
-                <a:graphicFrameLocks noChangeAspect="1"/>
-              </wp:cNvGraphicFramePr>
-              <a:graphic>
-                <a:graphicData uri="http://schemas.openxmlformats.org/drawingml/2006/picture">
-                  <pic:pic>
-                    <pic:nvPicPr>
-                      <pic:cNvPr id="0" name="fig_verification_cascade.png"/>
-                      <pic:cNvPicPr/>
-                    </pic:nvPicPr>
-                    <pic:blipFill>
-                      <a:blip r:embed="rId20"/>
-                      <a:stretch>
-                        <a:fillRect/>
-                      </a:stretch>
-                    </pic:blipFill>
-                    <pic:spPr>
-                      <a:xfrm>
-                        <a:off x="0" y="0"/>
-                        <a:ext cx="5669280" cy="2074943"/>
-                      </a:xfrm>
-                      <a:prstGeom prst="rect"/>
-                    </pic:spPr>
-                  </pic:pic>
-                </a:graphicData>
-              </a:graphic>
-            </wp:inline>
-          </w:drawing>
-        </w:r>
-      </w:ins>
-    </w:p>
-    <w:p>
-      <w:pPr>
-        <w:pStyle w:val="50"/>
-        <w:jc w:val="both"/>
-      </w:pPr>
-      <w:ins w:id="15007" w:author="王哲" w:date="2026-08-26T00:00:00Z">
-        <w:r>
-          <w:t>Figure 9. Verification cascade and bioactivity provenance. (A) From 23,218 extracted structure records through 87.3% valid-SMILES yield and stratified sampling to 499 of 505 adjudicated picks confirmed correct (98.8%; Wilson 95% CI 97.4–99.5%). (B) Provenance classification of the 40 sampled bioactivity values: 20 traced to the OCR source text, 12 symbolic grades, and 7 untraced values attributed predominantly to OCR digit corruption.</w:t>
-        </w:r>
-      </w:ins>
-    </w:p>
     <w:bookmarkEnd w:id="34"/>
     <w:bookmarkEnd w:id="35"/>
     <w:p>
@@ -3099,6 +2929,176 @@
         </w:rPr>
         <w:t xml:space="preserve"> patents and ChEMBL cover complementary regions of chemical space. This underscores the value of systematic patent mining in early-stage drug discovery: BioChemInsight facilitates access to chemical information underrepresented in established public databases. By doing so, it expands the landscape of explorable compound-target interactions and enriches the data foundation for subsequent quantitative structure-activity relationship (QSAR) modeling and targeted screening efforts.</w:t>
       </w:r>
+    </w:p>
+    <w:p>
+      <w:pPr>
+        <w:ind w:firstLine="480"/>
+        <w:rPr/>
+      </w:pPr>
+      <w:ins w:id="15001" w:author="王哲" w:date="2026-08-26T00:00:00Z">
+        <w:r>
+          <w:t>Figures 7–9 summarize corpus-level performance across complementary statistical dimensions, including the quality-stratified error profile, per-target recovery, and the verification cascade with bioactivity provenance.</w:t>
+        </w:r>
+      </w:ins>
+    </w:p>
+    <w:p>
+      <w:pPr>
+        <w:pStyle w:val="50"/>
+        <w:jc w:val="both"/>
+      </w:pPr>
+      <w:ins w:id="15002" w:author="王哲" w:date="2026-08-26T00:00:00Z">
+        <w:r>
+          <w:drawing>
+            <wp:inline xmlns:a="http://schemas.openxmlformats.org/drawingml/2006/main" xmlns:pic="http://schemas.openxmlformats.org/drawingml/2006/picture">
+              <wp:extent cx="5669280" cy="1683351"/>
+              <wp:docPr id="10" name="Picture 10"/>
+              <wp:cNvGraphicFramePr>
+                <a:graphicFrameLocks noChangeAspect="1"/>
+              </wp:cNvGraphicFramePr>
+              <a:graphic>
+                <a:graphicData uri="http://schemas.openxmlformats.org/drawingml/2006/picture">
+                  <pic:pic>
+                    <pic:nvPicPr>
+                      <pic:cNvPr id="0" name="fig_performance_overview.png"/>
+                      <pic:cNvPicPr/>
+                    </pic:nvPicPr>
+                    <pic:blipFill>
+                      <a:blip r:embed="rId18"/>
+                      <a:stretch>
+                        <a:fillRect/>
+                      </a:stretch>
+                    </pic:blipFill>
+                    <pic:spPr>
+                      <a:xfrm>
+                        <a:off x="0" y="0"/>
+                        <a:ext cx="5669280" cy="1683351"/>
+                      </a:xfrm>
+                      <a:prstGeom prst="rect"/>
+                    </pic:spPr>
+                  </pic:pic>
+                </a:graphicData>
+              </a:graphic>
+            </wp:inline>
+          </w:drawing>
+        </w:r>
+      </w:ins>
+    </w:p>
+    <w:p>
+      <w:pPr>
+        <w:pStyle w:val="50"/>
+        <w:jc w:val="both"/>
+      </w:pPr>
+      <w:ins w:id="15003" w:author="王哲" w:date="2026-08-26T00:00:00Z">
+        <w:r>
+          <w:t>Figure 7. Corpus-level extraction performance across statistical dimensions. (A) Distribution of per-patent valid-SMILES rates over the 293 patents with at least one structure record (median 91.5%; bin colours indicate quality tiers). (B) Expert human verification of the 505 adjudicated compound-level extractions stratified by tier: 499 confirmed correct (98.8%) with zero errors in the perfect tier and 12.0% in the low tier. (C) Pick-level error rate (bars, left axis) together with each tier's share of corpus structure records (line, right axis), showing that errors concentrate in the hardest documents while the highest-quality tiers carry most of the corpus with no observed error.</w:t>
+        </w:r>
+      </w:ins>
+    </w:p>
+    <w:p>
+      <w:pPr>
+        <w:pStyle w:val="50"/>
+        <w:jc w:val="both"/>
+      </w:pPr>
+      <w:ins w:id="15004" w:author="王哲" w:date="2026-08-26T00:00:00Z">
+        <w:r>
+          <w:drawing>
+            <wp:inline xmlns:a="http://schemas.openxmlformats.org/drawingml/2006/main" xmlns:pic="http://schemas.openxmlformats.org/drawingml/2006/picture">
+              <wp:extent cx="5669280" cy="2232142"/>
+              <wp:docPr id="11" name="Picture 11"/>
+              <wp:cNvGraphicFramePr>
+                <a:graphicFrameLocks noChangeAspect="1"/>
+              </wp:cNvGraphicFramePr>
+              <a:graphic>
+                <a:graphicData uri="http://schemas.openxmlformats.org/drawingml/2006/picture">
+                  <pic:pic>
+                    <pic:nvPicPr>
+                      <pic:cNvPr id="0" name="fig_target_statistics.png"/>
+                      <pic:cNvPicPr/>
+                    </pic:nvPicPr>
+                    <pic:blipFill>
+                      <a:blip r:embed="rId19"/>
+                      <a:stretch>
+                        <a:fillRect/>
+                      </a:stretch>
+                    </pic:blipFill>
+                    <pic:spPr>
+                      <a:xfrm>
+                        <a:off x="0" y="0"/>
+                        <a:ext cx="5669280" cy="2232142"/>
+                      </a:xfrm>
+                      <a:prstGeom prst="rect"/>
+                    </pic:spPr>
+                  </pic:pic>
+                </a:graphicData>
+              </a:graphic>
+            </wp:inline>
+          </w:drawing>
+        </w:r>
+      </w:ins>
+    </w:p>
+    <w:p>
+      <w:pPr>
+        <w:pStyle w:val="50"/>
+        <w:jc w:val="both"/>
+      </w:pPr>
+      <w:ins w:id="15005" w:author="王哲" w:date="2026-08-26T00:00:00Z">
+        <w:r>
+          <w:t>Figure 8. Structures and bioactivity recovery by therapeutic target across the 296-patent corpus. (A) Structure records per target with the valid-SMILES share annotated; (B) recovered bioactivity values per target with patent counts, spanning all 15 therapeutic targets.</w:t>
+        </w:r>
+      </w:ins>
+    </w:p>
+    <w:p>
+      <w:pPr>
+        <w:pStyle w:val="50"/>
+        <w:jc w:val="both"/>
+      </w:pPr>
+      <w:ins w:id="15006" w:author="王哲" w:date="2026-08-26T00:00:00Z">
+        <w:r>
+          <w:drawing>
+            <wp:inline xmlns:a="http://schemas.openxmlformats.org/drawingml/2006/main" xmlns:pic="http://schemas.openxmlformats.org/drawingml/2006/picture">
+              <wp:extent cx="5669280" cy="2074943"/>
+              <wp:docPr id="12" name="Picture 12"/>
+              <wp:cNvGraphicFramePr>
+                <a:graphicFrameLocks noChangeAspect="1"/>
+              </wp:cNvGraphicFramePr>
+              <a:graphic>
+                <a:graphicData uri="http://schemas.openxmlformats.org/drawingml/2006/picture">
+                  <pic:pic>
+                    <pic:nvPicPr>
+                      <pic:cNvPr id="0" name="fig_verification_cascade.png"/>
+                      <pic:cNvPicPr/>
+                    </pic:nvPicPr>
+                    <pic:blipFill>
+                      <a:blip r:embed="rId20"/>
+                      <a:stretch>
+                        <a:fillRect/>
+                      </a:stretch>
+                    </pic:blipFill>
+                    <pic:spPr>
+                      <a:xfrm>
+                        <a:off x="0" y="0"/>
+                        <a:ext cx="5669280" cy="2074943"/>
+                      </a:xfrm>
+                      <a:prstGeom prst="rect"/>
+                    </pic:spPr>
+                  </pic:pic>
+                </a:graphicData>
+              </a:graphic>
+            </wp:inline>
+          </w:drawing>
+        </w:r>
+      </w:ins>
+    </w:p>
+    <w:p>
+      <w:pPr>
+        <w:pStyle w:val="50"/>
+        <w:jc w:val="both"/>
+      </w:pPr>
+      <w:ins w:id="15007" w:author="王哲" w:date="2026-08-26T00:00:00Z">
+        <w:r>
+          <w:t>Figure 9. Verification cascade and bioactivity provenance. (A) From 23,218 extracted structure records through 87.3% valid-SMILES yield and stratified sampling to 499 of 505 adjudicated picks confirmed correct (98.8%; Wilson 95% CI 97.4–99.5%). (B) Provenance classification of the 40 sampled bioactivity values: 20 traced to the OCR source text, 12 symbolic grades, and 7 untraced values attributed predominantly to OCR digit corruption.</w:t>
+        </w:r>
+      </w:ins>
     </w:p>
     <w:bookmarkEnd w:id="36"/>
     <w:p>

</xml_diff>

<commit_message>
docs: round-3 reviewer residuals (provenance arithmetic, patented wording, ref spacing, Fig 6 two-points caption)
</commit_message>
<xml_diff>
--- a/paper/Manuscript5_revised.docx
+++ b/paper/Manuscript5_revised.docx
@@ -2532,11 +2532,21 @@
         </w:r>
       </w:del>
       <w:ins w:id="9154" w:author="王哲" w:date="2026-08-26T00:00:00Z">
+        <w:del w:id="20001" w:author="王哲" w:date="2026-08-26T00:00:00Z">
+          <w:r>
+            <w:rPr>
+              <w:rFonts w:cs="Times New Roman"/>
+            </w:rPr>
+            <w:delText xml:space="preserve">As shown in Figure 4, BioChemInsight demonstrated robust and consistent performance in extracting SAR data from patents across 15 diverse therapeutic targets (pipeline-reported per-target accuracies; metric definitions in the ESI), achieving high extraction accuracy (&gt;0.8) for chemical structures, biological assay data, and compound identifiers, with most metrics exceeding 0.9 and several biological assays reaching 100% accuracy. Independent recomputation over the complete 296-patent corpus corroborated this picture: 87.3% of all 23,218 extracted structure records yielded valid SMILES, 100% carried compound identifiers, and per-patent SMILES validity averaged 85.7% (median 91.5%; n = 293 patents with at least one structure record, 3 text-only patents excluded). Most importantly, expert human adjudication of 505 compound-level extractions—each compared directly against its original patent segment—confirmed 98.8% of decoded structures as chemically correct (6 errors, 1.2%), with the error rate strongly stratified by document quality (0% in the highest-quality tier versus 12.0% in the lowest). This performance was achieved despite substantial variation in dataset size across targets, and extraction accuracy showed no obvious trend with the number of patents processed, suggesting that performance depends primarily on the inherent characteristics of the patent content (e.g., clarity of structural depictions, uniformity of assay tables) rather than on dataset volume. A provenance spot-check traced 71% (20/28) of sampled numeric activity values to the OCR source text; the 7 untraced values were attributed predominantly to OCR digit corruption (supported by spot-verification of a subset) rather than fabrication. Together, these analyses complement the pipeline-reported per-target metrics with independent recomputation and human-ground-truth adjudication, validating BioChemInsight as an effective and scalable tool for accelerating SAR data curation whose per-record reliability has been quantified against human ground truth rather than self-reported pipeline output.</w:delText>
+          </w:r>
+        </w:del>
+      </w:ins>
+      <w:ins w:id="20002" w:author="王哲" w:date="2026-08-26T00:00:00Z">
         <w:r>
           <w:rPr>
             <w:rFonts w:cs="Times New Roman"/>
           </w:rPr>
-          <w:t xml:space="preserve">As shown in Figure 4, BioChemInsight demonstrated robust and consistent performance in extracting SAR data from patents across 15 diverse therapeutic targets (pipeline-reported per-target accuracies; metric definitions in the ESI), achieving high extraction accuracy (&gt;0.8) for chemical structures, biological assay data, and compound identifiers, with most metrics exceeding 0.9 and several biological assays reaching 100% accuracy. Independent recomputation over the complete 296-patent corpus corroborated this picture: 87.3% of all 23,218 extracted structure records yielded valid SMILES, 100% carried compound identifiers, and per-patent SMILES validity averaged 85.7% (median 91.5%; n = 293 patents with at least one structure record, 3 text-only patents excluded). Most importantly, expert human adjudication of 505 compound-level extractions—each compared directly against its original patent segment—confirmed 98.8% of decoded structures as chemically correct (6 errors, 1.2%), with the error rate strongly stratified by document quality (0% in the highest-quality tier versus 12.0% in the lowest). This performance was achieved despite substantial variation in dataset size across targets, and extraction accuracy showed no obvious trend with the number of patents processed, suggesting that performance depends primarily on the inherent characteristics of the patent content (e.g., clarity of structural depictions, uniformity of assay tables) rather than on dataset volume. A provenance spot-check traced 71% (20/28) of sampled numeric activity values to the OCR source text; the 7 untraced values were attributed predominantly to OCR digit corruption (supported by spot-verification of a subset) rather than fabrication. Together, these analyses complement the pipeline-reported per-target metrics with independent recomputation and human-ground-truth adjudication, validating BioChemInsight as an effective and scalable tool for accelerating SAR data curation whose per-record reliability has been quantified against human ground truth rather than self-reported pipeline output.</w:t>
+          <w:t xml:space="preserve">As shown in Figure 4, BioChemInsight demonstrated robust and consistent performance in extracting SAR data from patents across 15 diverse therapeutic targets (pipeline-reported per-target accuracies; metric definitions in the ESI), achieving high extraction accuracy (&gt;0.8) for chemical structures, biological assay data, and compound identifiers, with most metrics exceeding 0.9 and several biological assays reaching 100% accuracy. Independent recomputation over the complete 296-patent corpus corroborated this picture: 87.3% of all 23,218 extracted structure records yielded valid SMILES, 100% carried compound identifiers, and per-patent SMILES validity averaged 85.7% (median 91.5%; n = 293 patents with at least one structure record, 3 text-only patents excluded). Most importantly, expert human adjudication of 505 compound-level extractions—each compared directly against its original patent segment—confirmed 98.8% of decoded structures as chemically correct (6 errors, 1.2%), with the error rate strongly stratified by document quality (0% in the highest-quality tier versus 12.0% in the lowest). This performance was achieved despite substantial variation in dataset size across targets, and extraction accuracy showed no obvious trend with the number of patents processed, suggesting that performance depends primarily on the inherent characteristics of the patent content (e.g., clarity of structural depictions, uniformity of assay tables) rather than on dataset volume. A provenance spot-check traced 71% (20/28) of sampled numeric activity values to the OCR source text; the 8 remaining numeric values comprise 7 untraced values attributed predominantly to OCR digit corruption (supported by spot-verification of a subset) and 1 value too short for unambiguous text matching, rather than fabrication. Together, these analyses complement the pipeline-reported per-target metrics with independent recomputation and human-ground-truth adjudication, validating BioChemInsight as an effective and scalable tool for accelerating SAR data curation whose per-record reliability has been quantified against human ground truth rather than self-reported pipeline output.</w:t>
         </w:r>
       </w:ins>
     </w:p>
@@ -2905,12 +2915,22 @@
       <w:pPr>
         <w:ind w:firstLine="480"/>
       </w:pPr>
-      <w:r>
-        <w:rPr>
-          <w:rFonts w:hint="eastAsia"/>
-        </w:rPr>
-        <w:t>This divergence stems from fundamental differences in data sources and curation mechanisms. ChEMBL, as a manually curated, high-quality, and large-scale open database of bioactive molecules, primarily aggregates data from peer-reviewed publications and publicly disclosed bioactivity assays. The patent-derived compounds included in ChEMBL are typically representative subsets rather than exhaustive extractions, constrained by its manual curation workflow. In contrast, patent literature itself serves as a primary source of novel chemical matter, often containing proprietary compounds that are structurally distinct and not yet deposited in public repositories. This is especially evident for emerging targets (e.g., NLRP3, PFKFB3), where patent disclosures commonly precede comprehensive academic reporting by several years.</w:t>
-      </w:r>
+      <w:del w:id="20003" w:author="王哲" w:date="2026-08-26T00:00:00Z">
+        <w:r>
+          <w:rPr>
+            <w:rFonts w:hint="eastAsia"/>
+          </w:rPr>
+          <w:delText>This divergence stems from fundamental differences in data sources and curation mechanisms. ChEMBL, as a manually curated, high-quality, and large-scale open database of bioactive molecules, primarily aggregates data from peer-reviewed publications and publicly disclosed bioactivity assays. The patent-derived compounds included in ChEMBL are typically representative subsets rather than exhaustive extractions, constrained by its manual curation workflow. In contrast, patent literature itself serves as a primary source of novel chemical matter, often containing proprietary compounds that are structurally distinct and not yet deposited in public repositories. This is especially evident for emerging targets (e.g., NLRP3, PFKFB3), where patent disclosures commonly precede comprehensive academic reporting by several years.</w:delText>
+        </w:r>
+      </w:del>
+      <w:ins w:id="20004" w:author="王哲" w:date="2026-08-26T00:00:00Z">
+        <w:r>
+          <w:rPr>
+            <w:rFonts w:hint="eastAsia"/>
+          </w:rPr>
+          <w:t xml:space="preserve">This divergence stems from fundamental differences in data sources and curation mechanisms. ChEMBL, as a manually curated, high-quality, and large-scale open database of bioactive molecules, primarily aggregates data from peer-reviewed publications and publicly disclosed bioactivity assays. The patent-derived compounds included in ChEMBL are typically representative subsets rather than exhaustive extractions, constrained by its manual curation workflow. In contrast, patent literature itself serves as a primary source of novel chemical matter, often containing patented compounds that are structurally distinct and not yet deposited in public repositories. This is especially evident for emerging targets (e.g., NLRP3, PFKFB3), where patent disclosures commonly precede comprehensive academic reporting by several years.</w:t>
+        </w:r>
+      </w:ins>
     </w:p>
     <w:p>
       <w:pPr>
@@ -3173,13 +3193,25 @@
         </w:r>
       </w:del>
       <w:ins w:id="9178" w:author="王哲" w:date="2026-08-26T00:00:00Z">
+        <w:del w:id="20005" w:author="王哲" w:date="2026-08-26T00:00:00Z">
+          <w:r>
+            <w:rPr>
+              <w:rFonts w:hint="eastAsia"/>
+              <w:b/>
+              <w:bCs/>
+            </w:rPr>
+            <w:delText xml:space="preserve">Figure 6. Comparison of target representation spaces derived from BioChemInsight patent data and the ChEMBL database. Each point corresponds to a therapeutic target, projected into two dimensions using UMAP (UMAP1 and UMAP2) based on feature vectors generated from Morgan fingerprints of compounds associated with each target. Red circles represent targets characterized from patent documents processed by BioChemInsight. Blue circles represent targets characterized from curated bioactivity records in the ChEMBL database. The two families of targets occupy distinct regions of the projection.</w:delText>
+          </w:r>
+        </w:del>
+      </w:ins>
+      <w:ins w:id="20006" w:author="王哲" w:date="2026-08-26T00:00:00Z">
         <w:r>
           <w:rPr>
             <w:rFonts w:hint="eastAsia"/>
             <w:b/>
             <w:bCs/>
           </w:rPr>
-          <w:t xml:space="preserve">Figure 6. Comparison of target representation spaces derived from BioChemInsight patent data and the ChEMBL database. Each point corresponds to a therapeutic target, projected into two dimensions using UMAP (UMAP1 and UMAP2) based on feature vectors generated from Morgan fingerprints of compounds associated with each target. Red circles represent targets characterized from patent documents processed by BioChemInsight. Blue circles represent targets characterized from curated bioactivity records in the ChEMBL database. The two families of targets occupy distinct regions of the projection.</w:t>
+          <w:t xml:space="preserve">Figure 6. Comparison of target representation spaces derived from BioChemInsight patent data and the ChEMBL database. Each point corresponds to a therapeutic target from one source (two points per target: patent-derived and ChEMBL-derived), projected into two dimensions using UMAP (UMAP1 and UMAP2) based on feature vectors generated from Morgan fingerprints of compounds associated with each target. Red circles represent targets characterized from patent documents processed by BioChemInsight. Blue circles represent targets characterized from curated bioactivity records in the ChEMBL database. The two families of targets occupy distinct regions of the projection.</w:t>
         </w:r>
       </w:ins>
     </w:p>
@@ -4663,11 +4695,21 @@
         </w:r>
       </w:del>
       <w:ins w:id="9203" w:author="王哲" w:date="2026-08-26T00:00:00Z">
+        <w:del w:id="20007" w:author="王哲" w:date="2026-08-26T00:00:00Z">
+          <w:r>
+            <w:rPr>
+              <w:rFonts w:eastAsia="等线" w:cs="Times New Roman"/>
+            </w:rPr>
+            <w:delText xml:space="preserve">(2) Tshitoyan, V.; Dagdelen, J.; Weston, L.; Dunn, A.; Rong, Z.; Kononova, O.; Persson, K. A.; Ceder, G. Unsupervised Word Embeddings Capture Latent Knowledge from Materials Science Literature. Nature 2019, 571, 95–98.</w:delText>
+          </w:r>
+        </w:del>
+      </w:ins>
+      <w:ins w:id="20008" w:author="王哲" w:date="2026-08-26T00:00:00Z">
         <w:r>
           <w:rPr>
             <w:rFonts w:eastAsia="等线" w:cs="Times New Roman"/>
           </w:rPr>
-          <w:t xml:space="preserve">(2) Tshitoyan, V.; Dagdelen, J.; Weston, L.; Dunn, A.; Rong, Z.; Kononova, O.; Persson, K. A.; Ceder, G. Unsupervised Word Embeddings Capture Latent Knowledge from Materials Science Literature. Nature 2019, 571, 95–98.</w:t>
+          <w:t xml:space="preserve">(2)	Tshitoyan, V.; Dagdelen, J.; Weston, L.; Dunn, A.; Rong, Z.; Kononova, O.; Persson, K. A.; Ceder, G. Unsupervised Word Embeddings Capture Latent Knowledge from Materials Science Literature. Nature 2019, 571, 95–98.</w:t>
         </w:r>
       </w:ins>
     </w:p>

</xml_diff>

<commit_message>
docs: restructure manuscript figures and tables
- replace the three multi-panel statistics figures with Table 1 (tier-
  stratified verification), Table 2 (verification cascade), and a plain
  per-patent validity histogram (Figure 8)
- add series-expansion case study figure (Figure 6): 6a-r alpha-glucosidase
  inhibitors, 18/18 members resolved and linked to measured IC50
- rebuild target-space comparison (Figure 7) as the target-level UMAP the
  caption always described: 14 of 15 target groups, patent vs ChEMBL pooled
  Morgan vectors, labeled pairs with collision-free placement
- renumber UMAP 6->7; figure order now 1-8 with no dual axes or pies
- figure_scripts/ regenerates every new figure from repo data (ChEMBL fetch
  cached under paper/figure_data/, gitignored)
</commit_message>
<xml_diff>
--- a/paper/Manuscript5_revised.docx
+++ b/paper/Manuscript5_revised.docx
@@ -878,6 +878,7 @@
     </w:p>
     <w:p>
       <w:pPr>
+        <w:keepNext/>
         <w:spacing w:line="480" w:lineRule="auto"/>
         <w:ind w:firstLine="0" w:firstLineChars="0"/>
         <w:jc w:val="center"/>
@@ -2145,6 +2146,7 @@
     </w:p>
     <w:p>
       <w:pPr>
+        <w:keepNext/>
         <w:pStyle w:val="50"/>
       </w:pPr>
       <w:r>
@@ -2335,6 +2337,7 @@
     </w:p>
     <w:p>
       <w:pPr>
+        <w:keepNext/>
         <w:pStyle w:val="50"/>
         <w:rPr>
           <w:rFonts w:hint="eastAsia"/>
@@ -2554,6 +2557,7 @@
     <w:bookmarkEnd w:id="35"/>
     <w:p>
       <w:pPr>
+        <w:keepNext/>
         <w:ind w:firstLine="0" w:firstLineChars="0"/>
         <w:rPr>
           <w:rFonts w:cs="Times New Roman"/>
@@ -2703,6 +2707,7 @@
     </w:p>
     <w:p>
       <w:pPr>
+        <w:keepNext/>
         <w:ind w:firstLine="0" w:firstLineChars="0"/>
         <w:jc w:val="center"/>
         <w:rPr>
@@ -2821,20 +2826,9 @@
           <w:numId w:val="3"/>
         </w:numPr>
       </w:pPr>
-      <w:del w:id="9164" w:author="王哲" w:date="2026-08-26T00:00:00Z">
-        <w:r>
-          <w:rPr>
-            <w:rFonts w:hint="eastAsia"/>
-          </w:rPr>
-          <w:delText>Patent-Derived Chemical Space Exhibits Strong Complementarity to ChEMBL database</w:delText>
-        </w:r>
-      </w:del>
-      <w:ins w:id="9165" w:author="王哲" w:date="2026-08-26T00:00:00Z">
-        <w:r>
-          <w:rPr>
-            <w:rFonts w:hint="eastAsia"/>
-          </w:rPr>
-          <w:t xml:space="preserve">Patent-Derived Chemical Space Exhibits Complementarity to the ChEMBL Database</w:t>
+      <w:ins w:id="20009" w:author="王哲" w:date="2026-08-26T12:00:00Z">
+        <w:r>
+          <w:t xml:space="preserve">Deterministic Series Expansion for Literature SAR Tables</w:t>
         </w:r>
       </w:ins>
     </w:p>
@@ -2842,136 +2836,23 @@
       <w:pPr>
         <w:ind w:firstLine="480"/>
       </w:pPr>
-      <w:del w:id="9166" w:author="王哲" w:date="2026-08-26T00:00:00Z">
-        <w:r>
-          <w:rPr>
-            <w:rFonts w:hint="eastAsia"/>
-          </w:rPr>
-          <w:delText>To assess the novelty and complementarity of patent-derived structure-activity relationship (SAR) data, we compared compound-target associations extracted by BioChemInsight with those from ChEMBL</w:delText>
-        </w:r>
-      </w:del>
-      <w:del w:id="9167" w:author="王哲" w:date="2026-08-26T00:00:00Z">
-        <w:r>
-          <w:fldChar w:fldCharType="begin"/>
-        </w:r>
-      </w:del>
-      <w:del w:id="9168" w:author="王哲" w:date="2026-08-26T00:00:00Z">
-        <w:r>
-          <w:instrText xml:space="preserve"> ADDIN ZOTERO_ITEM CSL_CITATION {"citationID":"am89esvh0c","properties":{"formattedCitation":"\\super 15\\nosupersub{}","plainCitation":"15","noteIndex":0},"citationItems":[{"id":11667,"uris":["http://zotero.org/users/10054398/items/JFGG8Q4U"],"itemData":{"id":11667,"type":"article-journal","abstract":"ChEMBL is a large, open-access bioactivity database  (https://www.ebi.ac.uk/chembl), previously described in the 2012, 2014 and 2017 Nucleic Acids Research Database Issues. In the last two years, several important improvements have been made to the database and are described here. These include more robust capture and representation of assay details; a new data deposition system, allowing updating of data sets and deposition of supplementary data; and a completely redesigned web interface, with enhanced search and filtering capabilities.","container-title":"Nucleic acids research","DOI":"10.1093/nar/gky1075","issue":"D1","page":"D930-D940","title":"ChEMBL: towards direct deposition of bioassay data.","volume":"47","author":[{"family":"Mendez","given":"David"},{"family":"Gaulton","given":"Anna"},{"family":"Bento","given":"A Patrícia"},{"family":"Chambers","given":"Jon"},{"family":"De Veij","given":"Marleen"},{"family":"Félix","given":"Eloy"},{"family":"Magariños","given":"María Paula"},{"family":"Mosquera","given":"Juan F"},{"family":"Mutowo","given":"Prudence"},{"family":"Nowotka","given":"Michal"},{"family":"Gordillo-Marañón","given":"María"},{"family":"Hunter","given":"Fiona"},{"family":"Junco","given":"Laura"},{"family":"Mugumbate","given":"Grace"},{"family":"Rodriguez-Lopez","given":"Milagros"},{"family":"Atkinson","given":"Francis"},{"family":"Bosc","given":"Nicolas"},{"family":"Radoux","given":"Chris J"},{"family":"Segura-Cabrera","given":"Aldo"},{"family":"Hersey","given":"Anne"},{"family":"Leach","given":"Andrew R"}],"issued":{"date-parts":[["2019",1]]}}}],"schema":"https://github.com/citation-style-language/schema/raw/master/csl-citation.json"} </w:instrText>
-        </w:r>
-      </w:del>
-      <w:del w:id="9169" w:author="王哲" w:date="2026-08-26T00:00:00Z">
-        <w:r>
-          <w:fldChar w:fldCharType="separate"/>
-        </w:r>
-      </w:del>
-      <w:del w:id="9170" w:author="王哲" w:date="2026-08-26T00:00:00Z">
-        <w:r>
-          <w:rPr>
-            <w:rFonts w:cs="Times New Roman"/>
-            <w:kern w:val="0"/>
-            <w:szCs w:val="24"/>
-            <w:vertAlign w:val="superscript"/>
-          </w:rPr>
-          <w:delText>15</w:delText>
-        </w:r>
-      </w:del>
-      <w:del w:id="9171" w:author="王哲" w:date="2026-08-26T00:00:00Z">
-        <w:r>
-          <w:fldChar w:fldCharType="end"/>
-        </w:r>
-      </w:del>
-      <w:del w:id="9172" w:author="王哲" w:date="2026-08-26T00:00:00Z">
-        <w:r>
-          <w:rPr>
-            <w:rFonts w:hint="eastAsia"/>
-          </w:rPr>
-          <w:delText>, a major public repository of bioactive molecules and SAR data. For each target, compounds from both sources were pooled, encoded as Morgan fingerprints (radius = 2</w:delText>
-        </w:r>
-      </w:del>
-      <w:del w:id="9173" w:author="王哲" w:date="2026-08-26T00:00:00Z">
-        <w:r>
-          <w:delText>,</w:delText>
-        </w:r>
-      </w:del>
-      <w:del w:id="9174" w:author="王哲" w:date="2026-08-26T00:00:00Z">
-        <w:r>
-          <w:rPr>
-            <w:rFonts w:hint="eastAsia"/>
-          </w:rPr>
-          <w:delText>2048 bits), and visualized via dimensionality reduction using Uniform Manifold Approximation and Projection (UMAP). As shown in Figure 6, patent-derived compounds (red dots) and ChEMBL-derived compounds (blue dots) formed distinct, minimally overlapping clusters in chemical space—a trend consistent across all 15 targets analyzed. This indicates that the chemical space associated with a given target in the patent literature is substantially different from that represented in public databases.</w:delText>
-        </w:r>
-      </w:del>
-      <w:ins w:id="9175" w:author="王哲" w:date="2026-08-26T00:00:00Z">
-        <w:r>
-          <w:rPr>
-            <w:rFonts w:hint="eastAsia"/>
-          </w:rPr>
-          <w:t xml:space="preserve">To assess the novelty and complementarity of patent-derived structure–activity relationship (SAR) data, we compared compound–target associations extracted by BioChemInsight with those from ChEMBL,15 a major public repository of bioactive molecules and SAR data. For each target, compounds from both sources were pooled into a single feature vector of Morgan fingerprints (radius = 2; 2048 bits) per target and source, and the resulting target-level chemical spaces were compared by dimensionality reduction using Uniform Manifold Approximation and Projection (UMAP). As shown in Figure 6, targets characterized from patent documents and targets characterized from ChEMBL occupy distinct, minimally overlapping regions of the projected chemical space—a trend consistent across all 15 targets analysed (UMAP parameters are listed in the ESI). Given the modest number of points, this projection serves as qualitative evidence; the consistent separation across all targets is the observation of interest. This indicates that the chemical space associated with a given target in the patent literature is substantially different from that represented in public databases.</w:t>
+      <w:ins w:id="20010" w:author="王哲" w:date="2026-08-26T12:00:00Z">
+        <w:r>
+          <w:t xml:space="preserve">Journal literature presents an extraction pattern that is complementary to patents: structures and measured activities are tabulated together, individual compounds are identified only by a series identifier such as 6a–r, and the scaffold is drawn once with variable substituents. BioChemInsight expands such series identifiers to member granularity and resolves every member structure deterministically through layered name lookup—PubChem first, OPSIN systematic-name parsing second—while the language model is restricted to translating compound names and is never allowed to generate structures; members that cannot be resolved are abandoned rather than guessed. Figure 6 illustrates the workflow on an α-glucosidase inhibition study: from the published scaffold definition and activity table, the pipeline resolved all 18 members of series 6a–r and linked each to its experimentally measured IC₅₀ value. The per-series consistency check confirmed that every resolved member embeds the common core of the series, no member was quarantined, and all 18 series activity values were reproduced exactly (the acarbose control row, outside the series definition, was not captured).</w:t>
         </w:r>
       </w:ins>
     </w:p>
     <w:p>
       <w:pPr>
-        <w:ind w:firstLine="480"/>
-      </w:pPr>
-      <w:del w:id="20003" w:author="王哲" w:date="2026-08-26T00:00:00Z">
-        <w:r>
-          <w:rPr>
-            <w:rFonts w:hint="eastAsia"/>
-          </w:rPr>
-          <w:delText>This divergence stems from fundamental differences in data sources and curation mechanisms. ChEMBL, as a manually curated, high-quality, and large-scale open database of bioactive molecules, primarily aggregates data from peer-reviewed publications and publicly disclosed bioactivity assays. The patent-derived compounds included in ChEMBL are typically representative subsets rather than exhaustive extractions, constrained by its manual curation workflow. In contrast, patent literature itself serves as a primary source of novel chemical matter, often containing proprietary compounds that are structurally distinct and not yet deposited in public repositories. This is especially evident for emerging targets (e.g., NLRP3, PFKFB3), where patent disclosures commonly precede comprehensive academic reporting by several years.</w:delText>
-        </w:r>
-      </w:del>
-      <w:ins w:id="20004" w:author="王哲" w:date="2026-08-26T00:00:00Z">
-        <w:r>
-          <w:rPr>
-            <w:rFonts w:hint="eastAsia"/>
-          </w:rPr>
-          <w:t xml:space="preserve">This divergence stems from fundamental differences in data sources and curation mechanisms. ChEMBL, as a manually curated, high-quality, and large-scale open database of bioactive molecules, primarily aggregates data from peer-reviewed publications and publicly disclosed bioactivity assays. The patent-derived compounds included in ChEMBL are typically representative subsets rather than exhaustive extractions, constrained by its manual curation workflow. In contrast, patent literature itself serves as a primary source of novel chemical matter, often containing patented compounds that are structurally distinct and not yet deposited in public repositories. This is especially evident for emerging targets (e.g., NLRP3, PFKFB3), where patent disclosures commonly precede comprehensive academic reporting by several years.</w:t>
-        </w:r>
-      </w:ins>
-    </w:p>
-    <w:p>
-      <w:pPr>
-        <w:ind w:firstLine="480"/>
-      </w:pPr>
-      <w:r>
-        <w:rPr>
-          <w:rFonts w:hint="eastAsia"/>
-        </w:rPr>
-        <w:t>Thus,</w:t>
-      </w:r>
-      <w:bookmarkStart w:id="36" w:name="OLE_LINK21"/>
-      <w:r>
-        <w:rPr>
-          <w:rFonts w:hint="eastAsia"/>
-        </w:rPr>
-        <w:t xml:space="preserve"> patents and ChEMBL cover complementary regions of chemical space. This underscores the value of systematic patent mining in early-stage drug discovery: BioChemInsight facilitates access to chemical information underrepresented in established public databases. By doing so, it expands the landscape of explorable compound-target interactions and enriches the data foundation for subsequent quantitative structure-activity relationship (QSAR) modeling and targeted screening efforts.</w:t>
-      </w:r>
-    </w:p>
-    <w:p>
-      <w:pPr>
-        <w:ind w:firstLine="480"/>
-        <w:rPr/>
-      </w:pPr>
-      <w:ins w:id="15001" w:author="王哲" w:date="2026-08-26T00:00:00Z">
-        <w:r>
-          <w:t>Figures 7–9 summarize corpus-level performance across complementary statistical dimensions, including the quality-stratified error profile, per-target recovery, and the verification cascade with bioactivity provenance.</w:t>
-        </w:r>
-      </w:ins>
-    </w:p>
-    <w:p>
-      <w:pPr>
-        <w:pStyle w:val="50"/>
-        <w:jc w:val="both"/>
-      </w:pPr>
-      <w:ins w:id="15002" w:author="王哲" w:date="2026-08-26T00:00:00Z">
+        <w:keepNext/>
+        <w:jc w:val="center"/>
+      </w:pPr>
+      <w:ins w:id="20011" w:author="王哲" w:date="2026-08-26T12:00:00Z">
         <w:r>
           <w:drawing>
             <wp:inline xmlns:a="http://schemas.openxmlformats.org/drawingml/2006/main" xmlns:pic="http://schemas.openxmlformats.org/drawingml/2006/picture">
-              <wp:extent cx="5669280" cy="1683351"/>
-              <wp:docPr id="10" name="Picture 10"/>
+              <wp:extent cx="5220000" cy="4800876"/>
+              <wp:docPr id="13" name="Picture 13"/>
               <wp:cNvGraphicFramePr>
                 <a:graphicFrameLocks noChangeAspect="1"/>
               </wp:cNvGraphicFramePr>
@@ -2979,11 +2860,11 @@
                 <a:graphicData uri="http://schemas.openxmlformats.org/drawingml/2006/picture">
                   <pic:pic>
                     <pic:nvPicPr>
-                      <pic:cNvPr id="0" name="fig_performance_overview.png"/>
+                      <pic:cNvPr id="0" name="fig_series_case.png"/>
                       <pic:cNvPicPr/>
                     </pic:nvPicPr>
                     <pic:blipFill>
-                      <a:blip r:embed="rId18"/>
+                      <a:blip r:embed="rId21"/>
                       <a:stretch>
                         <a:fillRect/>
                       </a:stretch>
@@ -2991,7 +2872,7 @@
                     <pic:spPr>
                       <a:xfrm>
                         <a:off x="0" y="0"/>
-                        <a:ext cx="5669280" cy="1683351"/>
+                        <a:ext cx="5220000" cy="4800876"/>
                       </a:xfrm>
                       <a:prstGeom prst="rect"/>
                     </pic:spPr>
@@ -3008,23 +2889,355 @@
         <w:pStyle w:val="50"/>
         <w:jc w:val="both"/>
       </w:pPr>
-      <w:ins w:id="15003" w:author="王哲" w:date="2026-08-26T00:00:00Z">
-        <w:r>
-          <w:t>Figure 7. Corpus-level extraction performance across statistical dimensions. (A) Distribution of per-patent valid-SMILES rates over the 293 patents with at least one structure record (median 91.5%; bin colours indicate quality tiers). (B) Expert human verification of the 505 adjudicated compound-level extractions stratified by tier: 499 confirmed correct (98.8%) with zero errors in the perfect tier and 12.0% in the low tier. (C) Pick-level error rate (bars, left axis) together with each tier's share of corpus structure records (line, right axis), showing that errors concentrate in the hardest documents while the highest-quality tiers carry most of the corpus with no observed error.</w:t>
+      <w:ins w:id="20012" w:author="王哲" w:date="2026-08-26T12:00:00Z">
+        <w:r>
+          <w:t xml:space="preserve">Figure 6. Deterministic series expansion of a literature R-group table. (A) Source material from an α-glucosidase inhibition study: the series definition (scaffold bearing variable X) and the activity table listing compounds 6a–r with substituents and measured IC₅₀ values. (B) Six of the 18 member structures resolved by layered name lookup (PubChem, with OPSIN name parsing as fallback), each linked to its experimental IC₅₀; all 18 resolved members embedded the common series core and matched reference structures derived from the published compound names.</w:t>
         </w:r>
       </w:ins>
     </w:p>
     <w:p>
       <w:pPr>
+        <w:pStyle w:val="2"/>
+        <w:numPr>
+          <w:ilvl w:val="0"/>
+          <w:numId w:val="3"/>
+        </w:numPr>
+      </w:pPr>
+      <w:del w:id="9164" w:author="王哲" w:date="2026-08-26T00:00:00Z">
+        <w:r>
+          <w:rPr>
+            <w:rFonts w:hint="eastAsia"/>
+          </w:rPr>
+          <w:delText>Patent-Derived Chemical Space Exhibits Strong Complementarity to ChEMBL database</w:delText>
+        </w:r>
+      </w:del>
+      <w:ins w:id="9165" w:author="王哲" w:date="2026-08-26T00:00:00Z">
+        <w:r>
+          <w:rPr>
+            <w:rFonts w:hint="eastAsia"/>
+          </w:rPr>
+          <w:t xml:space="preserve">Patent-Derived Chemical Space Exhibits Complementarity to the ChEMBL Database</w:t>
+        </w:r>
+      </w:ins>
+    </w:p>
+    <w:p>
+      <w:pPr>
+        <w:ind w:firstLine="480"/>
+      </w:pPr>
+      <w:del w:id="9166" w:author="王哲" w:date="2026-08-26T00:00:00Z">
+        <w:r>
+          <w:rPr>
+            <w:rFonts w:hint="eastAsia"/>
+          </w:rPr>
+          <w:delText>To assess the novelty and complementarity of patent-derived structure-activity relationship (SAR) data, we compared compound-target associations extracted by BioChemInsight with those from ChEMBL</w:delText>
+        </w:r>
+      </w:del>
+      <w:del w:id="9167" w:author="王哲" w:date="2026-08-26T00:00:00Z">
+        <w:r>
+          <w:fldChar w:fldCharType="begin"/>
+        </w:r>
+      </w:del>
+      <w:del w:id="9168" w:author="王哲" w:date="2026-08-26T00:00:00Z">
+        <w:r>
+          <w:instrText xml:space="preserve"> ADDIN ZOTERO_ITEM CSL_CITATION {"citationID":"am89esvh0c","properties":{"formattedCitation":"\\super 15\\nosupersub{}","plainCitation":"15","noteIndex":0},"citationItems":[{"id":11667,"uris":["http://zotero.org/users/10054398/items/JFGG8Q4U"],"itemData":{"id":11667,"type":"article-journal","abstract":"ChEMBL is a large, open-access bioactivity database  (https://www.ebi.ac.uk/chembl), previously described in the 2012, 2014 and 2017 Nucleic Acids Research Database Issues. In the last two years, several important improvements have been made to the database and are described here. These include more robust capture and representation of assay details; a new data deposition system, allowing updating of data sets and deposition of supplementary data; and a completely redesigned web interface, with enhanced search and filtering capabilities.","container-title":"Nucleic acids research","DOI":"10.1093/nar/gky1075","issue":"D1","page":"D930-D940","title":"ChEMBL: towards direct deposition of bioassay data.","volume":"47","author":[{"family":"Mendez","given":"David"},{"family":"Gaulton","given":"Anna"},{"family":"Bento","given":"A Patrícia"},{"family":"Chambers","given":"Jon"},{"family":"De Veij","given":"Marleen"},{"family":"Félix","given":"Eloy"},{"family":"Magariños","given":"María Paula"},{"family":"Mosquera","given":"Juan F"},{"family":"Mutowo","given":"Prudence"},{"family":"Nowotka","given":"Michal"},{"family":"Gordillo-Marañón","given":"María"},{"family":"Hunter","given":"Fiona"},{"family":"Junco","given":"Laura"},{"family":"Mugumbate","given":"Grace"},{"family":"Rodriguez-Lopez","given":"Milagros"},{"family":"Atkinson","given":"Francis"},{"family":"Bosc","given":"Nicolas"},{"family":"Radoux","given":"Chris J"},{"family":"Segura-Cabrera","given":"Aldo"},{"family":"Hersey","given":"Anne"},{"family":"Leach","given":"Andrew R"}],"issued":{"date-parts":[["2019",1]]}}}],"schema":"https://github.com/citation-style-language/schema/raw/master/csl-citation.json"} </w:instrText>
+        </w:r>
+      </w:del>
+      <w:del w:id="9169" w:author="王哲" w:date="2026-08-26T00:00:00Z">
+        <w:r>
+          <w:fldChar w:fldCharType="separate"/>
+        </w:r>
+      </w:del>
+      <w:del w:id="9170" w:author="王哲" w:date="2026-08-26T00:00:00Z">
+        <w:r>
+          <w:rPr>
+            <w:rFonts w:cs="Times New Roman"/>
+            <w:kern w:val="0"/>
+            <w:szCs w:val="24"/>
+            <w:vertAlign w:val="superscript"/>
+          </w:rPr>
+          <w:delText>15</w:delText>
+        </w:r>
+      </w:del>
+      <w:del w:id="9171" w:author="王哲" w:date="2026-08-26T00:00:00Z">
+        <w:r>
+          <w:fldChar w:fldCharType="end"/>
+        </w:r>
+      </w:del>
+      <w:del w:id="9172" w:author="王哲" w:date="2026-08-26T00:00:00Z">
+        <w:r>
+          <w:rPr>
+            <w:rFonts w:hint="eastAsia"/>
+          </w:rPr>
+          <w:delText>, a major public repository of bioactive molecules and SAR data. For each target, compounds from both sources were pooled, encoded as Morgan fingerprints (radius = 2</w:delText>
+        </w:r>
+      </w:del>
+      <w:del w:id="9173" w:author="王哲" w:date="2026-08-26T00:00:00Z">
+        <w:r>
+          <w:delText>,</w:delText>
+        </w:r>
+      </w:del>
+      <w:del w:id="9174" w:author="王哲" w:date="2026-08-26T00:00:00Z">
+        <w:r>
+          <w:rPr>
+            <w:rFonts w:hint="eastAsia"/>
+          </w:rPr>
+          <w:delText>2048 bits), and visualized via dimensionality reduction using Uniform Manifold Approximation and Projection (UMAP). As shown in Figure 6, patent-derived compounds (red dots) and ChEMBL-derived compounds (blue dots) formed distinct, minimally overlapping clusters in chemical space—a trend consistent across all 15 targets analyzed. This indicates that the chemical space associated with a given target in the patent literature is substantially different from that represented in public databases.</w:delText>
+        </w:r>
+      </w:del>
+      <w:ins w:id="9175" w:author="王哲" w:date="2026-08-26T00:00:00Z">
+        <w:del w:id="20013" w:author="王哲" w:date="2026-08-26T12:00:00Z">
+          <w:r>
+            <w:rPr>
+              <w:rFonts w:hint="eastAsia"/>
+            </w:rPr>
+            <w:delText xml:space="preserve">To assess the novelty and complementarity of patent-derived structure–activity relationship (SAR) data, we compared compound–target associations extracted by BioChemInsight with those from ChEMBL,15 a major public repository of bioactive molecules and SAR data. For each target, compounds from both sources were pooled into a single feature vector of Morgan fingerprints (radius = 2; 2048 bits) per target and source, and the resulting target-level chemical spaces were compared by dimensionality reduction using Uniform Manifold Approximation and Projection (UMAP). As shown in Figure 6, targets characterized from patent documents and targets characterized from ChEMBL occupy distinct, minimally overlapping regions of the projected chemical space—a trend consistent across all 15 targets analysed (UMAP parameters are listed in the ESI). Given the modest number of points, this projection serves as qualitative evidence; the consistent separation across all targets is the observation of interest. This indicates that the chemical space associated with a given target in the patent literature is substantially different from that represented in public databases.</w:delText>
+          </w:r>
+        </w:del>
+      </w:ins>
+      <w:ins w:id="20014" w:author="王哲" w:date="2026-08-26T12:00:00Z">
+        <w:r>
+          <w:t xml:space="preserve">To assess the novelty and complementarity of patent-derived structure–activity relationship (SAR) data, we compared compound–target associations extracted by BioChemInsight with those from ChEMBL,15 a major public repository of bioactive molecules and SAR data. For each target, compounds from both sources were pooled into a single feature vector of Morgan fingerprints (radius = 2; 2048 bits) per target and source, and the resulting target-level chemical spaces were compared by dimensionality reduction using Uniform Manifold Approximation and Projection (UMAP). As shown in Figure 7, targets characterized from patent documents and targets characterized from ChEMBL occupy distinct, minimally overlapping regions of the projected chemical space—a trend consistent across all 15 targets analysed (UMAP parameters are listed in the ESI). Given the modest number of points, this projection serves as qualitative evidence; the consistent separation across all targets is the observation of interest. This indicates that the chemical space associated with a given target in the patent literature is substantially different from that represented in public databases.</w:t>
+        </w:r>
+      </w:ins>
+    </w:p>
+    <w:p>
+      <w:pPr>
+        <w:ind w:firstLine="480"/>
+      </w:pPr>
+      <w:del w:id="20003" w:author="王哲" w:date="2026-08-26T00:00:00Z">
+        <w:r>
+          <w:rPr>
+            <w:rFonts w:hint="eastAsia"/>
+          </w:rPr>
+          <w:delText>This divergence stems from fundamental differences in data sources and curation mechanisms. ChEMBL, as a manually curated, high-quality, and large-scale open database of bioactive molecules, primarily aggregates data from peer-reviewed publications and publicly disclosed bioactivity assays. The patent-derived compounds included in ChEMBL are typically representative subsets rather than exhaustive extractions, constrained by its manual curation workflow. In contrast, patent literature itself serves as a primary source of novel chemical matter, often containing proprietary compounds that are structurally distinct and not yet deposited in public repositories. This is especially evident for emerging targets (e.g., NLRP3, PFKFB3), where patent disclosures commonly precede comprehensive academic reporting by several years.</w:delText>
+        </w:r>
+      </w:del>
+      <w:ins w:id="20004" w:author="王哲" w:date="2026-08-26T00:00:00Z">
+        <w:r>
+          <w:rPr>
+            <w:rFonts w:hint="eastAsia"/>
+          </w:rPr>
+          <w:t xml:space="preserve">This divergence stems from fundamental differences in data sources and curation mechanisms. ChEMBL, as a manually curated, high-quality, and large-scale open database of bioactive molecules, primarily aggregates data from peer-reviewed publications and publicly disclosed bioactivity assays. The patent-derived compounds included in ChEMBL are typically representative subsets rather than exhaustive extractions, constrained by its manual curation workflow. In contrast, patent literature itself serves as a primary source of novel chemical matter, often containing patented compounds that are structurally distinct and not yet deposited in public repositories. This is especially evident for emerging targets (e.g., NLRP3, PFKFB3), where patent disclosures commonly precede comprehensive academic reporting by several years.</w:t>
+        </w:r>
+      </w:ins>
+    </w:p>
+    <w:p>
+      <w:pPr>
+        <w:ind w:firstLine="480"/>
+      </w:pPr>
+      <w:r>
+        <w:rPr>
+          <w:rFonts w:hint="eastAsia"/>
+        </w:rPr>
+        <w:t>Thus,</w:t>
+      </w:r>
+      <w:bookmarkStart w:id="36" w:name="OLE_LINK21"/>
+      <w:r>
+        <w:rPr>
+          <w:rFonts w:hint="eastAsia"/>
+        </w:rPr>
+        <w:t xml:space="preserve"> patents and ChEMBL cover complementary regions of chemical space. This underscores the value of systematic patent mining in early-stage drug discovery: BioChemInsight facilitates access to chemical information underrepresented in established public databases. By doing so, it expands the landscape of explorable compound-target interactions and enriches the data foundation for subsequent quantitative structure-activity relationship (QSAR) modeling and targeted screening efforts.</w:t>
+      </w:r>
+    </w:p>
+    <w:p>
+      <w:pPr>
+        <w:ind w:firstLine="480"/>
+        <w:rPr/>
+      </w:pPr>
+      <w:ins w:id="15001" w:author="王哲" w:date="2026-08-26T00:00:00Z">
+        <w:del w:id="20001" w:author="王哲" w:date="2026-08-26T12:00:00Z">
+          <w:r>
+            <w:delText xml:space="preserve">Figures 7–9 summarize corpus-level performance across complementary statistical dimensions, including the quality-stratified error profile, per-target recovery, and the verification cascade with bioactivity provenance.</w:delText>
+          </w:r>
+        </w:del>
+      </w:ins>
+    </w:p>
+    <w:p>
+      <w:pPr>
+        <w:keepNext/>
         <w:pStyle w:val="50"/>
         <w:jc w:val="both"/>
       </w:pPr>
+      <w:ins w:id="15002" w:author="王哲" w:date="2026-08-26T00:00:00Z">
+        <w:del w:id="20002" w:author="王哲" w:date="2026-08-26T12:00:00Z">
+          <w:r>
+            <w:drawing>
+              <wp:inline xmlns:a="http://schemas.openxmlformats.org/drawingml/2006/main" xmlns:pic="http://schemas.openxmlformats.org/drawingml/2006/picture">
+                <wp:extent cx="5669280" cy="1683351"/>
+                <wp:docPr id="10" name="Picture 10"/>
+                <wp:cNvGraphicFramePr>
+                  <a:graphicFrameLocks noChangeAspect="1"/>
+                </wp:cNvGraphicFramePr>
+                <a:graphic>
+                  <a:graphicData uri="http://schemas.openxmlformats.org/drawingml/2006/picture">
+                    <pic:pic>
+                      <pic:nvPicPr>
+                        <pic:cNvPr id="0" name="fig_performance_overview.png"/>
+                        <pic:cNvPicPr/>
+                      </pic:nvPicPr>
+                      <pic:blipFill>
+                        <a:blip r:embed="rId18"/>
+                        <a:stretch>
+                          <a:fillRect/>
+                        </a:stretch>
+                      </pic:blipFill>
+                      <pic:spPr>
+                        <a:xfrm>
+                          <a:off x="0" y="0"/>
+                          <a:ext cx="5669280" cy="1683351"/>
+                        </a:xfrm>
+                        <a:prstGeom prst="rect"/>
+                      </pic:spPr>
+                    </pic:pic>
+                  </a:graphicData>
+                </a:graphic>
+              </wp:inline>
+            </w:drawing>
+          </w:r>
+        </w:del>
+      </w:ins>
+    </w:p>
+    <w:p>
+      <w:pPr>
+        <w:pStyle w:val="50"/>
+        <w:jc w:val="both"/>
+      </w:pPr>
+      <w:ins w:id="15003" w:author="王哲" w:date="2026-08-26T00:00:00Z">
+        <w:del w:id="20003" w:author="王哲" w:date="2026-08-26T12:00:00Z">
+          <w:r>
+            <w:delText xml:space="preserve">Figure 7. Corpus-level extraction performance across statistical dimensions. (A) Distribution of per-patent valid-SMILES rates over the 293 patents with at least one structure record (median 91.5%; bin colours indicate quality tiers). (B) Expert human verification of the 505 adjudicated compound-level extractions stratified by tier: 499 confirmed correct (98.8%) with zero errors in the perfect tier and 12.0% in the low tier. (C) Pick-level error rate (bars, left axis) together with each tier's share of corpus structure records (line, right axis), showing that errors concentrate in the hardest documents while the highest-quality tiers carry most of the corpus with no observed error.</w:delText>
+          </w:r>
+        </w:del>
+      </w:ins>
+    </w:p>
+    <w:p>
+      <w:pPr>
+        <w:keepNext/>
+        <w:pStyle w:val="50"/>
+        <w:jc w:val="both"/>
+      </w:pPr>
       <w:ins w:id="15004" w:author="王哲" w:date="2026-08-26T00:00:00Z">
+        <w:del w:id="20004" w:author="王哲" w:date="2026-08-26T12:00:00Z">
+          <w:r>
+            <w:drawing>
+              <wp:inline xmlns:a="http://schemas.openxmlformats.org/drawingml/2006/main" xmlns:pic="http://schemas.openxmlformats.org/drawingml/2006/picture">
+                <wp:extent cx="5669280" cy="2232142"/>
+                <wp:docPr id="11" name="Picture 11"/>
+                <wp:cNvGraphicFramePr>
+                  <a:graphicFrameLocks noChangeAspect="1"/>
+                </wp:cNvGraphicFramePr>
+                <a:graphic>
+                  <a:graphicData uri="http://schemas.openxmlformats.org/drawingml/2006/picture">
+                    <pic:pic>
+                      <pic:nvPicPr>
+                        <pic:cNvPr id="0" name="fig_target_statistics.png"/>
+                        <pic:cNvPicPr/>
+                      </pic:nvPicPr>
+                      <pic:blipFill>
+                        <a:blip r:embed="rId19"/>
+                        <a:stretch>
+                          <a:fillRect/>
+                        </a:stretch>
+                      </pic:blipFill>
+                      <pic:spPr>
+                        <a:xfrm>
+                          <a:off x="0" y="0"/>
+                          <a:ext cx="5669280" cy="2232142"/>
+                        </a:xfrm>
+                        <a:prstGeom prst="rect"/>
+                      </pic:spPr>
+                    </pic:pic>
+                  </a:graphicData>
+                </a:graphic>
+              </wp:inline>
+            </w:drawing>
+          </w:r>
+        </w:del>
+      </w:ins>
+    </w:p>
+    <w:p>
+      <w:pPr>
+        <w:pStyle w:val="50"/>
+        <w:jc w:val="both"/>
+      </w:pPr>
+      <w:ins w:id="15005" w:author="王哲" w:date="2026-08-26T00:00:00Z">
+        <w:del w:id="20005" w:author="王哲" w:date="2026-08-26T12:00:00Z">
+          <w:r>
+            <w:delText xml:space="preserve">Figure 8. Structures and bioactivity recovery by therapeutic target across the 296-patent corpus. (A) Structure records per target with the valid-SMILES share annotated; (B) recovered bioactivity values per target with patent counts, spanning all 15 therapeutic targets.</w:delText>
+          </w:r>
+        </w:del>
+      </w:ins>
+    </w:p>
+    <w:p>
+      <w:pPr>
+        <w:keepNext/>
+        <w:pStyle w:val="50"/>
+        <w:jc w:val="both"/>
+      </w:pPr>
+      <w:ins w:id="15006" w:author="王哲" w:date="2026-08-26T00:00:00Z">
+        <w:del w:id="20006" w:author="王哲" w:date="2026-08-26T12:00:00Z">
+          <w:r>
+            <w:drawing>
+              <wp:inline xmlns:a="http://schemas.openxmlformats.org/drawingml/2006/main" xmlns:pic="http://schemas.openxmlformats.org/drawingml/2006/picture">
+                <wp:extent cx="5669280" cy="2074943"/>
+                <wp:docPr id="12" name="Picture 12"/>
+                <wp:cNvGraphicFramePr>
+                  <a:graphicFrameLocks noChangeAspect="1"/>
+                </wp:cNvGraphicFramePr>
+                <a:graphic>
+                  <a:graphicData uri="http://schemas.openxmlformats.org/drawingml/2006/picture">
+                    <pic:pic>
+                      <pic:nvPicPr>
+                        <pic:cNvPr id="0" name="fig_verification_cascade.png"/>
+                        <pic:cNvPicPr/>
+                      </pic:nvPicPr>
+                      <pic:blipFill>
+                        <a:blip r:embed="rId20"/>
+                        <a:stretch>
+                          <a:fillRect/>
+                        </a:stretch>
+                      </pic:blipFill>
+                      <pic:spPr>
+                        <a:xfrm>
+                          <a:off x="0" y="0"/>
+                          <a:ext cx="5669280" cy="2074943"/>
+                        </a:xfrm>
+                        <a:prstGeom prst="rect"/>
+                      </pic:spPr>
+                    </pic:pic>
+                  </a:graphicData>
+                </a:graphic>
+              </wp:inline>
+            </w:drawing>
+          </w:r>
+        </w:del>
+      </w:ins>
+    </w:p>
+    <w:p>
+      <w:pPr>
+        <w:pStyle w:val="50"/>
+        <w:jc w:val="both"/>
+      </w:pPr>
+      <w:ins w:id="15007" w:author="王哲" w:date="2026-08-26T00:00:00Z">
+        <w:del w:id="20007" w:author="王哲" w:date="2026-08-26T12:00:00Z">
+          <w:r>
+            <w:delText xml:space="preserve">Figure 9. Verification cascade and bioactivity provenance. (A) From 23,218 extracted structure records through 87.3% valid-SMILES yield and stratified sampling to 499 of 505 adjudicated picks confirmed correct (98.8%; Wilson 95% CI 97.4–99.5%). (B) Provenance classification of the 40 sampled bioactivity values: 20 traced to the OCR source text, 12 symbolic grades, and 7 untraced values attributed predominantly to OCR digit corruption.</w:delText>
+          </w:r>
+        </w:del>
+      </w:ins>
+    </w:p>
+    <w:bookmarkEnd w:id="36"/>
+    <w:p>
+      <w:pPr>
+        <w:keepNext/>
+        <w:jc w:val="center"/>
+      </w:pPr>
+      <w:ins w:id="20018" w:author="王哲" w:date="2026-08-26T12:00:00Z">
         <w:r>
           <w:drawing>
             <wp:inline xmlns:a="http://schemas.openxmlformats.org/drawingml/2006/main" xmlns:pic="http://schemas.openxmlformats.org/drawingml/2006/picture">
-              <wp:extent cx="5669280" cy="2232142"/>
-              <wp:docPr id="11" name="Picture 11"/>
+              <wp:extent cx="5220000" cy="3505401"/>
+              <wp:docPr id="14" name="Picture 14"/>
               <wp:cNvGraphicFramePr>
                 <a:graphicFrameLocks noChangeAspect="1"/>
               </wp:cNvGraphicFramePr>
@@ -3032,11 +3245,11 @@
                 <a:graphicData uri="http://schemas.openxmlformats.org/drawingml/2006/picture">
                   <pic:pic>
                     <pic:nvPicPr>
-                      <pic:cNvPr id="0" name="fig_target_statistics.png"/>
+                      <pic:cNvPr id="0" name="fig_target_space.png"/>
                       <pic:cNvPicPr/>
                     </pic:nvPicPr>
                     <pic:blipFill>
-                      <a:blip r:embed="rId19"/>
+                      <a:blip r:embed="rId22"/>
                       <a:stretch>
                         <a:fillRect/>
                       </a:stretch>
@@ -3044,7 +3257,7 @@
                     <pic:spPr>
                       <a:xfrm>
                         <a:off x="0" y="0"/>
-                        <a:ext cx="5669280" cy="2232142"/>
+                        <a:ext cx="5220000" cy="3505401"/>
                       </a:xfrm>
                       <a:prstGeom prst="rect"/>
                     </pic:spPr>
@@ -3058,38 +3271,34 @@
     </w:p>
     <w:p>
       <w:pPr>
+        <w:keepNext/>
         <w:pStyle w:val="50"/>
         <w:jc w:val="both"/>
       </w:pPr>
-      <w:ins w:id="15005" w:author="王哲" w:date="2026-08-26T00:00:00Z">
-        <w:r>
-          <w:t>Figure 8. Structures and bioactivity recovery by therapeutic target across the 296-patent corpus. (A) Structure records per target with the valid-SMILES share annotated; (B) recovered bioactivity values per target with patent counts, spanning all 15 therapeutic targets.</w:t>
-        </w:r>
-      </w:ins>
-    </w:p>
-    <w:p>
-      <w:pPr>
-        <w:pStyle w:val="50"/>
-        <w:jc w:val="both"/>
-      </w:pPr>
-      <w:ins w:id="15006" w:author="王哲" w:date="2026-08-26T00:00:00Z">
-        <w:r>
+      <w:del w:id="20017" w:author="王哲" w:date="2026-08-26T12:00:00Z">
+        <w:r>
+          <w:rPr>
+            <w:rFonts w:hint="eastAsia"/>
+          </w:rPr>
           <w:drawing>
-            <wp:inline xmlns:a="http://schemas.openxmlformats.org/drawingml/2006/main" xmlns:pic="http://schemas.openxmlformats.org/drawingml/2006/picture">
-              <wp:extent cx="5669280" cy="2074943"/>
-              <wp:docPr id="12" name="Picture 12"/>
+            <wp:inline distT="0" distB="0" distL="114300" distR="114300">
+              <wp:extent cx="5164455" cy="8850630"/>
+              <wp:effectExtent l="0" t="0" r="4445" b="1270"/>
+              <wp:docPr id="5" name="图片 5" descr="umap_plots_final"/>
               <wp:cNvGraphicFramePr>
-                <a:graphicFrameLocks noChangeAspect="1"/>
+                <a:graphicFrameLocks xmlns:a="http://schemas.openxmlformats.org/drawingml/2006/main" noChangeAspect="1"/>
               </wp:cNvGraphicFramePr>
-              <a:graphic>
+              <a:graphic xmlns:a="http://schemas.openxmlformats.org/drawingml/2006/main">
                 <a:graphicData uri="http://schemas.openxmlformats.org/drawingml/2006/picture">
-                  <pic:pic>
+                  <pic:pic xmlns:pic="http://schemas.openxmlformats.org/drawingml/2006/picture">
                     <pic:nvPicPr>
-                      <pic:cNvPr id="0" name="fig_verification_cascade.png"/>
-                      <pic:cNvPicPr/>
+                      <pic:cNvPr id="5" name="图片 5" descr="umap_plots_final"/>
+                      <pic:cNvPicPr>
+                        <a:picLocks noChangeAspect="1"/>
+                      </pic:cNvPicPr>
                     </pic:nvPicPr>
                     <pic:blipFill>
-                      <a:blip r:embed="rId20"/>
+                      <a:blip r:embed="rId12"/>
                       <a:stretch>
                         <a:fillRect/>
                       </a:stretch>
@@ -3097,9 +3306,11 @@
                     <pic:spPr>
                       <a:xfrm>
                         <a:off x="0" y="0"/>
-                        <a:ext cx="5669280" cy="2074943"/>
+                        <a:ext cx="5164455" cy="8850630"/>
                       </a:xfrm>
-                      <a:prstGeom prst="rect"/>
+                      <a:prstGeom prst="rect">
+                        <a:avLst/>
+                      </a:prstGeom>
                     </pic:spPr>
                   </pic:pic>
                 </a:graphicData>
@@ -3107,67 +3318,7 @@
             </wp:inline>
           </w:drawing>
         </w:r>
-      </w:ins>
-    </w:p>
-    <w:p>
-      <w:pPr>
-        <w:pStyle w:val="50"/>
-        <w:jc w:val="both"/>
-      </w:pPr>
-      <w:ins w:id="15007" w:author="王哲" w:date="2026-08-26T00:00:00Z">
-        <w:r>
-          <w:t>Figure 9. Verification cascade and bioactivity provenance. (A) From 23,218 extracted structure records through 87.3% valid-SMILES yield and stratified sampling to 499 of 505 adjudicated picks confirmed correct (98.8%; Wilson 95% CI 97.4–99.5%). (B) Provenance classification of the 40 sampled bioactivity values: 20 traced to the OCR source text, 12 symbolic grades, and 7 untraced values attributed predominantly to OCR digit corruption.</w:t>
-        </w:r>
-      </w:ins>
-    </w:p>
-    <w:bookmarkEnd w:id="36"/>
-    <w:p>
-      <w:pPr>
-        <w:pStyle w:val="50"/>
-        <w:jc w:val="both"/>
-      </w:pPr>
-      <w:r>
-        <w:rPr>
-          <w:rFonts w:hint="eastAsia"/>
-        </w:rPr>
-        <w:drawing>
-          <wp:inline distT="0" distB="0" distL="114300" distR="114300">
-            <wp:extent cx="5164455" cy="8850630"/>
-            <wp:effectExtent l="0" t="0" r="4445" b="1270"/>
-            <wp:docPr id="5" name="图片 5" descr="umap_plots_final"/>
-            <wp:cNvGraphicFramePr>
-              <a:graphicFrameLocks xmlns:a="http://schemas.openxmlformats.org/drawingml/2006/main" noChangeAspect="1"/>
-            </wp:cNvGraphicFramePr>
-            <a:graphic xmlns:a="http://schemas.openxmlformats.org/drawingml/2006/main">
-              <a:graphicData uri="http://schemas.openxmlformats.org/drawingml/2006/picture">
-                <pic:pic xmlns:pic="http://schemas.openxmlformats.org/drawingml/2006/picture">
-                  <pic:nvPicPr>
-                    <pic:cNvPr id="5" name="图片 5" descr="umap_plots_final"/>
-                    <pic:cNvPicPr>
-                      <a:picLocks noChangeAspect="1"/>
-                    </pic:cNvPicPr>
-                  </pic:nvPicPr>
-                  <pic:blipFill>
-                    <a:blip r:embed="rId12"/>
-                    <a:stretch>
-                      <a:fillRect/>
-                    </a:stretch>
-                  </pic:blipFill>
-                  <pic:spPr>
-                    <a:xfrm>
-                      <a:off x="0" y="0"/>
-                      <a:ext cx="5164455" cy="8850630"/>
-                    </a:xfrm>
-                    <a:prstGeom prst="rect">
-                      <a:avLst/>
-                    </a:prstGeom>
-                  </pic:spPr>
-                </pic:pic>
-              </a:graphicData>
-            </a:graphic>
-          </wp:inline>
-        </w:drawing>
-      </w:r>
+      </w:del>
     </w:p>
     <w:p>
       <w:pPr>
@@ -3205,13 +3356,2045 @@
         </w:del>
       </w:ins>
       <w:ins w:id="20006" w:author="王哲" w:date="2026-08-26T00:00:00Z">
-        <w:r>
-          <w:rPr>
-            <w:rFonts w:hint="eastAsia"/>
-            <w:b/>
-            <w:bCs/>
-          </w:rPr>
-          <w:t xml:space="preserve">Figure 6. Comparison of target representation spaces derived from BioChemInsight patent data and the ChEMBL database. Each point corresponds to a therapeutic target from one source (two points per target: patent-derived and ChEMBL-derived), projected into two dimensions using UMAP (UMAP1 and UMAP2) based on feature vectors generated from Morgan fingerprints of compounds associated with each target. Red circles represent targets characterized from patent documents processed by BioChemInsight. Blue circles represent targets characterized from curated bioactivity records in the ChEMBL database. The two families of targets occupy distinct regions of the projection.</w:t>
+        <w:del w:id="20015" w:author="王哲" w:date="2026-08-26T12:00:00Z">
+          <w:r>
+            <w:rPr>
+              <w:rFonts w:hint="eastAsia"/>
+              <w:b/>
+              <w:bCs/>
+            </w:rPr>
+            <w:delText xml:space="preserve">Figure 6. Comparison of target representation spaces derived from BioChemInsight patent data and the ChEMBL database. Each point corresponds to a therapeutic target from one source (two points per target: patent-derived and ChEMBL-derived), projected into two dimensions using UMAP (UMAP1 and UMAP2) based on feature vectors generated from Morgan fingerprints of compounds associated with each target. Red circles represent targets characterized from patent documents processed by BioChemInsight. Blue circles represent targets characterized from curated bioactivity records in the ChEMBL database. The two families of targets occupy distinct regions of the projection.</w:delText>
+          </w:r>
+        </w:del>
+      </w:ins>
+      <w:ins w:id="20016" w:author="王哲" w:date="2026-08-26T12:00:00Z">
+        <w:r>
+          <w:t xml:space="preserve">Figure 7. Comparison of target representation spaces derived from BioChemInsight patent data and the ChEMBL database. For each target group with adequate coverage in both sources (14 of the 15 corpus target groups), compounds from both sources were pooled into a single feature vector per group and source (Morgan fingerprints, radius 2, 2,048 bits) and embedded in two dimensions with UMAP. Filled red circles, patent-derived groups (all valid compounds extracted by BioChemInsight); open blue circles, ChEMBL groups (up to 1,000 reported human actives per component target with IC₅₀/EC₅₀/Ki ≤ 100 µM); connected points belong to the same target group. UMAP parameters and per-group compound counts are provided in the ESI.</w:t>
+        </w:r>
+      </w:ins>
+    </w:p>
+    <w:p>
+      <w:pPr>
+        <w:pStyle w:val="2"/>
+        <w:numPr>
+          <w:ilvl w:val="0"/>
+          <w:numId w:val="3"/>
+        </w:numPr>
+      </w:pPr>
+      <w:ins w:id="20019" w:author="王哲" w:date="2026-08-26T12:00:00Z">
+        <w:r>
+          <w:t xml:space="preserve">Tier-Stratified Verification Statistics</w:t>
+        </w:r>
+      </w:ins>
+    </w:p>
+    <w:p>
+      <w:pPr>
+        <w:ind w:firstLine="480"/>
+      </w:pPr>
+      <w:ins w:id="20020" w:author="王哲" w:date="2026-08-26T12:00:00Z">
+        <w:r>
+          <w:t xml:space="preserve">Table 1 tabulates the verification results at full granularity and extends them to corpus-level error extrapolation. The per-patent validity tiers defined in the Methods concentrate errors exactly where decoding quality is lowest: the two upper tiers jointly carry 82.3% of all structure records (19,103 of 23,218) at a combined human-confirmed error rate of 0.5% (2 of 392 adjudicated picks), whereas the lowest tier—17 patents below 50% validity—pairs a 27.1% SMILES yield with a 12.0% confirmed error rate. Apportioning each tier’s pick-level error rate to its share of corpus records (ratio estimation) yields approximately 233 expected erroneous records corpus-wide (≈1.0%), consistent with the overall 1.2% pick-level rate. Because a patent’s tier is known immediately after decoding, before any human inspection, this stratification converts verification from a uniform-cost obligation into a targeted review budget concentrated on the small, low-validity fraction of the corpus.</w:t>
+        </w:r>
+      </w:ins>
+    </w:p>
+    <w:p>
+      <w:pPr>
+        <w:keepNext/>
+        <w:pStyle w:val="50"/>
+        <w:jc w:val="both"/>
+      </w:pPr>
+      <w:ins w:id="20021" w:author="王哲" w:date="2026-08-26T12:00:00Z">
+        <w:r>
+          <w:t xml:space="preserve">Table 1. Corpus extraction and verification statistics stratified by per-patent SMILES-validity tier. Picks are the compound-level extractions selected for human adjudication; error rates refer to human-confirmed pick errors with Wilson score 95% confidence intervals. Extrapolated errors apportion each tier’s pick-level error rate to its structure records (ratio estimation).</w:t>
+        </w:r>
+      </w:ins>
+    </w:p>
+    <w:tbl>
+      <w:tblPr>
+        <w:tblW w:w="8306" w:type="dxa"/>
+        <w:tblBorders>
+          <w:top w:val="single" w:sz="8" w:space="0" w:color="000000"/>
+          <w:bottom w:val="single" w:sz="8" w:space="0" w:color="000000"/>
+        </w:tblBorders>
+        <w:tblCellMar>
+          <w:left w:w="57" w:type="dxa"/>
+          <w:right w:w="57" w:type="dxa"/>
+        </w:tblCellMar>
+        <w:tblLayout w:type="fixed"/>
+      </w:tblPr>
+      <w:tblGrid>
+        <w:gridCol w:w="1200"/>
+        <w:gridCol w:w="1030"/>
+        <w:gridCol w:w="1040"/>
+        <w:gridCol w:w="1290"/>
+        <w:gridCol w:w="800"/>
+        <w:gridCol w:w="850"/>
+        <w:gridCol w:w="1190"/>
+        <w:gridCol w:w="906"/>
+      </w:tblGrid>
+      <w:tr>
+        <w:trPr>
+          <w:ins w:id="20030" w:author="王哲" w:date="2026-08-26T12:00:00Z"/>
+          <w:cantSplit/>
+          <w:tblHeader/>
+        </w:trPr>
+        <w:tc>
+          <w:tcPr>
+            <w:tcW w:w="1200" w:type="dxa"/>
+            <w:tcBorders>
+              <w:bottom w:val="single" w:sz="4" w:space="0" w:color="000000"/>
+            </w:tcBorders>
+            <w:vAlign w:val="center"/>
+          </w:tcPr>
+          <w:p>
+            <w:pPr>
+              <w:keepNext/>
+              <w:jc w:val="left"/>
+            </w:pPr>
+            <w:ins w:id="20022" w:author="王哲" w:date="2026-08-26T12:00:00Z">
+              <w:r>
+                <w:rPr>
+                  <w:rFonts w:ascii="Times New Roman" w:hAnsi="Times New Roman"/>
+                  <w:b/>
+                  <w:sz w:val="18"/>
+                  <w:szCs w:val="18"/>
+                </w:rPr>
+                <w:t xml:space="preserve">Tier</w:t>
+              </w:r>
+            </w:ins>
+          </w:p>
+        </w:tc>
+        <w:tc>
+          <w:tcPr>
+            <w:tcW w:w="1030" w:type="dxa"/>
+            <w:tcBorders>
+              <w:bottom w:val="single" w:sz="4" w:space="0" w:color="000000"/>
+            </w:tcBorders>
+            <w:vAlign w:val="center"/>
+          </w:tcPr>
+          <w:p>
+            <w:pPr>
+              <w:keepNext/>
+              <w:jc w:val="center"/>
+            </w:pPr>
+            <w:ins w:id="20023" w:author="王哲" w:date="2026-08-26T12:00:00Z">
+              <w:r>
+                <w:rPr>
+                  <w:rFonts w:ascii="Times New Roman" w:hAnsi="Times New Roman"/>
+                  <w:b/>
+                  <w:sz w:val="18"/>
+                  <w:szCs w:val="18"/>
+                </w:rPr>
+                <w:t xml:space="preserve">Patents</w:t>
+              </w:r>
+            </w:ins>
+          </w:p>
+        </w:tc>
+        <w:tc>
+          <w:tcPr>
+            <w:tcW w:w="1040" w:type="dxa"/>
+            <w:tcBorders>
+              <w:bottom w:val="single" w:sz="4" w:space="0" w:color="000000"/>
+            </w:tcBorders>
+            <w:vAlign w:val="center"/>
+          </w:tcPr>
+          <w:p>
+            <w:pPr>
+              <w:keepNext/>
+              <w:jc w:val="center"/>
+            </w:pPr>
+            <w:ins w:id="20024" w:author="王哲" w:date="2026-08-26T12:00:00Z">
+              <w:r>
+                <w:rPr>
+                  <w:rFonts w:ascii="Times New Roman" w:hAnsi="Times New Roman"/>
+                  <w:b/>
+                  <w:sz w:val="18"/>
+                  <w:szCs w:val="18"/>
+                </w:rPr>
+                <w:t xml:space="preserve">Records</w:t>
+              </w:r>
+            </w:ins>
+          </w:p>
+        </w:tc>
+        <w:tc>
+          <w:tcPr>
+            <w:tcW w:w="1290" w:type="dxa"/>
+            <w:tcBorders>
+              <w:bottom w:val="single" w:sz="4" w:space="0" w:color="000000"/>
+            </w:tcBorders>
+            <w:vAlign w:val="center"/>
+          </w:tcPr>
+          <w:p>
+            <w:pPr>
+              <w:keepNext/>
+              <w:jc w:val="center"/>
+            </w:pPr>
+            <w:ins w:id="20025" w:author="王哲" w:date="2026-08-26T12:00:00Z">
+              <w:r>
+                <w:rPr>
+                  <w:rFonts w:ascii="Times New Roman" w:hAnsi="Times New Roman"/>
+                  <w:b/>
+                  <w:sz w:val="18"/>
+                  <w:szCs w:val="18"/>
+                </w:rPr>
+                <w:t xml:space="preserve">Valid SMILES n (%)</w:t>
+              </w:r>
+            </w:ins>
+          </w:p>
+        </w:tc>
+        <w:tc>
+          <w:tcPr>
+            <w:tcW w:w="800" w:type="dxa"/>
+            <w:tcBorders>
+              <w:bottom w:val="single" w:sz="4" w:space="0" w:color="000000"/>
+            </w:tcBorders>
+            <w:vAlign w:val="center"/>
+          </w:tcPr>
+          <w:p>
+            <w:pPr>
+              <w:keepNext/>
+              <w:jc w:val="center"/>
+            </w:pPr>
+            <w:ins w:id="20026" w:author="王哲" w:date="2026-08-26T12:00:00Z">
+              <w:r>
+                <w:rPr>
+                  <w:rFonts w:ascii="Times New Roman" w:hAnsi="Times New Roman"/>
+                  <w:b/>
+                  <w:sz w:val="18"/>
+                  <w:szCs w:val="18"/>
+                </w:rPr>
+                <w:t xml:space="preserve">Picks</w:t>
+              </w:r>
+            </w:ins>
+          </w:p>
+        </w:tc>
+        <w:tc>
+          <w:tcPr>
+            <w:tcW w:w="850" w:type="dxa"/>
+            <w:tcBorders>
+              <w:bottom w:val="single" w:sz="4" w:space="0" w:color="000000"/>
+            </w:tcBorders>
+            <w:vAlign w:val="center"/>
+          </w:tcPr>
+          <w:p>
+            <w:pPr>
+              <w:keepNext/>
+              <w:jc w:val="center"/>
+            </w:pPr>
+            <w:ins w:id="20027" w:author="王哲" w:date="2026-08-26T12:00:00Z">
+              <w:r>
+                <w:rPr>
+                  <w:rFonts w:ascii="Times New Roman" w:hAnsi="Times New Roman"/>
+                  <w:b/>
+                  <w:sz w:val="18"/>
+                  <w:szCs w:val="18"/>
+                </w:rPr>
+                <w:t xml:space="preserve">Errors</w:t>
+              </w:r>
+            </w:ins>
+          </w:p>
+        </w:tc>
+        <w:tc>
+          <w:tcPr>
+            <w:tcW w:w="1190" w:type="dxa"/>
+            <w:tcBorders>
+              <w:bottom w:val="single" w:sz="4" w:space="0" w:color="000000"/>
+            </w:tcBorders>
+            <w:vAlign w:val="center"/>
+          </w:tcPr>
+          <w:p>
+            <w:pPr>
+              <w:keepNext/>
+              <w:jc w:val="center"/>
+            </w:pPr>
+            <w:ins w:id="20028" w:author="王哲" w:date="2026-08-26T12:00:00Z">
+              <w:r>
+                <w:rPr>
+                  <w:rFonts w:ascii="Times New Roman" w:hAnsi="Times New Roman"/>
+                  <w:b/>
+                  <w:sz w:val="18"/>
+                  <w:szCs w:val="18"/>
+                </w:rPr>
+                <w:t xml:space="preserve">Error rate % (95% CI)</w:t>
+              </w:r>
+            </w:ins>
+          </w:p>
+        </w:tc>
+        <w:tc>
+          <w:tcPr>
+            <w:tcW w:w="906" w:type="dxa"/>
+            <w:tcBorders>
+              <w:bottom w:val="single" w:sz="4" w:space="0" w:color="000000"/>
+            </w:tcBorders>
+            <w:vAlign w:val="center"/>
+          </w:tcPr>
+          <w:p>
+            <w:pPr>
+              <w:keepNext/>
+              <w:jc w:val="center"/>
+            </w:pPr>
+            <w:ins w:id="20029" w:author="王哲" w:date="2026-08-26T12:00:00Z">
+              <w:r>
+                <w:rPr>
+                  <w:rFonts w:ascii="Times New Roman" w:hAnsi="Times New Roman"/>
+                  <w:b/>
+                  <w:sz w:val="18"/>
+                  <w:szCs w:val="18"/>
+                </w:rPr>
+                <w:t xml:space="preserve">Extrap. errors</w:t>
+              </w:r>
+            </w:ins>
+          </w:p>
+        </w:tc>
+      </w:tr>
+      <w:tr>
+        <w:trPr>
+          <w:ins w:id="20039" w:author="王哲" w:date="2026-08-26T12:00:00Z"/>
+          <w:cantSplit/>
+        </w:trPr>
+        <w:tc>
+          <w:tcPr>
+            <w:tcW w:w="1200" w:type="dxa"/>
+            <w:vAlign w:val="center"/>
+          </w:tcPr>
+          <w:p>
+            <w:pPr>
+              <w:keepNext/>
+              <w:jc w:val="left"/>
+            </w:pPr>
+            <w:ins w:id="20031" w:author="王哲" w:date="2026-08-26T12:00:00Z">
+              <w:r>
+                <w:rPr>
+                  <w:rFonts w:ascii="Times New Roman" w:hAnsi="Times New Roman"/>
+                  <w:sz w:val="18"/>
+                  <w:szCs w:val="18"/>
+                </w:rPr>
+                <w:t xml:space="preserve">Highest (100%)</w:t>
+              </w:r>
+            </w:ins>
+          </w:p>
+        </w:tc>
+        <w:tc>
+          <w:tcPr>
+            <w:tcW w:w="1030" w:type="dxa"/>
+            <w:vAlign w:val="center"/>
+          </w:tcPr>
+          <w:p>
+            <w:pPr>
+              <w:keepNext/>
+              <w:jc w:val="center"/>
+            </w:pPr>
+            <w:ins w:id="20032" w:author="王哲" w:date="2026-08-26T12:00:00Z">
+              <w:r>
+                <w:rPr>
+                  <w:rFonts w:ascii="Times New Roman" w:hAnsi="Times New Roman"/>
+                  <w:sz w:val="18"/>
+                  <w:szCs w:val="18"/>
+                </w:rPr>
+                <w:t xml:space="preserve">57</w:t>
+              </w:r>
+            </w:ins>
+          </w:p>
+        </w:tc>
+        <w:tc>
+          <w:tcPr>
+            <w:tcW w:w="1040" w:type="dxa"/>
+            <w:vAlign w:val="center"/>
+          </w:tcPr>
+          <w:p>
+            <w:pPr>
+              <w:keepNext/>
+              <w:jc w:val="center"/>
+            </w:pPr>
+            <w:ins w:id="20033" w:author="王哲" w:date="2026-08-26T12:00:00Z">
+              <w:r>
+                <w:rPr>
+                  <w:rFonts w:ascii="Times New Roman" w:hAnsi="Times New Roman"/>
+                  <w:sz w:val="18"/>
+                  <w:szCs w:val="18"/>
+                </w:rPr>
+                <w:t xml:space="preserve">1,075</w:t>
+              </w:r>
+            </w:ins>
+          </w:p>
+        </w:tc>
+        <w:tc>
+          <w:tcPr>
+            <w:tcW w:w="1290" w:type="dxa"/>
+            <w:vAlign w:val="center"/>
+          </w:tcPr>
+          <w:p>
+            <w:pPr>
+              <w:keepNext/>
+              <w:jc w:val="center"/>
+            </w:pPr>
+            <w:ins w:id="20034" w:author="王哲" w:date="2026-08-26T12:00:00Z">
+              <w:r>
+                <w:rPr>
+                  <w:rFonts w:ascii="Times New Roman" w:hAnsi="Times New Roman"/>
+                  <w:sz w:val="18"/>
+                  <w:szCs w:val="18"/>
+                </w:rPr>
+                <w:t xml:space="preserve">1,075 (100.0)</w:t>
+              </w:r>
+            </w:ins>
+          </w:p>
+        </w:tc>
+        <w:tc>
+          <w:tcPr>
+            <w:tcW w:w="800" w:type="dxa"/>
+            <w:vAlign w:val="center"/>
+          </w:tcPr>
+          <w:p>
+            <w:pPr>
+              <w:keepNext/>
+              <w:jc w:val="center"/>
+            </w:pPr>
+            <w:ins w:id="20035" w:author="王哲" w:date="2026-08-26T12:00:00Z">
+              <w:r>
+                <w:rPr>
+                  <w:rFonts w:ascii="Times New Roman" w:hAnsi="Times New Roman"/>
+                  <w:sz w:val="18"/>
+                  <w:szCs w:val="18"/>
+                </w:rPr>
+                <w:t xml:space="preserve">87</w:t>
+              </w:r>
+            </w:ins>
+          </w:p>
+        </w:tc>
+        <w:tc>
+          <w:tcPr>
+            <w:tcW w:w="850" w:type="dxa"/>
+            <w:vAlign w:val="center"/>
+          </w:tcPr>
+          <w:p>
+            <w:pPr>
+              <w:keepNext/>
+              <w:jc w:val="center"/>
+            </w:pPr>
+            <w:ins w:id="20036" w:author="王哲" w:date="2026-08-26T12:00:00Z">
+              <w:r>
+                <w:rPr>
+                  <w:rFonts w:ascii="Times New Roman" w:hAnsi="Times New Roman"/>
+                  <w:sz w:val="18"/>
+                  <w:szCs w:val="18"/>
+                </w:rPr>
+                <w:t xml:space="preserve">0</w:t>
+              </w:r>
+            </w:ins>
+          </w:p>
+        </w:tc>
+        <w:tc>
+          <w:tcPr>
+            <w:tcW w:w="1190" w:type="dxa"/>
+            <w:vAlign w:val="center"/>
+          </w:tcPr>
+          <w:p>
+            <w:pPr>
+              <w:keepNext/>
+              <w:jc w:val="center"/>
+            </w:pPr>
+            <w:ins w:id="20037" w:author="王哲" w:date="2026-08-26T12:00:00Z">
+              <w:r>
+                <w:rPr>
+                  <w:rFonts w:ascii="Times New Roman" w:hAnsi="Times New Roman"/>
+                  <w:sz w:val="18"/>
+                  <w:szCs w:val="18"/>
+                </w:rPr>
+                <w:t xml:space="preserve">0.0 (0.0–4.2)</w:t>
+              </w:r>
+            </w:ins>
+          </w:p>
+        </w:tc>
+        <w:tc>
+          <w:tcPr>
+            <w:tcW w:w="906" w:type="dxa"/>
+            <w:vAlign w:val="center"/>
+          </w:tcPr>
+          <w:p>
+            <w:pPr>
+              <w:keepNext/>
+              <w:jc w:val="center"/>
+            </w:pPr>
+            <w:ins w:id="20038" w:author="王哲" w:date="2026-08-26T12:00:00Z">
+              <w:r>
+                <w:rPr>
+                  <w:rFonts w:ascii="Times New Roman" w:hAnsi="Times New Roman"/>
+                  <w:sz w:val="18"/>
+                  <w:szCs w:val="18"/>
+                </w:rPr>
+                <w:t xml:space="preserve">0</w:t>
+              </w:r>
+            </w:ins>
+          </w:p>
+        </w:tc>
+      </w:tr>
+      <w:tr>
+        <w:trPr>
+          <w:ins w:id="20048" w:author="王哲" w:date="2026-08-26T12:00:00Z"/>
+          <w:cantSplit/>
+        </w:trPr>
+        <w:tc>
+          <w:tcPr>
+            <w:tcW w:w="1200" w:type="dxa"/>
+            <w:vAlign w:val="center"/>
+          </w:tcPr>
+          <w:p>
+            <w:pPr>
+              <w:keepNext/>
+              <w:jc w:val="left"/>
+            </w:pPr>
+            <w:ins w:id="20040" w:author="王哲" w:date="2026-08-26T12:00:00Z">
+              <w:r>
+                <w:rPr>
+                  <w:rFonts w:ascii="Times New Roman" w:hAnsi="Times New Roman"/>
+                  <w:sz w:val="18"/>
+                  <w:szCs w:val="18"/>
+                </w:rPr>
+                <w:t xml:space="preserve">High (80–99%)</w:t>
+              </w:r>
+            </w:ins>
+          </w:p>
+        </w:tc>
+        <w:tc>
+          <w:tcPr>
+            <w:tcW w:w="1030" w:type="dxa"/>
+            <w:vAlign w:val="center"/>
+          </w:tcPr>
+          <w:p>
+            <w:pPr>
+              <w:keepNext/>
+              <w:jc w:val="center"/>
+            </w:pPr>
+            <w:ins w:id="20041" w:author="王哲" w:date="2026-08-26T12:00:00Z">
+              <w:r>
+                <w:rPr>
+                  <w:rFonts w:ascii="Times New Roman" w:hAnsi="Times New Roman"/>
+                  <w:sz w:val="18"/>
+                  <w:szCs w:val="18"/>
+                </w:rPr>
+                <w:t xml:space="preserve">168</w:t>
+              </w:r>
+            </w:ins>
+          </w:p>
+        </w:tc>
+        <w:tc>
+          <w:tcPr>
+            <w:tcW w:w="1040" w:type="dxa"/>
+            <w:vAlign w:val="center"/>
+          </w:tcPr>
+          <w:p>
+            <w:pPr>
+              <w:keepNext/>
+              <w:jc w:val="center"/>
+            </w:pPr>
+            <w:ins w:id="20042" w:author="王哲" w:date="2026-08-26T12:00:00Z">
+              <w:r>
+                <w:rPr>
+                  <w:rFonts w:ascii="Times New Roman" w:hAnsi="Times New Roman"/>
+                  <w:sz w:val="18"/>
+                  <w:szCs w:val="18"/>
+                </w:rPr>
+                <w:t xml:space="preserve">18,028</w:t>
+              </w:r>
+            </w:ins>
+          </w:p>
+        </w:tc>
+        <w:tc>
+          <w:tcPr>
+            <w:tcW w:w="1290" w:type="dxa"/>
+            <w:vAlign w:val="center"/>
+          </w:tcPr>
+          <w:p>
+            <w:pPr>
+              <w:keepNext/>
+              <w:jc w:val="center"/>
+            </w:pPr>
+            <w:ins w:id="20043" w:author="王哲" w:date="2026-08-26T12:00:00Z">
+              <w:r>
+                <w:rPr>
+                  <w:rFonts w:ascii="Times New Roman" w:hAnsi="Times New Roman"/>
+                  <w:sz w:val="18"/>
+                  <w:szCs w:val="18"/>
+                </w:rPr>
+                <w:t xml:space="preserve">16,619 (92.2)</w:t>
+              </w:r>
+            </w:ins>
+          </w:p>
+        </w:tc>
+        <w:tc>
+          <w:tcPr>
+            <w:tcW w:w="800" w:type="dxa"/>
+            <w:vAlign w:val="center"/>
+          </w:tcPr>
+          <w:p>
+            <w:pPr>
+              <w:keepNext/>
+              <w:jc w:val="center"/>
+            </w:pPr>
+            <w:ins w:id="20044" w:author="王哲" w:date="2026-08-26T12:00:00Z">
+              <w:r>
+                <w:rPr>
+                  <w:rFonts w:ascii="Times New Roman" w:hAnsi="Times New Roman"/>
+                  <w:sz w:val="18"/>
+                  <w:szCs w:val="18"/>
+                </w:rPr>
+                <w:t xml:space="preserve">305</w:t>
+              </w:r>
+            </w:ins>
+          </w:p>
+        </w:tc>
+        <w:tc>
+          <w:tcPr>
+            <w:tcW w:w="850" w:type="dxa"/>
+            <w:vAlign w:val="center"/>
+          </w:tcPr>
+          <w:p>
+            <w:pPr>
+              <w:keepNext/>
+              <w:jc w:val="center"/>
+            </w:pPr>
+            <w:ins w:id="20045" w:author="王哲" w:date="2026-08-26T12:00:00Z">
+              <w:r>
+                <w:rPr>
+                  <w:rFonts w:ascii="Times New Roman" w:hAnsi="Times New Roman"/>
+                  <w:sz w:val="18"/>
+                  <w:szCs w:val="18"/>
+                </w:rPr>
+                <w:t xml:space="preserve">2</w:t>
+              </w:r>
+            </w:ins>
+          </w:p>
+        </w:tc>
+        <w:tc>
+          <w:tcPr>
+            <w:tcW w:w="1190" w:type="dxa"/>
+            <w:vAlign w:val="center"/>
+          </w:tcPr>
+          <w:p>
+            <w:pPr>
+              <w:keepNext/>
+              <w:jc w:val="center"/>
+            </w:pPr>
+            <w:ins w:id="20046" w:author="王哲" w:date="2026-08-26T12:00:00Z">
+              <w:r>
+                <w:rPr>
+                  <w:rFonts w:ascii="Times New Roman" w:hAnsi="Times New Roman"/>
+                  <w:sz w:val="18"/>
+                  <w:szCs w:val="18"/>
+                </w:rPr>
+                <w:t xml:space="preserve">0.7 (0.2–2.4)</w:t>
+              </w:r>
+            </w:ins>
+          </w:p>
+        </w:tc>
+        <w:tc>
+          <w:tcPr>
+            <w:tcW w:w="906" w:type="dxa"/>
+            <w:vAlign w:val="center"/>
+          </w:tcPr>
+          <w:p>
+            <w:pPr>
+              <w:keepNext/>
+              <w:jc w:val="center"/>
+            </w:pPr>
+            <w:ins w:id="20047" w:author="王哲" w:date="2026-08-26T12:00:00Z">
+              <w:r>
+                <w:rPr>
+                  <w:rFonts w:ascii="Times New Roman" w:hAnsi="Times New Roman"/>
+                  <w:sz w:val="18"/>
+                  <w:szCs w:val="18"/>
+                </w:rPr>
+                <w:t xml:space="preserve">118</w:t>
+              </w:r>
+            </w:ins>
+          </w:p>
+        </w:tc>
+      </w:tr>
+      <w:tr>
+        <w:trPr>
+          <w:ins w:id="20057" w:author="王哲" w:date="2026-08-26T12:00:00Z"/>
+          <w:cantSplit/>
+        </w:trPr>
+        <w:tc>
+          <w:tcPr>
+            <w:tcW w:w="1200" w:type="dxa"/>
+            <w:vAlign w:val="center"/>
+          </w:tcPr>
+          <w:p>
+            <w:pPr>
+              <w:keepNext/>
+              <w:jc w:val="left"/>
+            </w:pPr>
+            <w:ins w:id="20049" w:author="王哲" w:date="2026-08-26T12:00:00Z">
+              <w:r>
+                <w:rPr>
+                  <w:rFonts w:ascii="Times New Roman" w:hAnsi="Times New Roman"/>
+                  <w:sz w:val="18"/>
+                  <w:szCs w:val="18"/>
+                </w:rPr>
+                <w:t xml:space="preserve">Mid (50–79%)</w:t>
+              </w:r>
+            </w:ins>
+          </w:p>
+        </w:tc>
+        <w:tc>
+          <w:tcPr>
+            <w:tcW w:w="1030" w:type="dxa"/>
+            <w:vAlign w:val="center"/>
+          </w:tcPr>
+          <w:p>
+            <w:pPr>
+              <w:keepNext/>
+              <w:jc w:val="center"/>
+            </w:pPr>
+            <w:ins w:id="20050" w:author="王哲" w:date="2026-08-26T12:00:00Z">
+              <w:r>
+                <w:rPr>
+                  <w:rFonts w:ascii="Times New Roman" w:hAnsi="Times New Roman"/>
+                  <w:sz w:val="18"/>
+                  <w:szCs w:val="18"/>
+                </w:rPr>
+                <w:t xml:space="preserve">51</w:t>
+              </w:r>
+            </w:ins>
+          </w:p>
+        </w:tc>
+        <w:tc>
+          <w:tcPr>
+            <w:tcW w:w="1040" w:type="dxa"/>
+            <w:vAlign w:val="center"/>
+          </w:tcPr>
+          <w:p>
+            <w:pPr>
+              <w:keepNext/>
+              <w:jc w:val="center"/>
+            </w:pPr>
+            <w:ins w:id="20051" w:author="王哲" w:date="2026-08-26T12:00:00Z">
+              <w:r>
+                <w:rPr>
+                  <w:rFonts w:ascii="Times New Roman" w:hAnsi="Times New Roman"/>
+                  <w:sz w:val="18"/>
+                  <w:szCs w:val="18"/>
+                </w:rPr>
+                <w:t xml:space="preserve">3,492</w:t>
+              </w:r>
+            </w:ins>
+          </w:p>
+        </w:tc>
+        <w:tc>
+          <w:tcPr>
+            <w:tcW w:w="1290" w:type="dxa"/>
+            <w:vAlign w:val="center"/>
+          </w:tcPr>
+          <w:p>
+            <w:pPr>
+              <w:keepNext/>
+              <w:jc w:val="center"/>
+            </w:pPr>
+            <w:ins w:id="20052" w:author="王哲" w:date="2026-08-26T12:00:00Z">
+              <w:r>
+                <w:rPr>
+                  <w:rFonts w:ascii="Times New Roman" w:hAnsi="Times New Roman"/>
+                  <w:sz w:val="18"/>
+                  <w:szCs w:val="18"/>
+                </w:rPr>
+                <w:t xml:space="preserve">2,402 (68.8)</w:t>
+              </w:r>
+            </w:ins>
+          </w:p>
+        </w:tc>
+        <w:tc>
+          <w:tcPr>
+            <w:tcW w:w="800" w:type="dxa"/>
+            <w:vAlign w:val="center"/>
+          </w:tcPr>
+          <w:p>
+            <w:pPr>
+              <w:keepNext/>
+              <w:jc w:val="center"/>
+            </w:pPr>
+            <w:ins w:id="20053" w:author="王哲" w:date="2026-08-26T12:00:00Z">
+              <w:r>
+                <w:rPr>
+                  <w:rFonts w:ascii="Times New Roman" w:hAnsi="Times New Roman"/>
+                  <w:sz w:val="18"/>
+                  <w:szCs w:val="18"/>
+                </w:rPr>
+                <w:t xml:space="preserve">88</w:t>
+              </w:r>
+            </w:ins>
+          </w:p>
+        </w:tc>
+        <w:tc>
+          <w:tcPr>
+            <w:tcW w:w="850" w:type="dxa"/>
+            <w:vAlign w:val="center"/>
+          </w:tcPr>
+          <w:p>
+            <w:pPr>
+              <w:keepNext/>
+              <w:jc w:val="center"/>
+            </w:pPr>
+            <w:ins w:id="20054" w:author="王哲" w:date="2026-08-26T12:00:00Z">
+              <w:r>
+                <w:rPr>
+                  <w:rFonts w:ascii="Times New Roman" w:hAnsi="Times New Roman"/>
+                  <w:sz w:val="18"/>
+                  <w:szCs w:val="18"/>
+                </w:rPr>
+                <w:t xml:space="preserve">1</w:t>
+              </w:r>
+            </w:ins>
+          </w:p>
+        </w:tc>
+        <w:tc>
+          <w:tcPr>
+            <w:tcW w:w="1190" w:type="dxa"/>
+            <w:vAlign w:val="center"/>
+          </w:tcPr>
+          <w:p>
+            <w:pPr>
+              <w:keepNext/>
+              <w:jc w:val="center"/>
+            </w:pPr>
+            <w:ins w:id="20055" w:author="王哲" w:date="2026-08-26T12:00:00Z">
+              <w:r>
+                <w:rPr>
+                  <w:rFonts w:ascii="Times New Roman" w:hAnsi="Times New Roman"/>
+                  <w:sz w:val="18"/>
+                  <w:szCs w:val="18"/>
+                </w:rPr>
+                <w:t xml:space="preserve">1.1 (0.2–6.2)</w:t>
+              </w:r>
+            </w:ins>
+          </w:p>
+        </w:tc>
+        <w:tc>
+          <w:tcPr>
+            <w:tcW w:w="906" w:type="dxa"/>
+            <w:vAlign w:val="center"/>
+          </w:tcPr>
+          <w:p>
+            <w:pPr>
+              <w:keepNext/>
+              <w:jc w:val="center"/>
+            </w:pPr>
+            <w:ins w:id="20056" w:author="王哲" w:date="2026-08-26T12:00:00Z">
+              <w:r>
+                <w:rPr>
+                  <w:rFonts w:ascii="Times New Roman" w:hAnsi="Times New Roman"/>
+                  <w:sz w:val="18"/>
+                  <w:szCs w:val="18"/>
+                </w:rPr>
+                <w:t xml:space="preserve">40</w:t>
+              </w:r>
+            </w:ins>
+          </w:p>
+        </w:tc>
+      </w:tr>
+      <w:tr>
+        <w:trPr>
+          <w:ins w:id="20066" w:author="王哲" w:date="2026-08-26T12:00:00Z"/>
+          <w:cantSplit/>
+        </w:trPr>
+        <w:tc>
+          <w:tcPr>
+            <w:tcW w:w="1200" w:type="dxa"/>
+            <w:vAlign w:val="center"/>
+          </w:tcPr>
+          <w:p>
+            <w:pPr>
+              <w:keepNext/>
+              <w:jc w:val="left"/>
+            </w:pPr>
+            <w:ins w:id="20058" w:author="王哲" w:date="2026-08-26T12:00:00Z">
+              <w:r>
+                <w:rPr>
+                  <w:rFonts w:ascii="Times New Roman" w:hAnsi="Times New Roman"/>
+                  <w:sz w:val="18"/>
+                  <w:szCs w:val="18"/>
+                </w:rPr>
+                <w:t xml:space="preserve">Lowest (&lt;50%)</w:t>
+              </w:r>
+            </w:ins>
+          </w:p>
+        </w:tc>
+        <w:tc>
+          <w:tcPr>
+            <w:tcW w:w="1030" w:type="dxa"/>
+            <w:vAlign w:val="center"/>
+          </w:tcPr>
+          <w:p>
+            <w:pPr>
+              <w:keepNext/>
+              <w:jc w:val="center"/>
+            </w:pPr>
+            <w:ins w:id="20059" w:author="王哲" w:date="2026-08-26T12:00:00Z">
+              <w:r>
+                <w:rPr>
+                  <w:rFonts w:ascii="Times New Roman" w:hAnsi="Times New Roman"/>
+                  <w:sz w:val="18"/>
+                  <w:szCs w:val="18"/>
+                </w:rPr>
+                <w:t xml:space="preserve">17</w:t>
+              </w:r>
+            </w:ins>
+          </w:p>
+        </w:tc>
+        <w:tc>
+          <w:tcPr>
+            <w:tcW w:w="1040" w:type="dxa"/>
+            <w:vAlign w:val="center"/>
+          </w:tcPr>
+          <w:p>
+            <w:pPr>
+              <w:keepNext/>
+              <w:jc w:val="center"/>
+            </w:pPr>
+            <w:ins w:id="20060" w:author="王哲" w:date="2026-08-26T12:00:00Z">
+              <w:r>
+                <w:rPr>
+                  <w:rFonts w:ascii="Times New Roman" w:hAnsi="Times New Roman"/>
+                  <w:sz w:val="18"/>
+                  <w:szCs w:val="18"/>
+                </w:rPr>
+                <w:t xml:space="preserve">623</w:t>
+              </w:r>
+            </w:ins>
+          </w:p>
+        </w:tc>
+        <w:tc>
+          <w:tcPr>
+            <w:tcW w:w="1290" w:type="dxa"/>
+            <w:vAlign w:val="center"/>
+          </w:tcPr>
+          <w:p>
+            <w:pPr>
+              <w:keepNext/>
+              <w:jc w:val="center"/>
+            </w:pPr>
+            <w:ins w:id="20061" w:author="王哲" w:date="2026-08-26T12:00:00Z">
+              <w:r>
+                <w:rPr>
+                  <w:rFonts w:ascii="Times New Roman" w:hAnsi="Times New Roman"/>
+                  <w:sz w:val="18"/>
+                  <w:szCs w:val="18"/>
+                </w:rPr>
+                <w:t xml:space="preserve">169 (27.1)</w:t>
+              </w:r>
+            </w:ins>
+          </w:p>
+        </w:tc>
+        <w:tc>
+          <w:tcPr>
+            <w:tcW w:w="800" w:type="dxa"/>
+            <w:vAlign w:val="center"/>
+          </w:tcPr>
+          <w:p>
+            <w:pPr>
+              <w:keepNext/>
+              <w:jc w:val="center"/>
+            </w:pPr>
+            <w:ins w:id="20062" w:author="王哲" w:date="2026-08-26T12:00:00Z">
+              <w:r>
+                <w:rPr>
+                  <w:rFonts w:ascii="Times New Roman" w:hAnsi="Times New Roman"/>
+                  <w:sz w:val="18"/>
+                  <w:szCs w:val="18"/>
+                </w:rPr>
+                <w:t xml:space="preserve">25</w:t>
+              </w:r>
+            </w:ins>
+          </w:p>
+        </w:tc>
+        <w:tc>
+          <w:tcPr>
+            <w:tcW w:w="850" w:type="dxa"/>
+            <w:vAlign w:val="center"/>
+          </w:tcPr>
+          <w:p>
+            <w:pPr>
+              <w:keepNext/>
+              <w:jc w:val="center"/>
+            </w:pPr>
+            <w:ins w:id="20063" w:author="王哲" w:date="2026-08-26T12:00:00Z">
+              <w:r>
+                <w:rPr>
+                  <w:rFonts w:ascii="Times New Roman" w:hAnsi="Times New Roman"/>
+                  <w:sz w:val="18"/>
+                  <w:szCs w:val="18"/>
+                </w:rPr>
+                <w:t xml:space="preserve">3</w:t>
+              </w:r>
+            </w:ins>
+          </w:p>
+        </w:tc>
+        <w:tc>
+          <w:tcPr>
+            <w:tcW w:w="1190" w:type="dxa"/>
+            <w:vAlign w:val="center"/>
+          </w:tcPr>
+          <w:p>
+            <w:pPr>
+              <w:keepNext/>
+              <w:jc w:val="center"/>
+            </w:pPr>
+            <w:ins w:id="20064" w:author="王哲" w:date="2026-08-26T12:00:00Z">
+              <w:r>
+                <w:rPr>
+                  <w:rFonts w:ascii="Times New Roman" w:hAnsi="Times New Roman"/>
+                  <w:sz w:val="18"/>
+                  <w:szCs w:val="18"/>
+                </w:rPr>
+                <w:t xml:space="preserve">12.0 (4.2–30.0)</w:t>
+              </w:r>
+            </w:ins>
+          </w:p>
+        </w:tc>
+        <w:tc>
+          <w:tcPr>
+            <w:tcW w:w="906" w:type="dxa"/>
+            <w:vAlign w:val="center"/>
+          </w:tcPr>
+          <w:p>
+            <w:pPr>
+              <w:keepNext/>
+              <w:jc w:val="center"/>
+            </w:pPr>
+            <w:ins w:id="20065" w:author="王哲" w:date="2026-08-26T12:00:00Z">
+              <w:r>
+                <w:rPr>
+                  <w:rFonts w:ascii="Times New Roman" w:hAnsi="Times New Roman"/>
+                  <w:sz w:val="18"/>
+                  <w:szCs w:val="18"/>
+                </w:rPr>
+                <w:t xml:space="preserve">75</w:t>
+              </w:r>
+            </w:ins>
+          </w:p>
+        </w:tc>
+      </w:tr>
+      <w:tr>
+        <w:trPr>
+          <w:ins w:id="20075" w:author="王哲" w:date="2026-08-26T12:00:00Z"/>
+          <w:cantSplit/>
+        </w:trPr>
+        <w:tc>
+          <w:tcPr>
+            <w:tcW w:w="1200" w:type="dxa"/>
+            <w:vAlign w:val="center"/>
+          </w:tcPr>
+          <w:p>
+            <w:pPr>
+              <w:keepNext/>
+              <w:jc w:val="left"/>
+            </w:pPr>
+            <w:ins w:id="20067" w:author="王哲" w:date="2026-08-26T12:00:00Z">
+              <w:r>
+                <w:rPr>
+                  <w:rFonts w:ascii="Times New Roman" w:hAnsi="Times New Roman"/>
+                  <w:sz w:val="18"/>
+                  <w:szCs w:val="18"/>
+                </w:rPr>
+                <w:t xml:space="preserve">Zero (none)</w:t>
+              </w:r>
+            </w:ins>
+          </w:p>
+        </w:tc>
+        <w:tc>
+          <w:tcPr>
+            <w:tcW w:w="1030" w:type="dxa"/>
+            <w:vAlign w:val="center"/>
+          </w:tcPr>
+          <w:p>
+            <w:pPr>
+              <w:keepNext/>
+              <w:jc w:val="center"/>
+            </w:pPr>
+            <w:ins w:id="20068" w:author="王哲" w:date="2026-08-26T12:00:00Z">
+              <w:r>
+                <w:rPr>
+                  <w:rFonts w:ascii="Times New Roman" w:hAnsi="Times New Roman"/>
+                  <w:sz w:val="18"/>
+                  <w:szCs w:val="18"/>
+                </w:rPr>
+                <w:t xml:space="preserve">3</w:t>
+              </w:r>
+            </w:ins>
+          </w:p>
+        </w:tc>
+        <w:tc>
+          <w:tcPr>
+            <w:tcW w:w="1040" w:type="dxa"/>
+            <w:vAlign w:val="center"/>
+          </w:tcPr>
+          <w:p>
+            <w:pPr>
+              <w:keepNext/>
+              <w:jc w:val="center"/>
+            </w:pPr>
+            <w:ins w:id="20069" w:author="王哲" w:date="2026-08-26T12:00:00Z">
+              <w:r>
+                <w:rPr>
+                  <w:rFonts w:ascii="Times New Roman" w:hAnsi="Times New Roman"/>
+                  <w:sz w:val="18"/>
+                  <w:szCs w:val="18"/>
+                </w:rPr>
+                <w:t xml:space="preserve">0</w:t>
+              </w:r>
+            </w:ins>
+          </w:p>
+        </w:tc>
+        <w:tc>
+          <w:tcPr>
+            <w:tcW w:w="1290" w:type="dxa"/>
+            <w:vAlign w:val="center"/>
+          </w:tcPr>
+          <w:p>
+            <w:pPr>
+              <w:keepNext/>
+              <w:jc w:val="center"/>
+            </w:pPr>
+            <w:ins w:id="20070" w:author="王哲" w:date="2026-08-26T12:00:00Z">
+              <w:r>
+                <w:rPr>
+                  <w:rFonts w:ascii="Times New Roman" w:hAnsi="Times New Roman"/>
+                  <w:sz w:val="18"/>
+                  <w:szCs w:val="18"/>
+                </w:rPr>
+                <w:t xml:space="preserve">0 (–)</w:t>
+              </w:r>
+            </w:ins>
+          </w:p>
+        </w:tc>
+        <w:tc>
+          <w:tcPr>
+            <w:tcW w:w="800" w:type="dxa"/>
+            <w:vAlign w:val="center"/>
+          </w:tcPr>
+          <w:p>
+            <w:pPr>
+              <w:keepNext/>
+              <w:jc w:val="center"/>
+            </w:pPr>
+            <w:ins w:id="20071" w:author="王哲" w:date="2026-08-26T12:00:00Z">
+              <w:r>
+                <w:rPr>
+                  <w:rFonts w:ascii="Times New Roman" w:hAnsi="Times New Roman"/>
+                  <w:sz w:val="18"/>
+                  <w:szCs w:val="18"/>
+                </w:rPr>
+                <w:t xml:space="preserve">0</w:t>
+              </w:r>
+            </w:ins>
+          </w:p>
+        </w:tc>
+        <w:tc>
+          <w:tcPr>
+            <w:tcW w:w="850" w:type="dxa"/>
+            <w:vAlign w:val="center"/>
+          </w:tcPr>
+          <w:p>
+            <w:pPr>
+              <w:keepNext/>
+              <w:jc w:val="center"/>
+            </w:pPr>
+            <w:ins w:id="20072" w:author="王哲" w:date="2026-08-26T12:00:00Z">
+              <w:r>
+                <w:rPr>
+                  <w:rFonts w:ascii="Times New Roman" w:hAnsi="Times New Roman"/>
+                  <w:sz w:val="18"/>
+                  <w:szCs w:val="18"/>
+                </w:rPr>
+                <w:t xml:space="preserve">0</w:t>
+              </w:r>
+            </w:ins>
+          </w:p>
+        </w:tc>
+        <w:tc>
+          <w:tcPr>
+            <w:tcW w:w="1190" w:type="dxa"/>
+            <w:vAlign w:val="center"/>
+          </w:tcPr>
+          <w:p>
+            <w:pPr>
+              <w:keepNext/>
+              <w:jc w:val="center"/>
+            </w:pPr>
+            <w:ins w:id="20073" w:author="王哲" w:date="2026-08-26T12:00:00Z">
+              <w:r>
+                <w:rPr>
+                  <w:rFonts w:ascii="Times New Roman" w:hAnsi="Times New Roman"/>
+                  <w:sz w:val="18"/>
+                  <w:szCs w:val="18"/>
+                </w:rPr>
+                <w:t xml:space="preserve">–</w:t>
+              </w:r>
+            </w:ins>
+          </w:p>
+        </w:tc>
+        <w:tc>
+          <w:tcPr>
+            <w:tcW w:w="906" w:type="dxa"/>
+            <w:vAlign w:val="center"/>
+          </w:tcPr>
+          <w:p>
+            <w:pPr>
+              <w:keepNext/>
+              <w:jc w:val="center"/>
+            </w:pPr>
+            <w:ins w:id="20074" w:author="王哲" w:date="2026-08-26T12:00:00Z">
+              <w:r>
+                <w:rPr>
+                  <w:rFonts w:ascii="Times New Roman" w:hAnsi="Times New Roman"/>
+                  <w:sz w:val="18"/>
+                  <w:szCs w:val="18"/>
+                </w:rPr>
+                <w:t xml:space="preserve">0</w:t>
+              </w:r>
+            </w:ins>
+          </w:p>
+        </w:tc>
+      </w:tr>
+      <w:tr>
+        <w:trPr>
+          <w:ins w:id="20084" w:author="王哲" w:date="2026-08-26T12:00:00Z"/>
+          <w:cantSplit/>
+        </w:trPr>
+        <w:tc>
+          <w:tcPr>
+            <w:tcW w:w="1200" w:type="dxa"/>
+            <w:tcBorders>
+              <w:top w:val="single" w:sz="4" w:space="0" w:color="000000"/>
+            </w:tcBorders>
+            <w:vAlign w:val="center"/>
+          </w:tcPr>
+          <w:p>
+            <w:pPr>
+              <w:jc w:val="left"/>
+            </w:pPr>
+            <w:ins w:id="20076" w:author="王哲" w:date="2026-08-26T12:00:00Z">
+              <w:r>
+                <w:rPr>
+                  <w:rFonts w:ascii="Times New Roman" w:hAnsi="Times New Roman"/>
+                  <w:b/>
+                  <w:sz w:val="18"/>
+                  <w:szCs w:val="18"/>
+                </w:rPr>
+                <w:t xml:space="preserve">All tiers</w:t>
+              </w:r>
+            </w:ins>
+          </w:p>
+        </w:tc>
+        <w:tc>
+          <w:tcPr>
+            <w:tcW w:w="1030" w:type="dxa"/>
+            <w:tcBorders>
+              <w:top w:val="single" w:sz="4" w:space="0" w:color="000000"/>
+            </w:tcBorders>
+            <w:vAlign w:val="center"/>
+          </w:tcPr>
+          <w:p>
+            <w:pPr>
+              <w:jc w:val="center"/>
+            </w:pPr>
+            <w:ins w:id="20077" w:author="王哲" w:date="2026-08-26T12:00:00Z">
+              <w:r>
+                <w:rPr>
+                  <w:rFonts w:ascii="Times New Roman" w:hAnsi="Times New Roman"/>
+                  <w:b/>
+                  <w:sz w:val="18"/>
+                  <w:szCs w:val="18"/>
+                </w:rPr>
+                <w:t xml:space="preserve">296</w:t>
+              </w:r>
+            </w:ins>
+          </w:p>
+        </w:tc>
+        <w:tc>
+          <w:tcPr>
+            <w:tcW w:w="1040" w:type="dxa"/>
+            <w:tcBorders>
+              <w:top w:val="single" w:sz="4" w:space="0" w:color="000000"/>
+            </w:tcBorders>
+            <w:vAlign w:val="center"/>
+          </w:tcPr>
+          <w:p>
+            <w:pPr>
+              <w:jc w:val="center"/>
+            </w:pPr>
+            <w:ins w:id="20078" w:author="王哲" w:date="2026-08-26T12:00:00Z">
+              <w:r>
+                <w:rPr>
+                  <w:rFonts w:ascii="Times New Roman" w:hAnsi="Times New Roman"/>
+                  <w:b/>
+                  <w:sz w:val="18"/>
+                  <w:szCs w:val="18"/>
+                </w:rPr>
+                <w:t xml:space="preserve">23,218</w:t>
+              </w:r>
+            </w:ins>
+          </w:p>
+        </w:tc>
+        <w:tc>
+          <w:tcPr>
+            <w:tcW w:w="1290" w:type="dxa"/>
+            <w:tcBorders>
+              <w:top w:val="single" w:sz="4" w:space="0" w:color="000000"/>
+            </w:tcBorders>
+            <w:vAlign w:val="center"/>
+          </w:tcPr>
+          <w:p>
+            <w:pPr>
+              <w:jc w:val="center"/>
+            </w:pPr>
+            <w:ins w:id="20079" w:author="王哲" w:date="2026-08-26T12:00:00Z">
+              <w:r>
+                <w:rPr>
+                  <w:rFonts w:ascii="Times New Roman" w:hAnsi="Times New Roman"/>
+                  <w:b/>
+                  <w:sz w:val="18"/>
+                  <w:szCs w:val="18"/>
+                </w:rPr>
+                <w:t xml:space="preserve">20,265 (87.3)</w:t>
+              </w:r>
+            </w:ins>
+          </w:p>
+        </w:tc>
+        <w:tc>
+          <w:tcPr>
+            <w:tcW w:w="800" w:type="dxa"/>
+            <w:tcBorders>
+              <w:top w:val="single" w:sz="4" w:space="0" w:color="000000"/>
+            </w:tcBorders>
+            <w:vAlign w:val="center"/>
+          </w:tcPr>
+          <w:p>
+            <w:pPr>
+              <w:jc w:val="center"/>
+            </w:pPr>
+            <w:ins w:id="20080" w:author="王哲" w:date="2026-08-26T12:00:00Z">
+              <w:r>
+                <w:rPr>
+                  <w:rFonts w:ascii="Times New Roman" w:hAnsi="Times New Roman"/>
+                  <w:b/>
+                  <w:sz w:val="18"/>
+                  <w:szCs w:val="18"/>
+                </w:rPr>
+                <w:t xml:space="preserve">505</w:t>
+              </w:r>
+            </w:ins>
+          </w:p>
+        </w:tc>
+        <w:tc>
+          <w:tcPr>
+            <w:tcW w:w="850" w:type="dxa"/>
+            <w:tcBorders>
+              <w:top w:val="single" w:sz="4" w:space="0" w:color="000000"/>
+            </w:tcBorders>
+            <w:vAlign w:val="center"/>
+          </w:tcPr>
+          <w:p>
+            <w:pPr>
+              <w:jc w:val="center"/>
+            </w:pPr>
+            <w:ins w:id="20081" w:author="王哲" w:date="2026-08-26T12:00:00Z">
+              <w:r>
+                <w:rPr>
+                  <w:rFonts w:ascii="Times New Roman" w:hAnsi="Times New Roman"/>
+                  <w:b/>
+                  <w:sz w:val="18"/>
+                  <w:szCs w:val="18"/>
+                </w:rPr>
+                <w:t xml:space="preserve">6</w:t>
+              </w:r>
+            </w:ins>
+          </w:p>
+        </w:tc>
+        <w:tc>
+          <w:tcPr>
+            <w:tcW w:w="1190" w:type="dxa"/>
+            <w:tcBorders>
+              <w:top w:val="single" w:sz="4" w:space="0" w:color="000000"/>
+            </w:tcBorders>
+            <w:vAlign w:val="center"/>
+          </w:tcPr>
+          <w:p>
+            <w:pPr>
+              <w:jc w:val="center"/>
+            </w:pPr>
+            <w:ins w:id="20082" w:author="王哲" w:date="2026-08-26T12:00:00Z">
+              <w:r>
+                <w:rPr>
+                  <w:rFonts w:ascii="Times New Roman" w:hAnsi="Times New Roman"/>
+                  <w:b/>
+                  <w:sz w:val="18"/>
+                  <w:szCs w:val="18"/>
+                </w:rPr>
+                <w:t xml:space="preserve">1.2 (0.5–2.6)</w:t>
+              </w:r>
+            </w:ins>
+          </w:p>
+        </w:tc>
+        <w:tc>
+          <w:tcPr>
+            <w:tcW w:w="906" w:type="dxa"/>
+            <w:tcBorders>
+              <w:top w:val="single" w:sz="4" w:space="0" w:color="000000"/>
+            </w:tcBorders>
+            <w:vAlign w:val="center"/>
+          </w:tcPr>
+          <w:p>
+            <w:pPr>
+              <w:jc w:val="center"/>
+            </w:pPr>
+            <w:ins w:id="20083" w:author="王哲" w:date="2026-08-26T12:00:00Z">
+              <w:r>
+                <w:rPr>
+                  <w:rFonts w:ascii="Times New Roman" w:hAnsi="Times New Roman"/>
+                  <w:b/>
+                  <w:sz w:val="18"/>
+                  <w:szCs w:val="18"/>
+                </w:rPr>
+                <w:t xml:space="preserve">≈233</w:t>
+              </w:r>
+            </w:ins>
+          </w:p>
+        </w:tc>
+      </w:tr>
+    </w:tbl>
+    <w:p>
+      <w:pPr>
+        <w:spacing w:after="0" w:line="180" w:lineRule="auto"/>
+        <w:rPr>
+          <w:sz w:val="12"/>
+        </w:rPr>
+      </w:pPr>
+    </w:p>
+    <w:p>
+      <w:pPr>
+        <w:ind w:firstLine="480"/>
+      </w:pPr>
+      <w:ins w:id="20085" w:author="王哲" w:date="2026-08-26T12:00:00Z">
+        <w:r>
+          <w:t xml:space="preserve">Table 2 traces the same evidence as a verification cascade. All 23,218 extracted records carried compound identifiers, and 20,265 (87.3%) decoded to RDKit-sanitizable SMILES. Stratified random sampling then drew 507 compound-level picks, of which 505 received a human judgment (2 reviewer omissions); 499 were confirmed correct (98.8%; Wilson 95% CI 97.4–99.5%).</w:t>
+        </w:r>
+      </w:ins>
+    </w:p>
+    <w:p>
+      <w:pPr>
+        <w:keepNext/>
+        <w:pStyle w:val="50"/>
+        <w:jc w:val="both"/>
+      </w:pPr>
+      <w:ins w:id="20086" w:author="王哲" w:date="2026-08-26T12:00:00Z">
+        <w:r>
+          <w:t xml:space="preserve">Table 2. Verification cascade from corpus extraction to human adjudication.</w:t>
+        </w:r>
+      </w:ins>
+    </w:p>
+    <w:tbl>
+      <w:tblPr>
+        <w:tblW w:w="8306" w:type="dxa"/>
+        <w:tblBorders>
+          <w:top w:val="single" w:sz="8" w:space="0" w:color="000000"/>
+          <w:bottom w:val="single" w:sz="8" w:space="0" w:color="000000"/>
+        </w:tblBorders>
+        <w:tblCellMar>
+          <w:left w:w="57" w:type="dxa"/>
+          <w:right w:w="57" w:type="dxa"/>
+        </w:tblCellMar>
+        <w:tblLayout w:type="fixed"/>
+      </w:tblPr>
+      <w:tblGrid>
+        <w:gridCol w:w="3160"/>
+        <w:gridCol w:w="3846"/>
+        <w:gridCol w:w="1300"/>
+      </w:tblGrid>
+      <w:tr>
+        <w:trPr>
+          <w:ins w:id="20090" w:author="王哲" w:date="2026-08-26T12:00:00Z"/>
+          <w:cantSplit/>
+          <w:tblHeader/>
+        </w:trPr>
+        <w:tc>
+          <w:tcPr>
+            <w:tcW w:w="3160" w:type="dxa"/>
+            <w:tcBorders>
+              <w:bottom w:val="single" w:sz="4" w:space="0" w:color="000000"/>
+            </w:tcBorders>
+            <w:vAlign w:val="center"/>
+          </w:tcPr>
+          <w:p>
+            <w:pPr>
+              <w:keepNext/>
+              <w:jc w:val="left"/>
+            </w:pPr>
+            <w:ins w:id="20087" w:author="王哲" w:date="2026-08-26T12:00:00Z">
+              <w:r>
+                <w:rPr>
+                  <w:rFonts w:ascii="Times New Roman" w:hAnsi="Times New Roman"/>
+                  <w:b/>
+                  <w:sz w:val="18"/>
+                  <w:szCs w:val="18"/>
+                </w:rPr>
+                <w:t xml:space="preserve">Stage</w:t>
+              </w:r>
+            </w:ins>
+          </w:p>
+        </w:tc>
+        <w:tc>
+          <w:tcPr>
+            <w:tcW w:w="3846" w:type="dxa"/>
+            <w:tcBorders>
+              <w:bottom w:val="single" w:sz="4" w:space="0" w:color="000000"/>
+            </w:tcBorders>
+            <w:vAlign w:val="center"/>
+          </w:tcPr>
+          <w:p>
+            <w:pPr>
+              <w:keepNext/>
+              <w:jc w:val="left"/>
+            </w:pPr>
+            <w:ins w:id="20088" w:author="王哲" w:date="2026-08-26T12:00:00Z">
+              <w:r>
+                <w:rPr>
+                  <w:rFonts w:ascii="Times New Roman" w:hAnsi="Times New Roman"/>
+                  <w:b/>
+                  <w:sz w:val="18"/>
+                  <w:szCs w:val="18"/>
+                </w:rPr>
+                <w:t xml:space="preserve">Criterion</w:t>
+              </w:r>
+            </w:ins>
+          </w:p>
+        </w:tc>
+        <w:tc>
+          <w:tcPr>
+            <w:tcW w:w="1300" w:type="dxa"/>
+            <w:tcBorders>
+              <w:bottom w:val="single" w:sz="4" w:space="0" w:color="000000"/>
+            </w:tcBorders>
+            <w:vAlign w:val="center"/>
+          </w:tcPr>
+          <w:p>
+            <w:pPr>
+              <w:keepNext/>
+              <w:jc w:val="center"/>
+            </w:pPr>
+            <w:ins w:id="20089" w:author="王哲" w:date="2026-08-26T12:00:00Z">
+              <w:r>
+                <w:rPr>
+                  <w:rFonts w:ascii="Times New Roman" w:hAnsi="Times New Roman"/>
+                  <w:b/>
+                  <w:sz w:val="18"/>
+                  <w:szCs w:val="18"/>
+                </w:rPr>
+                <w:t xml:space="preserve">Records</w:t>
+              </w:r>
+            </w:ins>
+          </w:p>
+        </w:tc>
+      </w:tr>
+      <w:tr>
+        <w:trPr>
+          <w:ins w:id="20094" w:author="王哲" w:date="2026-08-26T12:00:00Z"/>
+          <w:cantSplit/>
+        </w:trPr>
+        <w:tc>
+          <w:tcPr>
+            <w:tcW w:w="3160" w:type="dxa"/>
+            <w:vAlign w:val="center"/>
+          </w:tcPr>
+          <w:p>
+            <w:pPr>
+              <w:keepNext/>
+              <w:jc w:val="left"/>
+            </w:pPr>
+            <w:ins w:id="20091" w:author="王哲" w:date="2026-08-26T12:00:00Z">
+              <w:r>
+                <w:rPr>
+                  <w:rFonts w:ascii="Times New Roman" w:hAnsi="Times New Roman"/>
+                  <w:sz w:val="18"/>
+                  <w:szCs w:val="18"/>
+                </w:rPr>
+                <w:t xml:space="preserve">Structure records extracted</w:t>
+              </w:r>
+            </w:ins>
+          </w:p>
+        </w:tc>
+        <w:tc>
+          <w:tcPr>
+            <w:tcW w:w="3846" w:type="dxa"/>
+            <w:vAlign w:val="center"/>
+          </w:tcPr>
+          <w:p>
+            <w:pPr>
+              <w:keepNext/>
+              <w:jc w:val="left"/>
+            </w:pPr>
+            <w:ins w:id="20092" w:author="王哲" w:date="2026-08-26T12:00:00Z">
+              <w:r>
+                <w:rPr>
+                  <w:rFonts w:ascii="Times New Roman" w:hAnsi="Times New Roman"/>
+                  <w:sz w:val="18"/>
+                  <w:szCs w:val="18"/>
+                </w:rPr>
+                <w:t xml:space="preserve">complete 296-patent corpus</w:t>
+              </w:r>
+            </w:ins>
+          </w:p>
+        </w:tc>
+        <w:tc>
+          <w:tcPr>
+            <w:tcW w:w="1300" w:type="dxa"/>
+            <w:vAlign w:val="center"/>
+          </w:tcPr>
+          <w:p>
+            <w:pPr>
+              <w:keepNext/>
+              <w:jc w:val="center"/>
+            </w:pPr>
+            <w:ins w:id="20093" w:author="王哲" w:date="2026-08-26T12:00:00Z">
+              <w:r>
+                <w:rPr>
+                  <w:rFonts w:ascii="Times New Roman" w:hAnsi="Times New Roman"/>
+                  <w:sz w:val="18"/>
+                  <w:szCs w:val="18"/>
+                </w:rPr>
+                <w:t xml:space="preserve">23,218</w:t>
+              </w:r>
+            </w:ins>
+          </w:p>
+        </w:tc>
+      </w:tr>
+      <w:tr>
+        <w:trPr>
+          <w:ins w:id="20098" w:author="王哲" w:date="2026-08-26T12:00:00Z"/>
+          <w:cantSplit/>
+        </w:trPr>
+        <w:tc>
+          <w:tcPr>
+            <w:tcW w:w="3160" w:type="dxa"/>
+            <w:vAlign w:val="center"/>
+          </w:tcPr>
+          <w:p>
+            <w:pPr>
+              <w:keepNext/>
+              <w:jc w:val="left"/>
+            </w:pPr>
+            <w:ins w:id="20095" w:author="王哲" w:date="2026-08-26T12:00:00Z">
+              <w:r>
+                <w:rPr>
+                  <w:rFonts w:ascii="Times New Roman" w:hAnsi="Times New Roman"/>
+                  <w:sz w:val="18"/>
+                  <w:szCs w:val="18"/>
+                </w:rPr>
+                <w:t xml:space="preserve">Compound identifiers associated</w:t>
+              </w:r>
+            </w:ins>
+          </w:p>
+        </w:tc>
+        <w:tc>
+          <w:tcPr>
+            <w:tcW w:w="3846" w:type="dxa"/>
+            <w:vAlign w:val="center"/>
+          </w:tcPr>
+          <w:p>
+            <w:pPr>
+              <w:keepNext/>
+              <w:jc w:val="left"/>
+            </w:pPr>
+            <w:ins w:id="20096" w:author="王哲" w:date="2026-08-26T12:00:00Z">
+              <w:r>
+                <w:rPr>
+                  <w:rFonts w:ascii="Times New Roman" w:hAnsi="Times New Roman"/>
+                  <w:sz w:val="18"/>
+                  <w:szCs w:val="18"/>
+                </w:rPr>
+                <w:t xml:space="preserve">vision–language model assignment</w:t>
+              </w:r>
+            </w:ins>
+          </w:p>
+        </w:tc>
+        <w:tc>
+          <w:tcPr>
+            <w:tcW w:w="1300" w:type="dxa"/>
+            <w:vAlign w:val="center"/>
+          </w:tcPr>
+          <w:p>
+            <w:pPr>
+              <w:keepNext/>
+              <w:jc w:val="center"/>
+            </w:pPr>
+            <w:ins w:id="20097" w:author="王哲" w:date="2026-08-26T12:00:00Z">
+              <w:r>
+                <w:rPr>
+                  <w:rFonts w:ascii="Times New Roman" w:hAnsi="Times New Roman"/>
+                  <w:sz w:val="18"/>
+                  <w:szCs w:val="18"/>
+                </w:rPr>
+                <w:t xml:space="preserve">23,218 (100%)</w:t>
+              </w:r>
+            </w:ins>
+          </w:p>
+        </w:tc>
+      </w:tr>
+      <w:tr>
+        <w:trPr>
+          <w:ins w:id="20102" w:author="王哲" w:date="2026-08-26T12:00:00Z"/>
+          <w:cantSplit/>
+        </w:trPr>
+        <w:tc>
+          <w:tcPr>
+            <w:tcW w:w="3160" w:type="dxa"/>
+            <w:vAlign w:val="center"/>
+          </w:tcPr>
+          <w:p>
+            <w:pPr>
+              <w:keepNext/>
+              <w:jc w:val="left"/>
+            </w:pPr>
+            <w:ins w:id="20099" w:author="王哲" w:date="2026-08-26T12:00:00Z">
+              <w:r>
+                <w:rPr>
+                  <w:rFonts w:ascii="Times New Roman" w:hAnsi="Times New Roman"/>
+                  <w:sz w:val="18"/>
+                  <w:szCs w:val="18"/>
+                </w:rPr>
+                <w:t xml:space="preserve">Valid SMILES decodes</w:t>
+              </w:r>
+            </w:ins>
+          </w:p>
+        </w:tc>
+        <w:tc>
+          <w:tcPr>
+            <w:tcW w:w="3846" w:type="dxa"/>
+            <w:vAlign w:val="center"/>
+          </w:tcPr>
+          <w:p>
+            <w:pPr>
+              <w:keepNext/>
+              <w:jc w:val="left"/>
+            </w:pPr>
+            <w:ins w:id="20100" w:author="王哲" w:date="2026-08-26T12:00:00Z">
+              <w:r>
+                <w:rPr>
+                  <w:rFonts w:ascii="Times New Roman" w:hAnsi="Times New Roman"/>
+                  <w:sz w:val="18"/>
+                  <w:szCs w:val="18"/>
+                </w:rPr>
+                <w:t xml:space="preserve">RDKit-sanitizable output</w:t>
+              </w:r>
+            </w:ins>
+          </w:p>
+        </w:tc>
+        <w:tc>
+          <w:tcPr>
+            <w:tcW w:w="1300" w:type="dxa"/>
+            <w:vAlign w:val="center"/>
+          </w:tcPr>
+          <w:p>
+            <w:pPr>
+              <w:keepNext/>
+              <w:jc w:val="center"/>
+            </w:pPr>
+            <w:ins w:id="20101" w:author="王哲" w:date="2026-08-26T12:00:00Z">
+              <w:r>
+                <w:rPr>
+                  <w:rFonts w:ascii="Times New Roman" w:hAnsi="Times New Roman"/>
+                  <w:sz w:val="18"/>
+                  <w:szCs w:val="18"/>
+                </w:rPr>
+                <w:t xml:space="preserve">20,265 (87.3%)</w:t>
+              </w:r>
+            </w:ins>
+          </w:p>
+        </w:tc>
+      </w:tr>
+      <w:tr>
+        <w:trPr>
+          <w:ins w:id="20106" w:author="王哲" w:date="2026-08-26T12:00:00Z"/>
+          <w:cantSplit/>
+        </w:trPr>
+        <w:tc>
+          <w:tcPr>
+            <w:tcW w:w="3160" w:type="dxa"/>
+            <w:vAlign w:val="center"/>
+          </w:tcPr>
+          <w:p>
+            <w:pPr>
+              <w:keepNext/>
+              <w:jc w:val="left"/>
+            </w:pPr>
+            <w:ins w:id="20103" w:author="王哲" w:date="2026-08-26T12:00:00Z">
+              <w:r>
+                <w:rPr>
+                  <w:rFonts w:ascii="Times New Roman" w:hAnsi="Times New Roman"/>
+                  <w:sz w:val="18"/>
+                  <w:szCs w:val="18"/>
+                </w:rPr>
+                <w:t xml:space="preserve">Picks sampled</w:t>
+              </w:r>
+            </w:ins>
+          </w:p>
+        </w:tc>
+        <w:tc>
+          <w:tcPr>
+            <w:tcW w:w="3846" w:type="dxa"/>
+            <w:vAlign w:val="center"/>
+          </w:tcPr>
+          <w:p>
+            <w:pPr>
+              <w:keepNext/>
+              <w:jc w:val="left"/>
+            </w:pPr>
+            <w:ins w:id="20104" w:author="王哲" w:date="2026-08-26T12:00:00Z">
+              <w:r>
+                <w:rPr>
+                  <w:rFonts w:ascii="Times New Roman" w:hAnsi="Times New Roman"/>
+                  <w:sz w:val="18"/>
+                  <w:szCs w:val="18"/>
+                </w:rPr>
+                <w:t xml:space="preserve">stratified random draw across validity tiers</w:t>
+              </w:r>
+            </w:ins>
+          </w:p>
+        </w:tc>
+        <w:tc>
+          <w:tcPr>
+            <w:tcW w:w="1300" w:type="dxa"/>
+            <w:vAlign w:val="center"/>
+          </w:tcPr>
+          <w:p>
+            <w:pPr>
+              <w:keepNext/>
+              <w:jc w:val="center"/>
+            </w:pPr>
+            <w:ins w:id="20105" w:author="王哲" w:date="2026-08-26T12:00:00Z">
+              <w:r>
+                <w:rPr>
+                  <w:rFonts w:ascii="Times New Roman" w:hAnsi="Times New Roman"/>
+                  <w:sz w:val="18"/>
+                  <w:szCs w:val="18"/>
+                </w:rPr>
+                <w:t xml:space="preserve">507</w:t>
+              </w:r>
+            </w:ins>
+          </w:p>
+        </w:tc>
+      </w:tr>
+      <w:tr>
+        <w:trPr>
+          <w:ins w:id="20110" w:author="王哲" w:date="2026-08-26T12:00:00Z"/>
+          <w:cantSplit/>
+        </w:trPr>
+        <w:tc>
+          <w:tcPr>
+            <w:tcW w:w="3160" w:type="dxa"/>
+            <w:vAlign w:val="center"/>
+          </w:tcPr>
+          <w:p>
+            <w:pPr>
+              <w:keepNext/>
+              <w:jc w:val="left"/>
+            </w:pPr>
+            <w:ins w:id="20107" w:author="王哲" w:date="2026-08-26T12:00:00Z">
+              <w:r>
+                <w:rPr>
+                  <w:rFonts w:ascii="Times New Roman" w:hAnsi="Times New Roman"/>
+                  <w:sz w:val="18"/>
+                  <w:szCs w:val="18"/>
+                </w:rPr>
+                <w:t xml:space="preserve">Picks adjudicated</w:t>
+              </w:r>
+            </w:ins>
+          </w:p>
+        </w:tc>
+        <w:tc>
+          <w:tcPr>
+            <w:tcW w:w="3846" w:type="dxa"/>
+            <w:vAlign w:val="center"/>
+          </w:tcPr>
+          <w:p>
+            <w:pPr>
+              <w:keepNext/>
+              <w:jc w:val="left"/>
+            </w:pPr>
+            <w:ins w:id="20108" w:author="王哲" w:date="2026-08-26T12:00:00Z">
+              <w:r>
+                <w:rPr>
+                  <w:rFonts w:ascii="Times New Roman" w:hAnsi="Times New Roman"/>
+                  <w:sz w:val="18"/>
+                  <w:szCs w:val="18"/>
+                </w:rPr>
+                <w:t xml:space="preserve">human judgment returned (2 reviewer omissions)</w:t>
+              </w:r>
+            </w:ins>
+          </w:p>
+        </w:tc>
+        <w:tc>
+          <w:tcPr>
+            <w:tcW w:w="1300" w:type="dxa"/>
+            <w:vAlign w:val="center"/>
+          </w:tcPr>
+          <w:p>
+            <w:pPr>
+              <w:keepNext/>
+              <w:jc w:val="center"/>
+            </w:pPr>
+            <w:ins w:id="20109" w:author="王哲" w:date="2026-08-26T12:00:00Z">
+              <w:r>
+                <w:rPr>
+                  <w:rFonts w:ascii="Times New Roman" w:hAnsi="Times New Roman"/>
+                  <w:sz w:val="18"/>
+                  <w:szCs w:val="18"/>
+                </w:rPr>
+                <w:t xml:space="preserve">505</w:t>
+              </w:r>
+            </w:ins>
+          </w:p>
+        </w:tc>
+      </w:tr>
+      <w:tr>
+        <w:trPr>
+          <w:ins w:id="20114" w:author="王哲" w:date="2026-08-26T12:00:00Z"/>
+          <w:cantSplit/>
+        </w:trPr>
+        <w:tc>
+          <w:tcPr>
+            <w:tcW w:w="3160" w:type="dxa"/>
+            <w:vAlign w:val="center"/>
+          </w:tcPr>
+          <w:p>
+            <w:pPr>
+              <w:jc w:val="left"/>
+            </w:pPr>
+            <w:ins w:id="20111" w:author="王哲" w:date="2026-08-26T12:00:00Z">
+              <w:r>
+                <w:rPr>
+                  <w:rFonts w:ascii="Times New Roman" w:hAnsi="Times New Roman"/>
+                  <w:sz w:val="18"/>
+                  <w:szCs w:val="18"/>
+                </w:rPr>
+                <w:t xml:space="preserve">Picks confirmed correct</w:t>
+              </w:r>
+            </w:ins>
+          </w:p>
+        </w:tc>
+        <w:tc>
+          <w:tcPr>
+            <w:tcW w:w="3846" w:type="dxa"/>
+            <w:vAlign w:val="center"/>
+          </w:tcPr>
+          <w:p>
+            <w:pPr>
+              <w:jc w:val="left"/>
+            </w:pPr>
+            <w:ins w:id="20112" w:author="王哲" w:date="2026-08-26T12:00:00Z">
+              <w:r>
+                <w:rPr>
+                  <w:rFonts w:ascii="Times New Roman" w:hAnsi="Times New Roman"/>
+                  <w:sz w:val="18"/>
+                  <w:szCs w:val="18"/>
+                </w:rPr>
+                <w:t xml:space="preserve">decoded structure matches patent segment</w:t>
+              </w:r>
+            </w:ins>
+          </w:p>
+        </w:tc>
+        <w:tc>
+          <w:tcPr>
+            <w:tcW w:w="1300" w:type="dxa"/>
+            <w:vAlign w:val="center"/>
+          </w:tcPr>
+          <w:p>
+            <w:pPr>
+              <w:jc w:val="center"/>
+            </w:pPr>
+            <w:ins w:id="20113" w:author="王哲" w:date="2026-08-26T12:00:00Z">
+              <w:r>
+                <w:rPr>
+                  <w:rFonts w:ascii="Times New Roman" w:hAnsi="Times New Roman"/>
+                  <w:sz w:val="18"/>
+                  <w:szCs w:val="18"/>
+                </w:rPr>
+                <w:t xml:space="preserve">499 (98.8%)</w:t>
+              </w:r>
+            </w:ins>
+          </w:p>
+        </w:tc>
+      </w:tr>
+    </w:tbl>
+    <w:p>
+      <w:pPr>
+        <w:spacing w:after="0" w:line="180" w:lineRule="auto"/>
+        <w:rPr>
+          <w:sz w:val="12"/>
+        </w:rPr>
+      </w:pPr>
+    </w:p>
+    <w:p>
+      <w:pPr>
+        <w:ind w:firstLine="480"/>
+      </w:pPr>
+      <w:ins w:id="20115" w:author="王哲" w:date="2026-08-26T12:00:00Z">
+        <w:r>
+          <w:t xml:space="preserve">Figure 8 shows the distribution underlying this stratification: per-patent valid-SMILES rates across the 293 patents with at least one structure record are strongly left-skewed, with a median of 91.5%, 57.7% of patents at or above 90% validity, and a thin sub-50% tail of 17 patents that accounts for most confirmed errors.</w:t>
+        </w:r>
+      </w:ins>
+    </w:p>
+    <w:p>
+      <w:pPr>
+        <w:keepNext/>
+        <w:jc w:val="center"/>
+      </w:pPr>
+      <w:ins w:id="20116" w:author="王哲" w:date="2026-08-26T12:00:00Z">
+        <w:r>
+          <w:drawing>
+            <wp:inline xmlns:a="http://schemas.openxmlformats.org/drawingml/2006/main" xmlns:pic="http://schemas.openxmlformats.org/drawingml/2006/picture">
+              <wp:extent cx="3600000" cy="2686567"/>
+              <wp:docPr id="15" name="Picture 15"/>
+              <wp:cNvGraphicFramePr>
+                <a:graphicFrameLocks noChangeAspect="1"/>
+              </wp:cNvGraphicFramePr>
+              <a:graphic>
+                <a:graphicData uri="http://schemas.openxmlformats.org/drawingml/2006/picture">
+                  <pic:pic>
+                    <pic:nvPicPr>
+                      <pic:cNvPr id="0" name="fig_validity_distribution.png"/>
+                      <pic:cNvPicPr/>
+                    </pic:nvPicPr>
+                    <pic:blipFill>
+                      <a:blip r:embed="rId23"/>
+                      <a:stretch>
+                        <a:fillRect/>
+                      </a:stretch>
+                    </pic:blipFill>
+                    <pic:spPr>
+                      <a:xfrm>
+                        <a:off x="0" y="0"/>
+                        <a:ext cx="3600000" cy="2686567"/>
+                      </a:xfrm>
+                      <a:prstGeom prst="rect"/>
+                    </pic:spPr>
+                  </pic:pic>
+                </a:graphicData>
+              </a:graphic>
+            </wp:inline>
+          </w:drawing>
+        </w:r>
+      </w:ins>
+    </w:p>
+    <w:p>
+      <w:pPr>
+        <w:pStyle w:val="50"/>
+        <w:jc w:val="both"/>
+      </w:pPr>
+      <w:ins w:id="20117" w:author="王哲" w:date="2026-08-26T12:00:00Z">
+        <w:r>
+          <w:t xml:space="preserve">Figure 8. Distribution of per-patent valid-SMILES rates across the 293 patents with at least one extracted structure record (5% bins; dashed line, median 91.5%). The sub-50% tail of 17 patents defines the lowest validity tier, in which human-confirmed errors concentrate (Table 1).</w:t>
         </w:r>
       </w:ins>
     </w:p>
@@ -3490,6 +5673,7 @@
     </w:p>
     <w:p>
       <w:pPr>
+        <w:keepNext/>
         <w:ind w:firstLine="0" w:firstLineChars="0"/>
         <w:rPr>
           <w:rFonts w:eastAsia="宋体" w:cs="Times New Roman"/>
@@ -3903,6 +6087,16 @@
             <w:szCs w:val="24"/>
           </w:rPr>
           <w:t xml:space="preserve">Patent claims frequently depict a scaffold together with variable substituents (R-groups) and detached fragments connected by wavy bonds or asterisked attachment points. BioChemInsight assembles such depictions into complete molecules using the explicit dummy attachment atoms emitted by the MoE decoder: assembly is authorized only when the decoded graph contains a real attachment atom, after which the scaffold and fragment are reconnected at the corresponding anchor positions using RDKit and re-laid out while preserving the original scaffold pose. Three independent evidence streams guide and validate each assembly: textual variable assignment parsed from the OCR text, visual attachment cues (visible asterisks, wavy bonds, and R-group labels) identified by the vision-language model, and the decoded MolNexTR graph, of which only the graph layer authorizes assembly. Finally, every assembled product is rendered alongside its source scaffold and fragment crops in a three-panel image and re-examined by the vision-language model; any visible contradiction in the scaffold region, fragment region, or attachment position blocks the assembly, so that only verified structures reach the final output.</w:t>
+        </w:r>
+      </w:ins>
+    </w:p>
+    <w:p>
+      <w:pPr>
+        <w:ind w:firstLine="480"/>
+      </w:pPr>
+      <w:ins w:id="20008" w:author="王哲" w:date="2026-08-26T12:00:00Z">
+        <w:r>
+          <w:t xml:space="preserve">Journal literature presents the complementary pattern: structures and measured activities appear in a single table, individual compounds are identified only by a series identifier (for example 6a–r), and the scaffold is depicted once with variable substituents. BioChemInsight expands such series identifiers to member granularity and resolves each member structure deterministically: PubChem name lookup is attempted first and OPSIN systematic-name parsing second, while the large language model may translate a compound name between languages but is never permitted to generate a structure; members that cannot be resolved are abandoned rather than guessed. A per-series consistency check then verifies that every synthesized member embeds the common core shared by the series, and members violating it are quarantined from the output.</w:t>
         </w:r>
       </w:ins>
     </w:p>

</xml_diff>